<commit_message>
Añade script X y elimina resultados antiguos
</commit_message>
<xml_diff>
--- a/Readme.docx
+++ b/Readme.docx
@@ -26,16 +26,7 @@
           <w:bCs/>
           <w:u w:val="single"/>
         </w:rPr>
-        <w:t>Code for</w:t>
-      </w:r>
-      <w:r>
-        <w:rPr>
-          <w:rFonts w:ascii="Times New Roman" w:hAnsi="Times New Roman" w:cs="Times New Roman"/>
-          <w:b/>
-          <w:bCs/>
-          <w:u w:val="single"/>
-        </w:rPr>
-        <w:t xml:space="preserve"> </w:t>
+        <w:t xml:space="preserve">Code for </w:t>
       </w:r>
       <w:r>
         <w:rPr>
@@ -70,31 +61,7 @@
         <w:rPr>
           <w:rFonts w:ascii="Times New Roman" w:hAnsi="Times New Roman" w:cs="Times New Roman"/>
         </w:rPr>
-        <w:t xml:space="preserve">These folders and files contain the code describing all of the analyses done for the manuscript </w:t>
-      </w:r>
-      <w:r>
-        <w:rPr>
-          <w:rFonts w:ascii="Times New Roman" w:hAnsi="Times New Roman" w:cs="Times New Roman"/>
-        </w:rPr>
-        <w:t>“Neuronal coupling of CG and non-CG DNA methylation is an evolutionarily conserved mechanism linking aging, development, and synaptic function”</w:t>
-      </w:r>
-      <w:r>
-        <w:rPr>
-          <w:rFonts w:ascii="Times New Roman" w:hAnsi="Times New Roman" w:cs="Times New Roman"/>
-        </w:rPr>
-        <w:t>. In this document, a detailed description of the organization of the different pipelines and scripts used is provided. The following folders are contained within the file</w:t>
-      </w:r>
-      <w:r>
-        <w:rPr>
-          <w:rFonts w:ascii="Times New Roman" w:hAnsi="Times New Roman" w:cs="Times New Roman"/>
-        </w:rPr>
-        <w:t xml:space="preserve"> Code</w:t>
-      </w:r>
-      <w:r>
-        <w:rPr>
-          <w:rFonts w:ascii="Times New Roman" w:hAnsi="Times New Roman" w:cs="Times New Roman"/>
-        </w:rPr>
-        <w:t>:</w:t>
+        <w:t>These folders and files contain the code describing all of the analyses done for the manuscript “Neuronal coupling of CG and non-CG DNA methylation is an evolutionarily conserved mechanism linking aging, development, and synaptic function”. In this document, a detailed description of the organization of the different pipelines and scripts used is provided. The following folders are contained within the file Code:</w:t>
       </w:r>
     </w:p>
     <w:p>
@@ -520,21 +487,7 @@
           <w:b/>
         </w:rPr>
         <w:lastRenderedPageBreak/>
-        <w:t>/00_</w:t>
-      </w:r>
-      <w:r>
-        <w:rPr>
-          <w:rFonts w:ascii="Times New Roman" w:hAnsi="Times New Roman" w:cs="Times New Roman"/>
-          <w:b/>
-        </w:rPr>
-        <w:t>S</w:t>
-      </w:r>
-      <w:r>
-        <w:rPr>
-          <w:rFonts w:ascii="Times New Roman" w:hAnsi="Times New Roman" w:cs="Times New Roman"/>
-          <w:b/>
-        </w:rPr>
-        <w:t>oftware:</w:t>
+        <w:t>/00_Software:</w:t>
       </w:r>
       <w:r>
         <w:rPr>
@@ -578,14 +531,7 @@
           <w:rFonts w:ascii="Times New Roman" w:hAnsi="Times New Roman" w:cs="Times New Roman"/>
           <w:b/>
         </w:rPr>
-        <w:t>00_conda_methylation.yml</w:t>
-      </w:r>
-      <w:r>
-        <w:rPr>
-          <w:rFonts w:ascii="Times New Roman" w:hAnsi="Times New Roman" w:cs="Times New Roman"/>
-          <w:b/>
-        </w:rPr>
-        <w:t>:</w:t>
+        <w:t>00_conda_methylation.yml:</w:t>
       </w:r>
       <w:r>
         <w:rPr>
@@ -621,14 +567,7 @@
           <w:rFonts w:ascii="Times New Roman" w:hAnsi="Times New Roman" w:cs="Times New Roman"/>
           <w:b/>
         </w:rPr>
-        <w:t>00_conda_trim.yml</w:t>
-      </w:r>
-      <w:r>
-        <w:rPr>
-          <w:rFonts w:ascii="Times New Roman" w:hAnsi="Times New Roman" w:cs="Times New Roman"/>
-          <w:b/>
-        </w:rPr>
-        <w:t>:</w:t>
+        <w:t>00_conda_trim.yml:</w:t>
       </w:r>
       <w:r>
         <w:rPr>
@@ -684,14 +623,7 @@
           <w:rFonts w:ascii="Times New Roman" w:hAnsi="Times New Roman" w:cs="Times New Roman"/>
           <w:b/>
         </w:rPr>
-        <w:t>00_conda_epic.yml</w:t>
-      </w:r>
-      <w:r>
-        <w:rPr>
-          <w:rFonts w:ascii="Times New Roman" w:hAnsi="Times New Roman" w:cs="Times New Roman"/>
-          <w:b/>
-        </w:rPr>
-        <w:t>:</w:t>
+        <w:t>00_conda_epic.yml:</w:t>
       </w:r>
       <w:r>
         <w:rPr>
@@ -718,28 +650,661 @@
         <w:t>epic2</w:t>
       </w:r>
       <w:r>
-        <w:t xml:space="preserve"> pipeline</w:t>
-      </w:r>
-      <w:r>
+        <w:t xml:space="preserve"> pipeline.</w:t>
+      </w:r>
+    </w:p>
+    <w:p>
+      <w:pPr>
+        <w:ind w:left="709"/>
+        <w:jc w:val="both"/>
+        <w:rPr>
+          <w:rFonts w:ascii="Times New Roman" w:hAnsi="Times New Roman" w:cs="Times New Roman"/>
+          <w:lang w:val="en-GB"/>
+        </w:rPr>
+      </w:pPr>
+      <w:r>
+        <w:rPr>
+          <w:rFonts w:ascii="Times New Roman" w:hAnsi="Times New Roman" w:cs="Times New Roman"/>
+          <w:b/>
+          <w:lang w:val="en-GB"/>
+        </w:rPr>
+        <w:t>01_R_packages.txt:</w:t>
+      </w:r>
+      <w:r>
+        <w:rPr>
+          <w:rFonts w:ascii="Times New Roman" w:hAnsi="Times New Roman" w:cs="Times New Roman"/>
+          <w:lang w:val="en-GB"/>
+        </w:rPr>
+        <w:t xml:space="preserve"> A comprehensive list of R/Bioconductor packages used for downstream statistical analysis</w:t>
+      </w:r>
+      <w:r>
+        <w:rPr>
+          <w:rFonts w:ascii="Times New Roman" w:hAnsi="Times New Roman" w:cs="Times New Roman"/>
+          <w:lang w:val="en-GB"/>
+        </w:rPr>
         <w:t>.</w:t>
       </w:r>
     </w:p>
     <w:p>
       <w:pPr>
-        <w:ind w:left="709"/>
-        <w:jc w:val="both"/>
-        <w:rPr>
-          <w:rFonts w:ascii="Times New Roman" w:hAnsi="Times New Roman" w:cs="Times New Roman"/>
-          <w:lang w:val="en-GB"/>
-        </w:rPr>
-      </w:pPr>
-      <w:r>
-        <w:rPr>
-          <w:rFonts w:ascii="Times New Roman" w:hAnsi="Times New Roman" w:cs="Times New Roman"/>
-          <w:b/>
-          <w:lang w:val="en-GB"/>
-        </w:rPr>
-        <w:t>01_R_packages.txt</w:t>
+        <w:jc w:val="both"/>
+        <w:rPr>
+          <w:rFonts w:ascii="Times New Roman" w:hAnsi="Times New Roman" w:cs="Times New Roman"/>
+          <w:lang w:val="en-GB"/>
+        </w:rPr>
+      </w:pPr>
+    </w:p>
+    <w:p>
+      <w:pPr>
+        <w:jc w:val="both"/>
+        <w:rPr>
+          <w:rFonts w:ascii="Times New Roman" w:hAnsi="Times New Roman" w:cs="Times New Roman"/>
+          <w:lang w:val="en-GB"/>
+        </w:rPr>
+      </w:pPr>
+      <w:r>
+        <w:rPr>
+          <w:rFonts w:ascii="Times New Roman" w:hAnsi="Times New Roman" w:cs="Times New Roman"/>
+          <w:b/>
+          <w:lang w:val="en-GB"/>
+        </w:rPr>
+        <w:t>/01_EMseq_preprocessing_alignment:</w:t>
+      </w:r>
+      <w:r>
+        <w:rPr>
+          <w:rFonts w:ascii="Times New Roman" w:hAnsi="Times New Roman" w:cs="Times New Roman"/>
+          <w:lang w:val="en-GB"/>
+        </w:rPr>
+        <w:t xml:space="preserve"> </w:t>
+      </w:r>
+      <w:r>
+        <w:rPr>
+          <w:rFonts w:ascii="Times New Roman" w:hAnsi="Times New Roman" w:cs="Times New Roman"/>
+          <w:lang w:val="en-GB"/>
+        </w:rPr>
+        <w:t>contains the complete suite of scripts required to execute the raw data processing workflow and describes the systematic procedures for quality control (QC), adapter trimming to ensure read integrity, and sequence alignment to reference genomes for both paired-end and single-end libraries, as well as the final extraction of single-base resolution methylation levels.</w:t>
+      </w:r>
+    </w:p>
+    <w:p>
+      <w:pPr>
+        <w:jc w:val="both"/>
+        <w:rPr>
+          <w:rFonts w:ascii="Times New Roman" w:hAnsi="Times New Roman" w:cs="Times New Roman"/>
+          <w:lang w:val="en-GB"/>
+        </w:rPr>
+      </w:pPr>
+      <w:r>
+        <w:rPr>
+          <w:rFonts w:ascii="Times New Roman" w:hAnsi="Times New Roman" w:cs="Times New Roman"/>
+          <w:lang w:val="en-GB"/>
+        </w:rPr>
+        <w:tab/>
+      </w:r>
+    </w:p>
+    <w:p>
+      <w:pPr>
+        <w:jc w:val="both"/>
+        <w:rPr>
+          <w:rFonts w:ascii="Times New Roman" w:hAnsi="Times New Roman" w:cs="Times New Roman"/>
+          <w:b/>
+          <w:lang w:val="en-GB"/>
+        </w:rPr>
+      </w:pPr>
+      <w:r>
+        <w:rPr>
+          <w:rFonts w:ascii="Times New Roman" w:hAnsi="Times New Roman" w:cs="Times New Roman"/>
+          <w:lang w:val="en-GB"/>
+        </w:rPr>
+        <w:tab/>
+      </w:r>
+      <w:r>
+        <w:rPr>
+          <w:rFonts w:ascii="Times New Roman" w:hAnsi="Times New Roman" w:cs="Times New Roman"/>
+          <w:b/>
+          <w:lang w:val="en-GB"/>
+        </w:rPr>
+        <w:t>01_Paired_end_files/</w:t>
+      </w:r>
+    </w:p>
+    <w:p>
+      <w:pPr>
+        <w:ind w:left="1440"/>
+        <w:jc w:val="both"/>
+        <w:rPr>
+          <w:rFonts w:ascii="Times New Roman" w:hAnsi="Times New Roman" w:cs="Times New Roman"/>
+          <w:lang w:val="en-GB"/>
+        </w:rPr>
+      </w:pPr>
+      <w:r>
+        <w:rPr>
+          <w:rFonts w:ascii="Times New Roman" w:hAnsi="Times New Roman" w:cs="Times New Roman"/>
+          <w:b/>
+          <w:lang w:val="en-GB"/>
+        </w:rPr>
+        <w:t>EMseq_1_FASTQ.sh:</w:t>
+      </w:r>
+      <w:r>
+        <w:rPr>
+          <w:rFonts w:ascii="Times New Roman" w:hAnsi="Times New Roman" w:cs="Times New Roman"/>
+          <w:lang w:val="en-GB"/>
+        </w:rPr>
+        <w:t xml:space="preserve"> initial read quality control using FASTQ</w:t>
+      </w:r>
+      <w:r>
+        <w:rPr>
+          <w:rFonts w:ascii="Times New Roman" w:hAnsi="Times New Roman" w:cs="Times New Roman"/>
+          <w:lang w:val="en-GB"/>
+        </w:rPr>
+        <w:t>C.</w:t>
+      </w:r>
+    </w:p>
+    <w:p>
+      <w:pPr>
+        <w:ind w:left="1440"/>
+        <w:jc w:val="both"/>
+        <w:rPr>
+          <w:rFonts w:ascii="Times New Roman" w:hAnsi="Times New Roman" w:cs="Times New Roman"/>
+          <w:lang w:val="en-GB"/>
+        </w:rPr>
+      </w:pPr>
+      <w:r>
+        <w:rPr>
+          <w:rFonts w:ascii="Times New Roman" w:hAnsi="Times New Roman" w:cs="Times New Roman"/>
+          <w:b/>
+          <w:lang w:val="en-GB"/>
+        </w:rPr>
+        <w:t>EMseq_2_Trim.sh:</w:t>
+      </w:r>
+      <w:r>
+        <w:rPr>
+          <w:rFonts w:ascii="Times New Roman" w:hAnsi="Times New Roman" w:cs="Times New Roman"/>
+          <w:lang w:val="en-GB"/>
+        </w:rPr>
+        <w:t xml:space="preserve"> adapter trimming via Trim Galore to ensure high-quality input.</w:t>
+      </w:r>
+    </w:p>
+    <w:p>
+      <w:pPr>
+        <w:ind w:left="1440"/>
+        <w:jc w:val="both"/>
+        <w:rPr>
+          <w:rFonts w:ascii="Times New Roman" w:hAnsi="Times New Roman" w:cs="Times New Roman"/>
+          <w:lang w:val="en-GB"/>
+        </w:rPr>
+      </w:pPr>
+      <w:r>
+        <w:rPr>
+          <w:rFonts w:ascii="Times New Roman" w:hAnsi="Times New Roman" w:cs="Times New Roman"/>
+          <w:b/>
+          <w:lang w:val="en-GB"/>
+        </w:rPr>
+        <w:t>EMseq_3_Bismark.sh:</w:t>
+      </w:r>
+      <w:r>
+        <w:rPr>
+          <w:rFonts w:ascii="Times New Roman" w:hAnsi="Times New Roman" w:cs="Times New Roman"/>
+          <w:lang w:val="en-GB"/>
+        </w:rPr>
+        <w:t xml:space="preserve"> </w:t>
+      </w:r>
+      <w:r>
+        <w:t xml:space="preserve">manages reference genome indexing, sequence alignment, and single-base resolution methylation calling for every cytosine using the </w:t>
+      </w:r>
+      <w:proofErr w:type="spellStart"/>
+      <w:r>
+        <w:t>Bismark</w:t>
+      </w:r>
+      <w:proofErr w:type="spellEnd"/>
+      <w:r>
+        <w:t xml:space="preserve"> pipeline.</w:t>
+      </w:r>
+      <w:r>
+        <w:rPr>
+          <w:rFonts w:ascii="Times New Roman" w:hAnsi="Times New Roman" w:cs="Times New Roman"/>
+          <w:lang w:val="en-GB"/>
+        </w:rPr>
+        <w:tab/>
+      </w:r>
+      <w:r>
+        <w:rPr>
+          <w:rFonts w:ascii="Times New Roman" w:hAnsi="Times New Roman" w:cs="Times New Roman"/>
+          <w:lang w:val="en-GB"/>
+        </w:rPr>
+        <w:tab/>
+      </w:r>
+    </w:p>
+    <w:p>
+      <w:pPr>
+        <w:ind w:left="1440"/>
+        <w:jc w:val="both"/>
+        <w:rPr>
+          <w:rFonts w:ascii="Times New Roman" w:hAnsi="Times New Roman" w:cs="Times New Roman"/>
+          <w:lang w:val="en-GB"/>
+        </w:rPr>
+      </w:pPr>
+      <w:r>
+        <w:rPr>
+          <w:rFonts w:ascii="Times New Roman" w:hAnsi="Times New Roman" w:cs="Times New Roman"/>
+          <w:b/>
+          <w:lang w:val="en-GB"/>
+        </w:rPr>
+        <w:t>EMseq_4_Filter.sh:</w:t>
+      </w:r>
+      <w:r>
+        <w:rPr>
+          <w:rFonts w:ascii="Times New Roman" w:hAnsi="Times New Roman" w:cs="Times New Roman"/>
+          <w:lang w:val="en-GB"/>
+        </w:rPr>
+        <w:t xml:space="preserve"> </w:t>
+      </w:r>
+      <w:r>
+        <w:t>downstream bioinformatic processing to eliminate cytosines with zero read coverage and performs the critical genomic classification into CA and CG contexts.</w:t>
+      </w:r>
+    </w:p>
+    <w:p>
+      <w:pPr>
+        <w:jc w:val="both"/>
+        <w:rPr>
+          <w:rFonts w:ascii="Times New Roman" w:hAnsi="Times New Roman" w:cs="Times New Roman"/>
+          <w:lang w:val="en-GB"/>
+        </w:rPr>
+      </w:pPr>
+    </w:p>
+    <w:p>
+      <w:pPr>
+        <w:jc w:val="both"/>
+        <w:rPr>
+          <w:rFonts w:ascii="Times New Roman" w:hAnsi="Times New Roman" w:cs="Times New Roman"/>
+          <w:b/>
+          <w:lang w:val="en-GB"/>
+        </w:rPr>
+      </w:pPr>
+      <w:r>
+        <w:rPr>
+          <w:rFonts w:ascii="Times New Roman" w:hAnsi="Times New Roman" w:cs="Times New Roman"/>
+          <w:lang w:val="en-GB"/>
+        </w:rPr>
+        <w:tab/>
+      </w:r>
+      <w:r>
+        <w:rPr>
+          <w:rFonts w:ascii="Times New Roman" w:hAnsi="Times New Roman" w:cs="Times New Roman"/>
+          <w:b/>
+          <w:lang w:val="en-GB"/>
+        </w:rPr>
+        <w:t>01_Single_end_files/</w:t>
+      </w:r>
+    </w:p>
+    <w:p>
+      <w:pPr>
+        <w:ind w:left="1440"/>
+        <w:jc w:val="both"/>
+        <w:rPr>
+          <w:rFonts w:ascii="Times New Roman" w:hAnsi="Times New Roman" w:cs="Times New Roman"/>
+          <w:lang w:val="en-GB"/>
+        </w:rPr>
+      </w:pPr>
+      <w:r>
+        <w:rPr>
+          <w:rFonts w:ascii="Times New Roman" w:hAnsi="Times New Roman" w:cs="Times New Roman"/>
+          <w:b/>
+          <w:lang w:val="en-GB"/>
+        </w:rPr>
+        <w:t>EMseq_1_FASTQ.sh:</w:t>
+      </w:r>
+      <w:r>
+        <w:rPr>
+          <w:rFonts w:ascii="Times New Roman" w:hAnsi="Times New Roman" w:cs="Times New Roman"/>
+          <w:lang w:val="en-GB"/>
+        </w:rPr>
+        <w:t xml:space="preserve"> initial read quality control using FASTQ</w:t>
+      </w:r>
+      <w:r>
+        <w:rPr>
+          <w:rFonts w:ascii="Times New Roman" w:hAnsi="Times New Roman" w:cs="Times New Roman"/>
+          <w:lang w:val="en-GB"/>
+        </w:rPr>
+        <w:t>C.</w:t>
+      </w:r>
+    </w:p>
+    <w:p>
+      <w:pPr>
+        <w:ind w:left="1440"/>
+        <w:jc w:val="both"/>
+        <w:rPr>
+          <w:rFonts w:ascii="Times New Roman" w:hAnsi="Times New Roman" w:cs="Times New Roman"/>
+          <w:lang w:val="en-GB"/>
+        </w:rPr>
+      </w:pPr>
+      <w:r>
+        <w:rPr>
+          <w:rFonts w:ascii="Times New Roman" w:hAnsi="Times New Roman" w:cs="Times New Roman"/>
+          <w:b/>
+          <w:lang w:val="en-GB"/>
+        </w:rPr>
+        <w:t>EMseq_2_Trim.sh:</w:t>
+      </w:r>
+      <w:r>
+        <w:rPr>
+          <w:rFonts w:ascii="Times New Roman" w:hAnsi="Times New Roman" w:cs="Times New Roman"/>
+          <w:lang w:val="en-GB"/>
+        </w:rPr>
+        <w:t xml:space="preserve"> adapter trimming via Trim Galore to ensure high-quality input.</w:t>
+      </w:r>
+    </w:p>
+    <w:p>
+      <w:pPr>
+        <w:ind w:left="1440"/>
+        <w:jc w:val="both"/>
+        <w:rPr>
+          <w:rFonts w:ascii="Times New Roman" w:hAnsi="Times New Roman" w:cs="Times New Roman"/>
+          <w:lang w:val="en-GB"/>
+        </w:rPr>
+      </w:pPr>
+      <w:r>
+        <w:rPr>
+          <w:rFonts w:ascii="Times New Roman" w:hAnsi="Times New Roman" w:cs="Times New Roman"/>
+          <w:b/>
+          <w:lang w:val="en-GB"/>
+        </w:rPr>
+        <w:t>EMseq_3_Bismark.sh:</w:t>
+      </w:r>
+      <w:r>
+        <w:rPr>
+          <w:rFonts w:ascii="Times New Roman" w:hAnsi="Times New Roman" w:cs="Times New Roman"/>
+          <w:lang w:val="en-GB"/>
+        </w:rPr>
+        <w:t xml:space="preserve"> </w:t>
+      </w:r>
+      <w:r>
+        <w:t xml:space="preserve">manages reference genome indexing, sequence alignment, and single-base resolution methylation calling for every cytosine using the </w:t>
+      </w:r>
+      <w:proofErr w:type="spellStart"/>
+      <w:r>
+        <w:t>Bismark</w:t>
+      </w:r>
+      <w:proofErr w:type="spellEnd"/>
+      <w:r>
+        <w:t xml:space="preserve"> pipeline.</w:t>
+      </w:r>
+      <w:r>
+        <w:rPr>
+          <w:rFonts w:ascii="Times New Roman" w:hAnsi="Times New Roman" w:cs="Times New Roman"/>
+          <w:lang w:val="en-GB"/>
+        </w:rPr>
+        <w:tab/>
+      </w:r>
+      <w:r>
+        <w:rPr>
+          <w:rFonts w:ascii="Times New Roman" w:hAnsi="Times New Roman" w:cs="Times New Roman"/>
+          <w:lang w:val="en-GB"/>
+        </w:rPr>
+        <w:tab/>
+      </w:r>
+    </w:p>
+    <w:p>
+      <w:pPr>
+        <w:ind w:left="1440"/>
+        <w:jc w:val="both"/>
+      </w:pPr>
+      <w:r>
+        <w:rPr>
+          <w:rFonts w:ascii="Times New Roman" w:hAnsi="Times New Roman" w:cs="Times New Roman"/>
+          <w:b/>
+          <w:lang w:val="en-GB"/>
+        </w:rPr>
+        <w:t>EMseq_4_Filter.sh:</w:t>
+      </w:r>
+      <w:r>
+        <w:rPr>
+          <w:rFonts w:ascii="Times New Roman" w:hAnsi="Times New Roman" w:cs="Times New Roman"/>
+          <w:lang w:val="en-GB"/>
+        </w:rPr>
+        <w:t xml:space="preserve"> </w:t>
+      </w:r>
+      <w:r>
+        <w:t>downstream bioinformatic processing to eliminate cytosines with zero read coverage and performs the critical genomic classification into CA and CG contexts.</w:t>
+      </w:r>
+    </w:p>
+    <w:p>
+      <w:pPr>
+        <w:jc w:val="both"/>
+        <w:rPr>
+          <w:rFonts w:ascii="Times New Roman" w:hAnsi="Times New Roman" w:cs="Times New Roman"/>
+          <w:lang w:val="en-GB"/>
+        </w:rPr>
+      </w:pPr>
+    </w:p>
+    <w:p>
+      <w:pPr>
+        <w:jc w:val="both"/>
+        <w:rPr>
+          <w:rFonts w:ascii="Times New Roman" w:hAnsi="Times New Roman" w:cs="Times New Roman"/>
+          <w:lang w:val="en-GB"/>
+        </w:rPr>
+      </w:pPr>
+      <w:r>
+        <w:rPr>
+          <w:rFonts w:ascii="Times New Roman" w:hAnsi="Times New Roman" w:cs="Times New Roman"/>
+          <w:b/>
+          <w:lang w:val="en-GB"/>
+        </w:rPr>
+        <w:t>02_CHIPseq_preprocessing_alignment/</w:t>
+      </w:r>
+      <w:r>
+        <w:rPr>
+          <w:rFonts w:ascii="Times New Roman" w:hAnsi="Times New Roman" w:cs="Times New Roman"/>
+          <w:lang w:val="en-GB"/>
+        </w:rPr>
+        <w:t xml:space="preserve"> </w:t>
+      </w:r>
+      <w:r>
+        <w:rPr>
+          <w:rFonts w:ascii="Times New Roman" w:hAnsi="Times New Roman" w:cs="Times New Roman"/>
+          <w:lang w:val="en-GB"/>
+        </w:rPr>
+        <w:t xml:space="preserve">contains the complete suite of scripts required to perform the raw data processing workflow and describes the systematic procedures for initial quality control (QC), adapter </w:t>
+      </w:r>
+      <w:proofErr w:type="spellStart"/>
+      <w:r>
+        <w:rPr>
+          <w:rFonts w:ascii="Times New Roman" w:hAnsi="Times New Roman" w:cs="Times New Roman"/>
+          <w:lang w:val="en-GB"/>
+        </w:rPr>
+        <w:t>trimmin</w:t>
+      </w:r>
+      <w:proofErr w:type="spellEnd"/>
+      <w:r>
+        <w:rPr>
+          <w:rFonts w:ascii="Times New Roman" w:hAnsi="Times New Roman" w:cs="Times New Roman"/>
+          <w:lang w:val="en-GB"/>
+        </w:rPr>
+        <w:t>, and reference genome indexing; it further includes scripts for sequence alignment to the reference genome for both paired-end and single-end libraries, followed by rigorous BAM file filtering and cleaning, and the final extraction of enriched genomic regions (peak calling) to identify protein-DNA interaction sites.</w:t>
+      </w:r>
+    </w:p>
+    <w:p>
+      <w:pPr>
+        <w:ind w:firstLine="720"/>
+        <w:jc w:val="both"/>
+        <w:rPr>
+          <w:rFonts w:ascii="Times New Roman" w:hAnsi="Times New Roman" w:cs="Times New Roman"/>
+          <w:b/>
+          <w:lang w:val="en-GB"/>
+        </w:rPr>
+      </w:pPr>
+      <w:r>
+        <w:rPr>
+          <w:rFonts w:ascii="Times New Roman" w:hAnsi="Times New Roman" w:cs="Times New Roman"/>
+          <w:b/>
+          <w:lang w:val="en-GB"/>
+        </w:rPr>
+        <w:lastRenderedPageBreak/>
+        <w:t>02_Paired_end_files/</w:t>
+      </w:r>
+    </w:p>
+    <w:p>
+      <w:pPr>
+        <w:ind w:left="1440"/>
+        <w:jc w:val="both"/>
+        <w:rPr>
+          <w:rFonts w:ascii="Times New Roman" w:hAnsi="Times New Roman" w:cs="Times New Roman"/>
+          <w:lang w:val="en-GB"/>
+        </w:rPr>
+      </w:pPr>
+      <w:r>
+        <w:rPr>
+          <w:rFonts w:ascii="Times New Roman" w:hAnsi="Times New Roman" w:cs="Times New Roman"/>
+          <w:b/>
+          <w:lang w:val="en-GB"/>
+        </w:rPr>
+        <w:t>CHIP_1_Fastq.sh:</w:t>
+      </w:r>
+      <w:r>
+        <w:rPr>
+          <w:rFonts w:ascii="Times New Roman" w:hAnsi="Times New Roman" w:cs="Times New Roman"/>
+          <w:lang w:val="en-GB"/>
+        </w:rPr>
+        <w:t xml:space="preserve"> </w:t>
+      </w:r>
+      <w:r>
+        <w:t>describes the initial read quality control using FASTQC and adapter trimming via Trim Galore to ensure high-quality read input</w:t>
+      </w:r>
+      <w:r>
+        <w:rPr>
+          <w:rFonts w:ascii="Times New Roman" w:hAnsi="Times New Roman" w:cs="Times New Roman"/>
+          <w:lang w:val="en-GB"/>
+        </w:rPr>
+        <w:t>.</w:t>
+      </w:r>
+    </w:p>
+    <w:p>
+      <w:pPr>
+        <w:ind w:left="1440"/>
+        <w:jc w:val="both"/>
+        <w:rPr>
+          <w:rFonts w:ascii="Times New Roman" w:hAnsi="Times New Roman" w:cs="Times New Roman"/>
+          <w:lang w:val="en-GB"/>
+        </w:rPr>
+      </w:pPr>
+      <w:r>
+        <w:rPr>
+          <w:rFonts w:ascii="Times New Roman" w:hAnsi="Times New Roman" w:cs="Times New Roman"/>
+          <w:b/>
+          <w:lang w:val="en-GB"/>
+        </w:rPr>
+        <w:t>CHIP_2_buildindex.sh:</w:t>
+      </w:r>
+      <w:r>
+        <w:rPr>
+          <w:rFonts w:ascii="Times New Roman" w:hAnsi="Times New Roman" w:cs="Times New Roman"/>
+          <w:lang w:val="en-GB"/>
+        </w:rPr>
+        <w:t xml:space="preserve"> </w:t>
+      </w:r>
+      <w:r>
+        <w:t>contains the reference genome indexing procedure using the Bowtie2 alignment engine.</w:t>
+      </w:r>
+    </w:p>
+    <w:p>
+      <w:pPr>
+        <w:ind w:left="1440"/>
+        <w:jc w:val="both"/>
+        <w:rPr>
+          <w:rFonts w:ascii="Times New Roman" w:hAnsi="Times New Roman" w:cs="Times New Roman"/>
+          <w:lang w:val="en-GB"/>
+        </w:rPr>
+      </w:pPr>
+      <w:r>
+        <w:rPr>
+          <w:rFonts w:ascii="Times New Roman" w:hAnsi="Times New Roman" w:cs="Times New Roman"/>
+          <w:b/>
+          <w:lang w:val="en-GB"/>
+        </w:rPr>
+        <w:t>CHIP_3_align.sh:</w:t>
+      </w:r>
+      <w:r>
+        <w:rPr>
+          <w:rFonts w:ascii="Times New Roman" w:hAnsi="Times New Roman" w:cs="Times New Roman"/>
+          <w:lang w:val="en-GB"/>
+        </w:rPr>
+        <w:t xml:space="preserve"> </w:t>
+      </w:r>
+      <w:r>
+        <w:t>describes the sequence alignment of processed reads to the reference genome using Bowtie2.</w:t>
+      </w:r>
+    </w:p>
+    <w:p>
+      <w:pPr>
+        <w:ind w:left="1440"/>
+        <w:jc w:val="both"/>
+        <w:rPr>
+          <w:rFonts w:ascii="Times New Roman" w:hAnsi="Times New Roman" w:cs="Times New Roman"/>
+          <w:lang w:val="en-GB"/>
+        </w:rPr>
+      </w:pPr>
+      <w:r>
+        <w:rPr>
+          <w:rFonts w:ascii="Times New Roman" w:hAnsi="Times New Roman" w:cs="Times New Roman"/>
+          <w:b/>
+          <w:lang w:val="en-GB"/>
+        </w:rPr>
+        <w:t>CHIP_4_stats_dup.sh:</w:t>
+      </w:r>
+      <w:r>
+        <w:rPr>
+          <w:rFonts w:ascii="Times New Roman" w:hAnsi="Times New Roman" w:cs="Times New Roman"/>
+          <w:lang w:val="en-GB"/>
+        </w:rPr>
+        <w:t xml:space="preserve"> </w:t>
+      </w:r>
+      <w:r>
+        <w:t>contains the duplicate removal process using Picard to improve library complexity and reduce PCR bias.</w:t>
+      </w:r>
+    </w:p>
+    <w:p>
+      <w:pPr>
+        <w:ind w:left="1440"/>
+        <w:jc w:val="both"/>
+        <w:rPr>
+          <w:rFonts w:ascii="Times New Roman" w:hAnsi="Times New Roman" w:cs="Times New Roman"/>
+          <w:lang w:val="en-GB"/>
+        </w:rPr>
+      </w:pPr>
+      <w:r>
+        <w:rPr>
+          <w:rFonts w:ascii="Times New Roman" w:hAnsi="Times New Roman" w:cs="Times New Roman"/>
+          <w:b/>
+          <w:lang w:val="en-GB"/>
+        </w:rPr>
+        <w:t>CHIP_5_filter_bam.sh:</w:t>
+      </w:r>
+      <w:r>
+        <w:rPr>
+          <w:rFonts w:ascii="Times New Roman" w:hAnsi="Times New Roman" w:cs="Times New Roman"/>
+          <w:lang w:val="en-GB"/>
+        </w:rPr>
+        <w:t xml:space="preserve"> </w:t>
+      </w:r>
+      <w:r>
+        <w:t>describes the rigorous filtering of BAM files to retain high-confidence, unique alignments.</w:t>
+      </w:r>
+    </w:p>
+    <w:p>
+      <w:pPr>
+        <w:ind w:left="1440"/>
+        <w:jc w:val="both"/>
+        <w:rPr>
+          <w:rFonts w:ascii="Times New Roman" w:hAnsi="Times New Roman" w:cs="Times New Roman"/>
+          <w:lang w:val="en-GB"/>
+        </w:rPr>
+      </w:pPr>
+      <w:r>
+        <w:rPr>
+          <w:rFonts w:ascii="Times New Roman" w:hAnsi="Times New Roman" w:cs="Times New Roman"/>
+          <w:b/>
+          <w:lang w:val="en-GB"/>
+        </w:rPr>
+        <w:t>CHIP_6_peakcalling.sh</w:t>
       </w:r>
       <w:r>
         <w:rPr>
@@ -757,11 +1322,70 @@
         <w:t xml:space="preserve"> </w:t>
       </w:r>
       <w:r>
-        <w:rPr>
-          <w:rFonts w:ascii="Times New Roman" w:hAnsi="Times New Roman" w:cs="Times New Roman"/>
-          <w:lang w:val="en-GB"/>
-        </w:rPr>
-        <w:t>A comprehensive list of R/Bioconductor packages used for downstream statistical analysis</w:t>
+        <w:t>contains the final extraction of protein-binding enriched regions (peak calling) for both single-end and paired-end datasets using the epic2 pipeline.</w:t>
+      </w:r>
+    </w:p>
+    <w:p>
+      <w:pPr>
+        <w:ind w:left="1440"/>
+        <w:jc w:val="both"/>
+        <w:rPr>
+          <w:rFonts w:ascii="Times New Roman" w:hAnsi="Times New Roman" w:cs="Times New Roman"/>
+          <w:lang w:val="en-GB"/>
+        </w:rPr>
+      </w:pPr>
+    </w:p>
+    <w:p>
+      <w:pPr>
+        <w:jc w:val="both"/>
+        <w:rPr>
+          <w:rFonts w:ascii="Times New Roman" w:hAnsi="Times New Roman" w:cs="Times New Roman"/>
+          <w:b/>
+          <w:lang w:val="en-GB"/>
+        </w:rPr>
+      </w:pPr>
+      <w:r>
+        <w:rPr>
+          <w:rFonts w:ascii="Times New Roman" w:hAnsi="Times New Roman" w:cs="Times New Roman"/>
+          <w:lang w:val="en-GB"/>
+        </w:rPr>
+        <w:tab/>
+      </w:r>
+      <w:r>
+        <w:rPr>
+          <w:rFonts w:ascii="Times New Roman" w:hAnsi="Times New Roman" w:cs="Times New Roman"/>
+          <w:b/>
+          <w:lang w:val="en-GB"/>
+        </w:rPr>
+        <w:t>02_Single_end_files/</w:t>
+      </w:r>
+    </w:p>
+    <w:p>
+      <w:pPr>
+        <w:ind w:left="1440"/>
+        <w:jc w:val="both"/>
+        <w:rPr>
+          <w:rFonts w:ascii="Times New Roman" w:hAnsi="Times New Roman" w:cs="Times New Roman"/>
+          <w:lang w:val="en-GB"/>
+        </w:rPr>
+      </w:pPr>
+      <w:r>
+        <w:rPr>
+          <w:rFonts w:ascii="Times New Roman" w:hAnsi="Times New Roman" w:cs="Times New Roman"/>
+          <w:b/>
+          <w:lang w:val="en-GB"/>
+        </w:rPr>
+        <w:t>CHIP_1_Fastq.sh</w:t>
+      </w:r>
+      <w:r>
+        <w:rPr>
+          <w:rFonts w:ascii="Times New Roman" w:hAnsi="Times New Roman" w:cs="Times New Roman"/>
+          <w:lang w:val="en-GB"/>
+        </w:rPr>
+        <w:t xml:space="preserve">: </w:t>
+      </w:r>
+      <w:r>
+        <w:t>describes the initial read quality control using FASTQC and adapter trimming via Trim Galore to ensure high-quality read input</w:t>
       </w:r>
       <w:r>
         <w:rPr>
@@ -773,42 +1397,181 @@
     </w:p>
     <w:p>
       <w:pPr>
-        <w:jc w:val="both"/>
-        <w:rPr>
-          <w:rFonts w:ascii="Times New Roman" w:hAnsi="Times New Roman" w:cs="Times New Roman"/>
-          <w:lang w:val="en-GB"/>
-        </w:rPr>
-      </w:pPr>
-    </w:p>
-    <w:p>
-      <w:pPr>
-        <w:jc w:val="both"/>
-        <w:rPr>
-          <w:rFonts w:ascii="Times New Roman" w:hAnsi="Times New Roman" w:cs="Times New Roman"/>
-          <w:lang w:val="en-GB"/>
-        </w:rPr>
-      </w:pPr>
-      <w:r>
-        <w:rPr>
-          <w:rFonts w:ascii="Times New Roman" w:hAnsi="Times New Roman" w:cs="Times New Roman"/>
-          <w:b/>
-          <w:lang w:val="en-GB"/>
-        </w:rPr>
-        <w:t>/01_EMseq_preprocessing_alignment:</w:t>
-      </w:r>
-      <w:r>
-        <w:rPr>
-          <w:rFonts w:ascii="Times New Roman" w:hAnsi="Times New Roman" w:cs="Times New Roman"/>
-          <w:lang w:val="en-GB"/>
-        </w:rPr>
-        <w:t xml:space="preserve"> </w:t>
-      </w:r>
-      <w:r>
-        <w:rPr>
-          <w:rFonts w:ascii="Times New Roman" w:hAnsi="Times New Roman" w:cs="Times New Roman"/>
-          <w:lang w:val="en-GB"/>
-        </w:rPr>
-        <w:t>contains the complete suite of scripts required to execute the raw data processing workflow and describes the systematic procedures for quality control (QC), adapter trimming to ensure read integrity, and sequence alignment to reference genomes for both paired-end and single-end libraries, as well as the final extraction of single-base resolution methylation levels.</w:t>
+        <w:ind w:left="1440"/>
+        <w:jc w:val="both"/>
+        <w:rPr>
+          <w:rFonts w:ascii="Times New Roman" w:hAnsi="Times New Roman" w:cs="Times New Roman"/>
+          <w:lang w:val="en-GB"/>
+        </w:rPr>
+      </w:pPr>
+      <w:r>
+        <w:rPr>
+          <w:rFonts w:ascii="Times New Roman" w:hAnsi="Times New Roman" w:cs="Times New Roman"/>
+          <w:b/>
+          <w:lang w:val="en-GB"/>
+        </w:rPr>
+        <w:t>CHIP_2_buildindex.sh:</w:t>
+      </w:r>
+      <w:r>
+        <w:rPr>
+          <w:rFonts w:ascii="Times New Roman" w:hAnsi="Times New Roman" w:cs="Times New Roman"/>
+          <w:lang w:val="en-GB"/>
+        </w:rPr>
+        <w:t xml:space="preserve"> </w:t>
+      </w:r>
+      <w:r>
+        <w:t>contains the reference genome indexing procedure using the Bowtie2 alignment engine.</w:t>
+      </w:r>
+    </w:p>
+    <w:p>
+      <w:pPr>
+        <w:ind w:left="1440"/>
+        <w:jc w:val="both"/>
+        <w:rPr>
+          <w:rFonts w:ascii="Times New Roman" w:hAnsi="Times New Roman" w:cs="Times New Roman"/>
+          <w:lang w:val="en-GB"/>
+        </w:rPr>
+      </w:pPr>
+      <w:r>
+        <w:rPr>
+          <w:rFonts w:ascii="Times New Roman" w:hAnsi="Times New Roman" w:cs="Times New Roman"/>
+          <w:b/>
+          <w:lang w:val="en-GB"/>
+        </w:rPr>
+        <w:t>CHIP_3_align.sh:</w:t>
+      </w:r>
+      <w:r>
+        <w:rPr>
+          <w:rFonts w:ascii="Times New Roman" w:hAnsi="Times New Roman" w:cs="Times New Roman"/>
+          <w:lang w:val="en-GB"/>
+        </w:rPr>
+        <w:t xml:space="preserve"> </w:t>
+      </w:r>
+      <w:r>
+        <w:t>describes the sequence alignment of processed reads to the reference genome using Bowtie2.</w:t>
+      </w:r>
+    </w:p>
+    <w:p>
+      <w:pPr>
+        <w:ind w:left="1440"/>
+        <w:jc w:val="both"/>
+        <w:rPr>
+          <w:rFonts w:ascii="Times New Roman" w:hAnsi="Times New Roman" w:cs="Times New Roman"/>
+          <w:lang w:val="en-GB"/>
+        </w:rPr>
+      </w:pPr>
+      <w:r>
+        <w:rPr>
+          <w:rFonts w:ascii="Times New Roman" w:hAnsi="Times New Roman" w:cs="Times New Roman"/>
+          <w:b/>
+          <w:lang w:val="en-GB"/>
+        </w:rPr>
+        <w:t>CHIP_4_stats_dup.sh:</w:t>
+      </w:r>
+      <w:r>
+        <w:rPr>
+          <w:rFonts w:ascii="Times New Roman" w:hAnsi="Times New Roman" w:cs="Times New Roman"/>
+          <w:lang w:val="en-GB"/>
+        </w:rPr>
+        <w:t xml:space="preserve"> </w:t>
+      </w:r>
+      <w:r>
+        <w:t>contains the duplicate removal process using Picard to improve library complexity and reduce PCR bias.</w:t>
+      </w:r>
+    </w:p>
+    <w:p>
+      <w:pPr>
+        <w:ind w:left="1440"/>
+        <w:jc w:val="both"/>
+        <w:rPr>
+          <w:rFonts w:ascii="Times New Roman" w:hAnsi="Times New Roman" w:cs="Times New Roman"/>
+          <w:lang w:val="en-GB"/>
+        </w:rPr>
+      </w:pPr>
+      <w:r>
+        <w:rPr>
+          <w:rFonts w:ascii="Times New Roman" w:hAnsi="Times New Roman" w:cs="Times New Roman"/>
+          <w:b/>
+          <w:lang w:val="en-GB"/>
+        </w:rPr>
+        <w:t>CHIP_5_filter_bam.sh:</w:t>
+      </w:r>
+      <w:r>
+        <w:rPr>
+          <w:rFonts w:ascii="Times New Roman" w:hAnsi="Times New Roman" w:cs="Times New Roman"/>
+          <w:lang w:val="en-GB"/>
+        </w:rPr>
+        <w:t xml:space="preserve"> </w:t>
+      </w:r>
+      <w:r>
+        <w:t>describes the rigorous filtering of BAM files to retain high-confidence, unique alignments.</w:t>
+      </w:r>
+    </w:p>
+    <w:p>
+      <w:pPr>
+        <w:ind w:left="1440"/>
+        <w:jc w:val="both"/>
+      </w:pPr>
+      <w:r>
+        <w:rPr>
+          <w:rFonts w:ascii="Times New Roman" w:hAnsi="Times New Roman" w:cs="Times New Roman"/>
+          <w:b/>
+          <w:lang w:val="en-GB"/>
+        </w:rPr>
+        <w:t>CHIP_6_peakcalling.sh:</w:t>
+      </w:r>
+      <w:r>
+        <w:rPr>
+          <w:rFonts w:ascii="Times New Roman" w:hAnsi="Times New Roman" w:cs="Times New Roman"/>
+          <w:lang w:val="en-GB"/>
+        </w:rPr>
+        <w:t xml:space="preserve"> </w:t>
+      </w:r>
+      <w:r>
+        <w:t>contains the final extraction of protein-binding enriched regions (peak calling) for both single-end and paired-end datasets using the epic2 pipeline.</w:t>
+      </w:r>
+    </w:p>
+    <w:p>
+      <w:pPr>
+        <w:jc w:val="both"/>
+        <w:rPr>
+          <w:rFonts w:ascii="Times New Roman" w:hAnsi="Times New Roman" w:cs="Times New Roman"/>
+          <w:lang w:val="en-GB"/>
+        </w:rPr>
+      </w:pPr>
+    </w:p>
+    <w:p>
+      <w:pPr>
+        <w:jc w:val="both"/>
+        <w:rPr>
+          <w:rFonts w:ascii="Times New Roman" w:hAnsi="Times New Roman" w:cs="Times New Roman"/>
+          <w:lang w:val="en-GB"/>
+        </w:rPr>
+      </w:pPr>
+      <w:r>
+        <w:rPr>
+          <w:rFonts w:ascii="Times New Roman" w:hAnsi="Times New Roman" w:cs="Times New Roman"/>
+          <w:b/>
+          <w:lang w:val="en-GB"/>
+        </w:rPr>
+        <w:t>03_Figures/</w:t>
+      </w:r>
+      <w:r>
+        <w:rPr>
+          <w:rFonts w:ascii="Times New Roman" w:hAnsi="Times New Roman" w:cs="Times New Roman"/>
+          <w:lang w:val="en-GB"/>
+        </w:rPr>
+        <w:t xml:space="preserve"> </w:t>
+      </w:r>
+      <w:r>
+        <w:t>contains the complete set of R scripts required to perform the core statistical analyses of this study and describes the procedures used to generate all high-resolution figures presented in the manuscript</w:t>
+      </w:r>
+      <w:r>
+        <w:rPr>
+          <w:rFonts w:ascii="Times New Roman" w:hAnsi="Times New Roman" w:cs="Times New Roman"/>
+          <w:lang w:val="en-GB"/>
+        </w:rPr>
+        <w:t xml:space="preserve">. </w:t>
       </w:r>
     </w:p>
     <w:p>
@@ -826,16 +1589,6 @@
         </w:rPr>
         <w:tab/>
       </w:r>
-    </w:p>
-    <w:p>
-      <w:pPr>
-        <w:jc w:val="both"/>
-        <w:rPr>
-          <w:rFonts w:ascii="Times New Roman" w:hAnsi="Times New Roman" w:cs="Times New Roman"/>
-          <w:b/>
-          <w:lang w:val="en-GB"/>
-        </w:rPr>
-      </w:pPr>
       <w:r>
         <w:rPr>
           <w:rFonts w:ascii="Times New Roman" w:hAnsi="Times New Roman" w:cs="Times New Roman"/>
@@ -843,110 +1596,340 @@
         </w:rPr>
         <w:tab/>
       </w:r>
-      <w:r>
-        <w:rPr>
-          <w:rFonts w:ascii="Times New Roman" w:hAnsi="Times New Roman" w:cs="Times New Roman"/>
-          <w:b/>
-          <w:lang w:val="en-GB"/>
-        </w:rPr>
-        <w:t>01_Paired_end_files/</w:t>
+    </w:p>
+    <w:p>
+      <w:pPr>
+        <w:ind w:left="720"/>
+        <w:jc w:val="both"/>
+        <w:rPr>
+          <w:rFonts w:ascii="Times New Roman" w:hAnsi="Times New Roman" w:cs="Times New Roman"/>
+          <w:lang w:val="en-GB"/>
+        </w:rPr>
+      </w:pPr>
+      <w:r>
+        <w:rPr>
+          <w:rFonts w:ascii="Times New Roman" w:hAnsi="Times New Roman" w:cs="Times New Roman"/>
+          <w:b/>
+          <w:lang w:val="en-GB"/>
+        </w:rPr>
+        <w:t>Figure1/</w:t>
+      </w:r>
+      <w:r>
+        <w:rPr>
+          <w:rFonts w:ascii="Times New Roman" w:hAnsi="Times New Roman" w:cs="Times New Roman"/>
+          <w:lang w:val="en-GB"/>
+        </w:rPr>
+        <w:t xml:space="preserve"> </w:t>
+      </w:r>
+      <w:r>
+        <w:t>contains the specialized scripts used to execute the analyses and generate the visualizations corresponding to Figure 1</w:t>
+      </w:r>
+      <w:r>
+        <w:rPr>
+          <w:rFonts w:ascii="Times New Roman" w:hAnsi="Times New Roman" w:cs="Times New Roman"/>
+          <w:lang w:val="en-GB"/>
+        </w:rPr>
+        <w:t>:</w:t>
+      </w:r>
+    </w:p>
+    <w:p>
+      <w:pPr>
+        <w:jc w:val="both"/>
+        <w:rPr>
+          <w:rFonts w:ascii="Times New Roman" w:hAnsi="Times New Roman" w:cs="Times New Roman"/>
+          <w:lang w:val="en-GB"/>
+        </w:rPr>
+      </w:pPr>
+      <w:r>
+        <w:rPr>
+          <w:rFonts w:ascii="Times New Roman" w:hAnsi="Times New Roman" w:cs="Times New Roman"/>
+          <w:lang w:val="en-GB"/>
+        </w:rPr>
+        <w:tab/>
+      </w:r>
+      <w:r>
+        <w:rPr>
+          <w:rFonts w:ascii="Times New Roman" w:hAnsi="Times New Roman" w:cs="Times New Roman"/>
+          <w:lang w:val="en-GB"/>
+        </w:rPr>
+        <w:tab/>
       </w:r>
     </w:p>
     <w:p>
       <w:pPr>
         <w:ind w:left="1440"/>
         <w:jc w:val="both"/>
-        <w:rPr>
-          <w:rFonts w:ascii="Times New Roman" w:hAnsi="Times New Roman" w:cs="Times New Roman"/>
-          <w:lang w:val="en-GB"/>
-        </w:rPr>
-      </w:pPr>
-      <w:r>
-        <w:rPr>
-          <w:rFonts w:ascii="Times New Roman" w:hAnsi="Times New Roman" w:cs="Times New Roman"/>
-          <w:b/>
-          <w:lang w:val="en-GB"/>
-        </w:rPr>
-        <w:t>EMseq_1_FASTQ.sh:</w:t>
-      </w:r>
-      <w:r>
-        <w:rPr>
-          <w:rFonts w:ascii="Times New Roman" w:hAnsi="Times New Roman" w:cs="Times New Roman"/>
-          <w:lang w:val="en-GB"/>
-        </w:rPr>
-        <w:t xml:space="preserve"> initial read quality control using FASTQ</w:t>
-      </w:r>
-      <w:r>
-        <w:rPr>
-          <w:rFonts w:ascii="Times New Roman" w:hAnsi="Times New Roman" w:cs="Times New Roman"/>
-          <w:lang w:val="en-GB"/>
-        </w:rPr>
-        <w:t>C.</w:t>
-      </w:r>
-    </w:p>
-    <w:p>
-      <w:pPr>
-        <w:ind w:left="1440"/>
-        <w:jc w:val="both"/>
-        <w:rPr>
-          <w:rFonts w:ascii="Times New Roman" w:hAnsi="Times New Roman" w:cs="Times New Roman"/>
-          <w:lang w:val="en-GB"/>
-        </w:rPr>
-      </w:pPr>
-      <w:r>
-        <w:rPr>
-          <w:rFonts w:ascii="Times New Roman" w:hAnsi="Times New Roman" w:cs="Times New Roman"/>
-          <w:b/>
-          <w:lang w:val="en-GB"/>
-        </w:rPr>
-        <w:t>EMseq_2_Trim.sh:</w:t>
-      </w:r>
-      <w:r>
-        <w:rPr>
-          <w:rFonts w:ascii="Times New Roman" w:hAnsi="Times New Roman" w:cs="Times New Roman"/>
-          <w:lang w:val="en-GB"/>
-        </w:rPr>
-        <w:t xml:space="preserve"> adapter trimming via Trim Galore to ensure high-quality input.</w:t>
-      </w:r>
-    </w:p>
-    <w:p>
-      <w:pPr>
-        <w:ind w:left="1440"/>
-        <w:jc w:val="both"/>
-        <w:rPr>
-          <w:rFonts w:ascii="Times New Roman" w:hAnsi="Times New Roman" w:cs="Times New Roman"/>
-          <w:lang w:val="en-GB"/>
-        </w:rPr>
-      </w:pPr>
-      <w:r>
-        <w:rPr>
-          <w:rFonts w:ascii="Times New Roman" w:hAnsi="Times New Roman" w:cs="Times New Roman"/>
-          <w:b/>
-          <w:lang w:val="en-GB"/>
-        </w:rPr>
-        <w:t>EMseq_3_Bismark.sh:</w:t>
-      </w:r>
-      <w:r>
-        <w:rPr>
-          <w:rFonts w:ascii="Times New Roman" w:hAnsi="Times New Roman" w:cs="Times New Roman"/>
-          <w:lang w:val="en-GB"/>
-        </w:rPr>
-        <w:t xml:space="preserve"> </w:t>
-      </w:r>
-      <w:r>
-        <w:t xml:space="preserve">manages reference genome indexing, sequence alignment, and single-base resolution methylation calling for every cytosine using the </w:t>
+      </w:pPr>
+      <w:r>
+        <w:rPr>
+          <w:rFonts w:ascii="Times New Roman" w:hAnsi="Times New Roman" w:cs="Times New Roman"/>
+          <w:b/>
+          <w:lang w:val="en-GB"/>
+        </w:rPr>
+        <w:t>Figure1a/</w:t>
+      </w:r>
+      <w:r>
+        <w:rPr>
+          <w:rFonts w:ascii="Times New Roman" w:hAnsi="Times New Roman" w:cs="Times New Roman"/>
+          <w:b/>
+          <w:lang w:val="en-GB"/>
+        </w:rPr>
+        <w:t>:</w:t>
+      </w:r>
+      <w:r>
+        <w:rPr>
+          <w:rFonts w:ascii="Times New Roman" w:hAnsi="Times New Roman" w:cs="Times New Roman"/>
+          <w:lang w:val="en-GB"/>
+        </w:rPr>
+        <w:t xml:space="preserve"> </w:t>
+      </w:r>
+      <w:r>
+        <w:t xml:space="preserve">describes the initial identification of the </w:t>
       </w:r>
       <w:proofErr w:type="spellStart"/>
       <w:r>
-        <w:t>Bismark</w:t>
+        <w:t>CoM</w:t>
       </w:r>
       <w:proofErr w:type="spellEnd"/>
       <w:r>
-        <w:t xml:space="preserve"> pipeline</w:t>
-      </w:r>
-      <w:r>
-        <w:t>.</w:t>
-      </w:r>
+        <w:t xml:space="preserve"> landscape, including:</w:t>
+      </w:r>
+    </w:p>
+    <w:p>
+      <w:pPr>
+        <w:ind w:left="2160"/>
+        <w:jc w:val="both"/>
+      </w:pPr>
+      <w:r>
+        <w:rPr>
+          <w:rFonts w:ascii="Times New Roman" w:hAnsi="Times New Roman" w:cs="Times New Roman"/>
+          <w:b/>
+          <w:lang w:val="en-GB"/>
+        </w:rPr>
+        <w:t>01_distanceCoM.R</w:t>
+      </w:r>
+      <w:r>
+        <w:rPr>
+          <w:rFonts w:ascii="Times New Roman" w:hAnsi="Times New Roman" w:cs="Times New Roman"/>
+          <w:lang w:val="en-GB"/>
+        </w:rPr>
+        <w:t>:</w:t>
+      </w:r>
+      <w:r>
+        <w:rPr>
+          <w:rFonts w:ascii="Times New Roman" w:hAnsi="Times New Roman" w:cs="Times New Roman"/>
+          <w:lang w:val="en-GB"/>
+        </w:rPr>
+        <w:t xml:space="preserve"> </w:t>
+      </w:r>
+      <w:r>
+        <w:t xml:space="preserve">estimates the optimal genomic distance for coupling between </w:t>
+      </w:r>
+      <w:proofErr w:type="spellStart"/>
+      <w:r>
+        <w:t>mCA</w:t>
+      </w:r>
+      <w:proofErr w:type="spellEnd"/>
+      <w:r>
+        <w:t xml:space="preserve"> and </w:t>
+      </w:r>
+      <w:proofErr w:type="spellStart"/>
+      <w:r>
+        <w:t>mCG</w:t>
+      </w:r>
+      <w:proofErr w:type="spellEnd"/>
+      <w:r>
+        <w:t xml:space="preserve"> sites.</w:t>
+      </w:r>
+    </w:p>
+    <w:p>
+      <w:pPr>
+        <w:ind w:left="2160"/>
+        <w:jc w:val="both"/>
+        <w:rPr>
+          <w:rFonts w:ascii="Times New Roman" w:hAnsi="Times New Roman" w:cs="Times New Roman"/>
+          <w:lang w:val="en-GB"/>
+        </w:rPr>
+      </w:pPr>
+      <w:r>
+        <w:rPr>
+          <w:rFonts w:ascii="Times New Roman" w:hAnsi="Times New Roman" w:cs="Times New Roman"/>
+          <w:b/>
+          <w:lang w:val="en-GB"/>
+        </w:rPr>
+        <w:t>02_common_</w:t>
+      </w:r>
+      <w:proofErr w:type="gramStart"/>
+      <w:r>
+        <w:rPr>
+          <w:rFonts w:ascii="Times New Roman" w:hAnsi="Times New Roman" w:cs="Times New Roman"/>
+          <w:b/>
+          <w:lang w:val="en-GB"/>
+        </w:rPr>
+        <w:t>windows.R</w:t>
+      </w:r>
+      <w:proofErr w:type="gramEnd"/>
+      <w:r>
+        <w:rPr>
+          <w:rFonts w:ascii="Times New Roman" w:hAnsi="Times New Roman" w:cs="Times New Roman"/>
+          <w:b/>
+          <w:lang w:val="en-GB"/>
+        </w:rPr>
+        <w:t>:</w:t>
+      </w:r>
+      <w:r>
+        <w:rPr>
+          <w:rFonts w:ascii="Times New Roman" w:hAnsi="Times New Roman" w:cs="Times New Roman"/>
+          <w:lang w:val="en-GB"/>
+        </w:rPr>
+        <w:t xml:space="preserve"> </w:t>
+      </w:r>
+      <w:r>
+        <w:t>contains the logic to identify consensus genomic windows across the entire study dataset.</w:t>
+      </w:r>
+    </w:p>
+    <w:p>
+      <w:pPr>
+        <w:ind w:left="2160"/>
+        <w:jc w:val="both"/>
+        <w:rPr>
+          <w:rFonts w:ascii="Times New Roman" w:hAnsi="Times New Roman" w:cs="Times New Roman"/>
+          <w:lang w:val="en-GB"/>
+        </w:rPr>
+      </w:pPr>
+      <w:r>
+        <w:rPr>
+          <w:rFonts w:ascii="Times New Roman" w:hAnsi="Times New Roman" w:cs="Times New Roman"/>
+          <w:b/>
+          <w:lang w:val="en-GB"/>
+        </w:rPr>
+        <w:t>03_Correlation.R:</w:t>
+      </w:r>
+      <w:r>
+        <w:rPr>
+          <w:rFonts w:ascii="Times New Roman" w:hAnsi="Times New Roman" w:cs="Times New Roman"/>
+          <w:lang w:val="en-GB"/>
+        </w:rPr>
+        <w:t xml:space="preserve"> </w:t>
+      </w:r>
+      <w:r>
+        <w:t>describes the calculation of CA-CG correlations, statistical metrics, and absolute methylation levels.</w:t>
+      </w:r>
+    </w:p>
+    <w:p>
+      <w:pPr>
+        <w:ind w:left="2160"/>
+        <w:jc w:val="both"/>
+      </w:pPr>
+      <w:r>
+        <w:rPr>
+          <w:rFonts w:ascii="Times New Roman" w:hAnsi="Times New Roman" w:cs="Times New Roman"/>
+          <w:b/>
+          <w:lang w:val="en-GB"/>
+        </w:rPr>
+        <w:t>04_Correlation_</w:t>
+      </w:r>
+      <w:proofErr w:type="gramStart"/>
+      <w:r>
+        <w:rPr>
+          <w:rFonts w:ascii="Times New Roman" w:hAnsi="Times New Roman" w:cs="Times New Roman"/>
+          <w:b/>
+          <w:lang w:val="en-GB"/>
+        </w:rPr>
+        <w:t>plots.R</w:t>
+      </w:r>
+      <w:proofErr w:type="gramEnd"/>
+      <w:r>
+        <w:rPr>
+          <w:rFonts w:ascii="Times New Roman" w:hAnsi="Times New Roman" w:cs="Times New Roman"/>
+          <w:b/>
+          <w:lang w:val="en-GB"/>
+        </w:rPr>
+        <w:t>:</w:t>
+      </w:r>
+      <w:r>
+        <w:rPr>
+          <w:rFonts w:ascii="Times New Roman" w:hAnsi="Times New Roman" w:cs="Times New Roman"/>
+          <w:lang w:val="en-GB"/>
+        </w:rPr>
+        <w:t xml:space="preserve"> </w:t>
+      </w:r>
+      <w:r>
+        <w:t>contains the scripts for generating CA-CG correlation visualizations.</w:t>
+      </w:r>
+    </w:p>
+    <w:p>
+      <w:pPr>
+        <w:ind w:left="2160"/>
+        <w:jc w:val="both"/>
+        <w:rPr>
+          <w:lang w:val="en-GB"/>
+        </w:rPr>
+      </w:pPr>
+      <w:r>
+        <w:rPr>
+          <w:b/>
+          <w:lang w:val="en-GB"/>
+        </w:rPr>
+        <w:lastRenderedPageBreak/>
+        <w:t xml:space="preserve">05_Comun_Windows_CA_CG.R: </w:t>
+      </w:r>
+      <w:r>
+        <w:rPr>
+          <w:lang w:val="en-GB"/>
+        </w:rPr>
+        <w:t xml:space="preserve">generates overlapping CA and CG regions in </w:t>
+      </w:r>
+      <w:proofErr w:type="spellStart"/>
+      <w:r>
+        <w:rPr>
+          <w:lang w:val="en-GB"/>
+        </w:rPr>
+        <w:t>mvalues</w:t>
+      </w:r>
+      <w:proofErr w:type="spellEnd"/>
+      <w:r>
+        <w:rPr>
+          <w:lang w:val="en-GB"/>
+        </w:rPr>
+        <w:t xml:space="preserve"> ​​and </w:t>
+      </w:r>
+      <w:proofErr w:type="spellStart"/>
+      <w:r>
+        <w:rPr>
+          <w:lang w:val="en-GB"/>
+        </w:rPr>
+        <w:t>bvalues</w:t>
+      </w:r>
+      <w:proofErr w:type="spellEnd"/>
+      <w:r>
+        <w:rPr>
+          <w:lang w:val="en-GB"/>
+        </w:rPr>
+        <w:t xml:space="preserve"> ​​between samples from the same dataset</w:t>
+      </w:r>
+      <w:bookmarkStart w:id="0" w:name="_GoBack"/>
+      <w:bookmarkEnd w:id="0"/>
+    </w:p>
+    <w:p>
+      <w:pPr>
+        <w:ind w:left="2160"/>
+        <w:jc w:val="both"/>
+        <w:rPr>
+          <w:rFonts w:ascii="Times New Roman" w:hAnsi="Times New Roman" w:cs="Times New Roman"/>
+          <w:lang w:val="en-GB"/>
+        </w:rPr>
+      </w:pPr>
+    </w:p>
+    <w:p>
+      <w:pPr>
+        <w:jc w:val="both"/>
+        <w:rPr>
+          <w:rFonts w:ascii="Times New Roman" w:hAnsi="Times New Roman" w:cs="Times New Roman"/>
+          <w:b/>
+          <w:lang w:val="en-GB"/>
+        </w:rPr>
+      </w:pPr>
       <w:r>
         <w:rPr>
           <w:rFonts w:ascii="Times New Roman" w:hAnsi="Times New Roman" w:cs="Times New Roman"/>
@@ -957,1093 +1940,17 @@
       <w:r>
         <w:rPr>
           <w:rFonts w:ascii="Times New Roman" w:hAnsi="Times New Roman" w:cs="Times New Roman"/>
+          <w:b/>
           <w:lang w:val="en-GB"/>
         </w:rPr>
         <w:tab/>
       </w:r>
-    </w:p>
-    <w:p>
-      <w:pPr>
-        <w:ind w:left="1440"/>
-        <w:jc w:val="both"/>
-        <w:rPr>
-          <w:rFonts w:ascii="Times New Roman" w:hAnsi="Times New Roman" w:cs="Times New Roman"/>
-          <w:lang w:val="en-GB"/>
-        </w:rPr>
-      </w:pPr>
-      <w:r>
-        <w:rPr>
-          <w:rFonts w:ascii="Times New Roman" w:hAnsi="Times New Roman" w:cs="Times New Roman"/>
-          <w:b/>
-          <w:lang w:val="en-GB"/>
-        </w:rPr>
-        <w:t>EMseq_4_Filter.sh:</w:t>
-      </w:r>
-      <w:r>
-        <w:rPr>
-          <w:rFonts w:ascii="Times New Roman" w:hAnsi="Times New Roman" w:cs="Times New Roman"/>
-          <w:lang w:val="en-GB"/>
-        </w:rPr>
-        <w:t xml:space="preserve"> </w:t>
-      </w:r>
-      <w:r>
-        <w:t>downstream bioinformatic processing to eliminate cytosines with zero read coverage and performs the critical genomic classification into CA and CG contexts.</w:t>
-      </w:r>
-    </w:p>
-    <w:p>
-      <w:pPr>
-        <w:jc w:val="both"/>
-        <w:rPr>
-          <w:rFonts w:ascii="Times New Roman" w:hAnsi="Times New Roman" w:cs="Times New Roman"/>
-          <w:lang w:val="en-GB"/>
-        </w:rPr>
-      </w:pPr>
-    </w:p>
-    <w:p>
-      <w:pPr>
-        <w:jc w:val="both"/>
-        <w:rPr>
-          <w:rFonts w:ascii="Times New Roman" w:hAnsi="Times New Roman" w:cs="Times New Roman"/>
-          <w:b/>
-          <w:lang w:val="en-GB"/>
-        </w:rPr>
-      </w:pPr>
-      <w:r>
-        <w:rPr>
-          <w:rFonts w:ascii="Times New Roman" w:hAnsi="Times New Roman" w:cs="Times New Roman"/>
-          <w:lang w:val="en-GB"/>
-        </w:rPr>
-        <w:tab/>
-      </w:r>
-      <w:r>
-        <w:rPr>
-          <w:rFonts w:ascii="Times New Roman" w:hAnsi="Times New Roman" w:cs="Times New Roman"/>
-          <w:b/>
-          <w:lang w:val="en-GB"/>
-        </w:rPr>
-        <w:t>01_Single_end_files/</w:t>
-      </w:r>
-    </w:p>
-    <w:p>
-      <w:pPr>
-        <w:ind w:left="1440"/>
-        <w:jc w:val="both"/>
-        <w:rPr>
-          <w:rFonts w:ascii="Times New Roman" w:hAnsi="Times New Roman" w:cs="Times New Roman"/>
-          <w:lang w:val="en-GB"/>
-        </w:rPr>
-      </w:pPr>
-      <w:r>
-        <w:rPr>
-          <w:rFonts w:ascii="Times New Roman" w:hAnsi="Times New Roman" w:cs="Times New Roman"/>
-          <w:b/>
-          <w:lang w:val="en-GB"/>
-        </w:rPr>
-        <w:t>EMseq_1_FASTQ.sh:</w:t>
-      </w:r>
-      <w:r>
-        <w:rPr>
-          <w:rFonts w:ascii="Times New Roman" w:hAnsi="Times New Roman" w:cs="Times New Roman"/>
-          <w:lang w:val="en-GB"/>
-        </w:rPr>
-        <w:t xml:space="preserve"> initial read quality control using FASTQ</w:t>
-      </w:r>
-      <w:r>
-        <w:rPr>
-          <w:rFonts w:ascii="Times New Roman" w:hAnsi="Times New Roman" w:cs="Times New Roman"/>
-          <w:lang w:val="en-GB"/>
-        </w:rPr>
-        <w:t>C.</w:t>
-      </w:r>
-    </w:p>
-    <w:p>
-      <w:pPr>
-        <w:ind w:left="1440"/>
-        <w:jc w:val="both"/>
-        <w:rPr>
-          <w:rFonts w:ascii="Times New Roman" w:hAnsi="Times New Roman" w:cs="Times New Roman"/>
-          <w:lang w:val="en-GB"/>
-        </w:rPr>
-      </w:pPr>
-      <w:r>
-        <w:rPr>
-          <w:rFonts w:ascii="Times New Roman" w:hAnsi="Times New Roman" w:cs="Times New Roman"/>
-          <w:b/>
-          <w:lang w:val="en-GB"/>
-        </w:rPr>
-        <w:t>EMseq_2_Trim.sh:</w:t>
-      </w:r>
-      <w:r>
-        <w:rPr>
-          <w:rFonts w:ascii="Times New Roman" w:hAnsi="Times New Roman" w:cs="Times New Roman"/>
-          <w:lang w:val="en-GB"/>
-        </w:rPr>
-        <w:t xml:space="preserve"> adapter trimming via Trim Galore to ensure high-quality input.</w:t>
-      </w:r>
-    </w:p>
-    <w:p>
-      <w:pPr>
-        <w:ind w:left="1440"/>
-        <w:jc w:val="both"/>
-        <w:rPr>
-          <w:rFonts w:ascii="Times New Roman" w:hAnsi="Times New Roman" w:cs="Times New Roman"/>
-          <w:lang w:val="en-GB"/>
-        </w:rPr>
-      </w:pPr>
-      <w:r>
-        <w:rPr>
-          <w:rFonts w:ascii="Times New Roman" w:hAnsi="Times New Roman" w:cs="Times New Roman"/>
-          <w:b/>
-          <w:lang w:val="en-GB"/>
-        </w:rPr>
-        <w:t>EMseq_3_Bismark.sh:</w:t>
-      </w:r>
-      <w:r>
-        <w:rPr>
-          <w:rFonts w:ascii="Times New Roman" w:hAnsi="Times New Roman" w:cs="Times New Roman"/>
-          <w:lang w:val="en-GB"/>
-        </w:rPr>
-        <w:t xml:space="preserve"> </w:t>
-      </w:r>
-      <w:r>
-        <w:t xml:space="preserve">manages reference genome indexing, sequence alignment, and single-base resolution methylation calling for every cytosine using the </w:t>
-      </w:r>
-      <w:proofErr w:type="spellStart"/>
-      <w:r>
-        <w:t>Bismark</w:t>
-      </w:r>
-      <w:proofErr w:type="spellEnd"/>
-      <w:r>
-        <w:t xml:space="preserve"> pipeline.</w:t>
-      </w:r>
-      <w:r>
-        <w:rPr>
-          <w:rFonts w:ascii="Times New Roman" w:hAnsi="Times New Roman" w:cs="Times New Roman"/>
-          <w:lang w:val="en-GB"/>
-        </w:rPr>
-        <w:tab/>
-      </w:r>
-      <w:r>
-        <w:rPr>
-          <w:rFonts w:ascii="Times New Roman" w:hAnsi="Times New Roman" w:cs="Times New Roman"/>
-          <w:lang w:val="en-GB"/>
-        </w:rPr>
-        <w:tab/>
-      </w:r>
-    </w:p>
-    <w:p>
-      <w:pPr>
-        <w:ind w:left="1440"/>
-        <w:jc w:val="both"/>
-      </w:pPr>
-      <w:r>
-        <w:rPr>
-          <w:rFonts w:ascii="Times New Roman" w:hAnsi="Times New Roman" w:cs="Times New Roman"/>
-          <w:b/>
-          <w:lang w:val="en-GB"/>
-        </w:rPr>
-        <w:t>EMseq_4_Filter.sh:</w:t>
-      </w:r>
-      <w:r>
-        <w:rPr>
-          <w:rFonts w:ascii="Times New Roman" w:hAnsi="Times New Roman" w:cs="Times New Roman"/>
-          <w:lang w:val="en-GB"/>
-        </w:rPr>
-        <w:t xml:space="preserve"> </w:t>
-      </w:r>
-      <w:r>
-        <w:t>downstream bioinformatic processing to eliminate cytosines with zero read coverage and performs the critical genomic classification into CA and CG contexts.</w:t>
-      </w:r>
-    </w:p>
-    <w:p>
-      <w:pPr>
-        <w:jc w:val="both"/>
-        <w:rPr>
-          <w:rFonts w:ascii="Times New Roman" w:hAnsi="Times New Roman" w:cs="Times New Roman"/>
-          <w:lang w:val="en-GB"/>
-        </w:rPr>
-      </w:pPr>
-    </w:p>
-    <w:p>
-      <w:pPr>
-        <w:jc w:val="both"/>
-        <w:rPr>
-          <w:rFonts w:ascii="Times New Roman" w:hAnsi="Times New Roman" w:cs="Times New Roman"/>
-          <w:lang w:val="en-GB"/>
-        </w:rPr>
-      </w:pPr>
-      <w:r>
-        <w:rPr>
-          <w:rFonts w:ascii="Times New Roman" w:hAnsi="Times New Roman" w:cs="Times New Roman"/>
-          <w:b/>
-          <w:lang w:val="en-GB"/>
-        </w:rPr>
-        <w:t>02_CHIPseq_preprocessing_alignment/</w:t>
-      </w:r>
-      <w:r>
-        <w:rPr>
-          <w:rFonts w:ascii="Times New Roman" w:hAnsi="Times New Roman" w:cs="Times New Roman"/>
-          <w:lang w:val="en-GB"/>
-        </w:rPr>
-        <w:t xml:space="preserve"> </w:t>
-      </w:r>
-      <w:r>
-        <w:rPr>
-          <w:rFonts w:ascii="Times New Roman" w:hAnsi="Times New Roman" w:cs="Times New Roman"/>
-          <w:lang w:val="en-GB"/>
-        </w:rPr>
-        <w:t xml:space="preserve">contains the complete suite of scripts required to perform the raw data processing workflow and describes the systematic procedures for initial quality control (QC), adapter </w:t>
-      </w:r>
-      <w:proofErr w:type="spellStart"/>
-      <w:r>
-        <w:rPr>
-          <w:rFonts w:ascii="Times New Roman" w:hAnsi="Times New Roman" w:cs="Times New Roman"/>
-          <w:lang w:val="en-GB"/>
-        </w:rPr>
-        <w:t>trimmin</w:t>
-      </w:r>
-      <w:proofErr w:type="spellEnd"/>
-      <w:r>
-        <w:rPr>
-          <w:rFonts w:ascii="Times New Roman" w:hAnsi="Times New Roman" w:cs="Times New Roman"/>
-          <w:lang w:val="en-GB"/>
-        </w:rPr>
-        <w:t>, and reference genome indexing; it further includes scripts for sequence alignment to the reference genome for both paired-end and single-end libraries, followed by rigorous BAM file filtering and cleaning, and the final extraction of enriched genomic regions (peak calling) to identify protein-DNA interaction sites.</w:t>
-      </w:r>
-    </w:p>
-    <w:p>
-      <w:pPr>
-        <w:ind w:firstLine="720"/>
-        <w:jc w:val="both"/>
-        <w:rPr>
-          <w:rFonts w:ascii="Times New Roman" w:hAnsi="Times New Roman" w:cs="Times New Roman"/>
-          <w:b/>
-          <w:lang w:val="en-GB"/>
-        </w:rPr>
-      </w:pPr>
-      <w:r>
-        <w:rPr>
-          <w:rFonts w:ascii="Times New Roman" w:hAnsi="Times New Roman" w:cs="Times New Roman"/>
-          <w:b/>
-          <w:lang w:val="en-GB"/>
-        </w:rPr>
-        <w:lastRenderedPageBreak/>
-        <w:t>0</w:t>
-      </w:r>
-      <w:r>
-        <w:rPr>
-          <w:rFonts w:ascii="Times New Roman" w:hAnsi="Times New Roman" w:cs="Times New Roman"/>
-          <w:b/>
-          <w:lang w:val="en-GB"/>
-        </w:rPr>
-        <w:t>2</w:t>
-      </w:r>
-      <w:r>
-        <w:rPr>
-          <w:rFonts w:ascii="Times New Roman" w:hAnsi="Times New Roman" w:cs="Times New Roman"/>
-          <w:b/>
-          <w:lang w:val="en-GB"/>
-        </w:rPr>
-        <w:t>_Paired_end_files/</w:t>
-      </w:r>
-    </w:p>
-    <w:p>
-      <w:pPr>
-        <w:ind w:left="1440"/>
-        <w:jc w:val="both"/>
-        <w:rPr>
-          <w:rFonts w:ascii="Times New Roman" w:hAnsi="Times New Roman" w:cs="Times New Roman"/>
-          <w:lang w:val="en-GB"/>
-        </w:rPr>
-      </w:pPr>
-      <w:r>
-        <w:rPr>
-          <w:rFonts w:ascii="Times New Roman" w:hAnsi="Times New Roman" w:cs="Times New Roman"/>
-          <w:b/>
-          <w:lang w:val="en-GB"/>
-        </w:rPr>
-        <w:t>CHIP_1_Fastq.sh</w:t>
-      </w:r>
-      <w:r>
-        <w:rPr>
-          <w:rFonts w:ascii="Times New Roman" w:hAnsi="Times New Roman" w:cs="Times New Roman"/>
-          <w:b/>
-          <w:lang w:val="en-GB"/>
-        </w:rPr>
-        <w:t>:</w:t>
-      </w:r>
-      <w:r>
-        <w:rPr>
-          <w:rFonts w:ascii="Times New Roman" w:hAnsi="Times New Roman" w:cs="Times New Roman"/>
-          <w:lang w:val="en-GB"/>
-        </w:rPr>
-        <w:t xml:space="preserve"> </w:t>
-      </w:r>
-      <w:r>
-        <w:t>describes the initial read quality control using FASTQC and adapter trimming via Trim Galore to ensure high-quality read input</w:t>
-      </w:r>
-      <w:r>
-        <w:rPr>
-          <w:rFonts w:ascii="Times New Roman" w:hAnsi="Times New Roman" w:cs="Times New Roman"/>
-          <w:lang w:val="en-GB"/>
-        </w:rPr>
-        <w:t>.</w:t>
-      </w:r>
-    </w:p>
-    <w:p>
-      <w:pPr>
-        <w:ind w:left="1440"/>
-        <w:jc w:val="both"/>
-        <w:rPr>
-          <w:rFonts w:ascii="Times New Roman" w:hAnsi="Times New Roman" w:cs="Times New Roman"/>
-          <w:lang w:val="en-GB"/>
-        </w:rPr>
-      </w:pPr>
-      <w:r>
-        <w:rPr>
-          <w:rFonts w:ascii="Times New Roman" w:hAnsi="Times New Roman" w:cs="Times New Roman"/>
-          <w:b/>
-          <w:lang w:val="en-GB"/>
-        </w:rPr>
-        <w:t>CHIP_2_buildindex.sh</w:t>
-      </w:r>
-      <w:r>
-        <w:rPr>
-          <w:rFonts w:ascii="Times New Roman" w:hAnsi="Times New Roman" w:cs="Times New Roman"/>
-          <w:b/>
-          <w:lang w:val="en-GB"/>
-        </w:rPr>
-        <w:t>:</w:t>
-      </w:r>
-      <w:r>
-        <w:rPr>
-          <w:rFonts w:ascii="Times New Roman" w:hAnsi="Times New Roman" w:cs="Times New Roman"/>
-          <w:lang w:val="en-GB"/>
-        </w:rPr>
-        <w:t xml:space="preserve"> </w:t>
-      </w:r>
-      <w:r>
-        <w:t>contains the reference genome indexing procedure using the Bowtie2 alignment engine.</w:t>
-      </w:r>
-    </w:p>
-    <w:p>
-      <w:pPr>
-        <w:ind w:left="1440"/>
-        <w:jc w:val="both"/>
-        <w:rPr>
-          <w:rFonts w:ascii="Times New Roman" w:hAnsi="Times New Roman" w:cs="Times New Roman"/>
-          <w:lang w:val="en-GB"/>
-        </w:rPr>
-      </w:pPr>
-      <w:r>
-        <w:rPr>
-          <w:rFonts w:ascii="Times New Roman" w:hAnsi="Times New Roman" w:cs="Times New Roman"/>
-          <w:b/>
-          <w:lang w:val="en-GB"/>
-        </w:rPr>
-        <w:t>CHIP_3_align.sh</w:t>
-      </w:r>
-      <w:r>
-        <w:rPr>
-          <w:rFonts w:ascii="Times New Roman" w:hAnsi="Times New Roman" w:cs="Times New Roman"/>
-          <w:b/>
-          <w:lang w:val="en-GB"/>
-        </w:rPr>
-        <w:t>:</w:t>
-      </w:r>
-      <w:r>
-        <w:rPr>
-          <w:rFonts w:ascii="Times New Roman" w:hAnsi="Times New Roman" w:cs="Times New Roman"/>
-          <w:lang w:val="en-GB"/>
-        </w:rPr>
-        <w:t xml:space="preserve"> </w:t>
-      </w:r>
-      <w:r>
-        <w:t>describes the sequence alignment of processed reads to the reference genome using Bowtie2.</w:t>
-      </w:r>
-    </w:p>
-    <w:p>
-      <w:pPr>
-        <w:ind w:left="1440"/>
-        <w:jc w:val="both"/>
-        <w:rPr>
-          <w:rFonts w:ascii="Times New Roman" w:hAnsi="Times New Roman" w:cs="Times New Roman"/>
-          <w:lang w:val="en-GB"/>
-        </w:rPr>
-      </w:pPr>
-      <w:r>
-        <w:rPr>
-          <w:rFonts w:ascii="Times New Roman" w:hAnsi="Times New Roman" w:cs="Times New Roman"/>
-          <w:b/>
-          <w:lang w:val="en-GB"/>
-        </w:rPr>
-        <w:t>CHIP_4_stats_dup.sh</w:t>
-      </w:r>
-      <w:r>
-        <w:rPr>
-          <w:rFonts w:ascii="Times New Roman" w:hAnsi="Times New Roman" w:cs="Times New Roman"/>
-          <w:b/>
-          <w:lang w:val="en-GB"/>
-        </w:rPr>
-        <w:t>:</w:t>
-      </w:r>
-      <w:r>
-        <w:rPr>
-          <w:rFonts w:ascii="Times New Roman" w:hAnsi="Times New Roman" w:cs="Times New Roman"/>
-          <w:lang w:val="en-GB"/>
-        </w:rPr>
-        <w:t xml:space="preserve"> </w:t>
-      </w:r>
-      <w:r>
-        <w:t>contains the duplicate removal process using Picard to improve library complexity and reduce PCR bias.</w:t>
-      </w:r>
-    </w:p>
-    <w:p>
-      <w:pPr>
-        <w:ind w:left="1440"/>
-        <w:jc w:val="both"/>
-        <w:rPr>
-          <w:rFonts w:ascii="Times New Roman" w:hAnsi="Times New Roman" w:cs="Times New Roman"/>
-          <w:lang w:val="en-GB"/>
-        </w:rPr>
-      </w:pPr>
-      <w:r>
-        <w:rPr>
-          <w:rFonts w:ascii="Times New Roman" w:hAnsi="Times New Roman" w:cs="Times New Roman"/>
-          <w:b/>
-          <w:lang w:val="en-GB"/>
-        </w:rPr>
-        <w:t>CHIP_5_filter_bam.sh:</w:t>
-      </w:r>
-      <w:r>
-        <w:rPr>
-          <w:rFonts w:ascii="Times New Roman" w:hAnsi="Times New Roman" w:cs="Times New Roman"/>
-          <w:lang w:val="en-GB"/>
-        </w:rPr>
-        <w:t xml:space="preserve"> </w:t>
-      </w:r>
-      <w:r>
-        <w:t>describes the rigorous filtering of BAM files to retain high-confidence, unique alignments.</w:t>
-      </w:r>
-    </w:p>
-    <w:p>
-      <w:pPr>
-        <w:ind w:left="1440"/>
-        <w:jc w:val="both"/>
-        <w:rPr>
-          <w:rFonts w:ascii="Times New Roman" w:hAnsi="Times New Roman" w:cs="Times New Roman"/>
-          <w:lang w:val="en-GB"/>
-        </w:rPr>
-      </w:pPr>
-      <w:r>
-        <w:rPr>
-          <w:rFonts w:ascii="Times New Roman" w:hAnsi="Times New Roman" w:cs="Times New Roman"/>
-          <w:b/>
-          <w:lang w:val="en-GB"/>
-        </w:rPr>
-        <w:t>CHIP_6_peakcalling.sh</w:t>
-      </w:r>
-      <w:r>
-        <w:rPr>
-          <w:rFonts w:ascii="Times New Roman" w:hAnsi="Times New Roman" w:cs="Times New Roman"/>
-          <w:b/>
-          <w:lang w:val="en-GB"/>
-        </w:rPr>
-        <w:t>:</w:t>
-      </w:r>
-      <w:r>
-        <w:rPr>
-          <w:rFonts w:ascii="Times New Roman" w:hAnsi="Times New Roman" w:cs="Times New Roman"/>
-          <w:lang w:val="en-GB"/>
-        </w:rPr>
-        <w:t xml:space="preserve"> </w:t>
-      </w:r>
-      <w:r>
-        <w:t>contains the final extraction of protein-binding enriched regions (peak calling) for both single-end and paired-end datasets using the epic2 pipeline.</w:t>
-      </w:r>
-    </w:p>
-    <w:p>
-      <w:pPr>
-        <w:ind w:left="1440"/>
-        <w:jc w:val="both"/>
-        <w:rPr>
-          <w:rFonts w:ascii="Times New Roman" w:hAnsi="Times New Roman" w:cs="Times New Roman"/>
-          <w:lang w:val="en-GB"/>
-        </w:rPr>
-      </w:pPr>
-    </w:p>
-    <w:p>
-      <w:pPr>
-        <w:jc w:val="both"/>
-        <w:rPr>
-          <w:rFonts w:ascii="Times New Roman" w:hAnsi="Times New Roman" w:cs="Times New Roman"/>
-          <w:b/>
-          <w:lang w:val="en-GB"/>
-        </w:rPr>
-      </w:pPr>
-      <w:r>
-        <w:rPr>
-          <w:rFonts w:ascii="Times New Roman" w:hAnsi="Times New Roman" w:cs="Times New Roman"/>
-          <w:lang w:val="en-GB"/>
-        </w:rPr>
-        <w:tab/>
-      </w:r>
-      <w:r>
-        <w:rPr>
-          <w:rFonts w:ascii="Times New Roman" w:hAnsi="Times New Roman" w:cs="Times New Roman"/>
-          <w:b/>
-          <w:lang w:val="en-GB"/>
-        </w:rPr>
-        <w:t>0</w:t>
-      </w:r>
-      <w:r>
-        <w:rPr>
-          <w:rFonts w:ascii="Times New Roman" w:hAnsi="Times New Roman" w:cs="Times New Roman"/>
-          <w:b/>
-          <w:lang w:val="en-GB"/>
-        </w:rPr>
-        <w:t>2</w:t>
-      </w:r>
-      <w:r>
-        <w:rPr>
-          <w:rFonts w:ascii="Times New Roman" w:hAnsi="Times New Roman" w:cs="Times New Roman"/>
-          <w:b/>
-          <w:lang w:val="en-GB"/>
-        </w:rPr>
-        <w:t>_Single_end_files/</w:t>
-      </w:r>
-    </w:p>
-    <w:p>
-      <w:pPr>
-        <w:ind w:left="1440"/>
-        <w:jc w:val="both"/>
-        <w:rPr>
-          <w:rFonts w:ascii="Times New Roman" w:hAnsi="Times New Roman" w:cs="Times New Roman"/>
-          <w:lang w:val="en-GB"/>
-        </w:rPr>
-      </w:pPr>
-      <w:r>
-        <w:rPr>
-          <w:rFonts w:ascii="Times New Roman" w:hAnsi="Times New Roman" w:cs="Times New Roman"/>
-          <w:b/>
-          <w:lang w:val="en-GB"/>
-        </w:rPr>
-        <w:t>CHIP_1_Fastq.sh</w:t>
-      </w:r>
-      <w:r>
-        <w:rPr>
-          <w:rFonts w:ascii="Times New Roman" w:hAnsi="Times New Roman" w:cs="Times New Roman"/>
-          <w:lang w:val="en-GB"/>
-        </w:rPr>
-        <w:t xml:space="preserve">: </w:t>
-      </w:r>
-      <w:r>
-        <w:t>describes the initial read quality control using FASTQC and adapter trimming via Trim Galore to ensure high-quality read input</w:t>
-      </w:r>
-      <w:r>
-        <w:rPr>
-          <w:rFonts w:ascii="Times New Roman" w:hAnsi="Times New Roman" w:cs="Times New Roman"/>
-          <w:lang w:val="en-GB"/>
-        </w:rPr>
-        <w:t>.</w:t>
-      </w:r>
-    </w:p>
-    <w:p>
-      <w:pPr>
-        <w:ind w:left="1440"/>
-        <w:jc w:val="both"/>
-        <w:rPr>
-          <w:rFonts w:ascii="Times New Roman" w:hAnsi="Times New Roman" w:cs="Times New Roman"/>
-          <w:lang w:val="en-GB"/>
-        </w:rPr>
-      </w:pPr>
-      <w:r>
-        <w:rPr>
-          <w:rFonts w:ascii="Times New Roman" w:hAnsi="Times New Roman" w:cs="Times New Roman"/>
-          <w:b/>
-          <w:lang w:val="en-GB"/>
-        </w:rPr>
-        <w:t>CHIP_2_buildindex.sh:</w:t>
-      </w:r>
-      <w:r>
-        <w:rPr>
-          <w:rFonts w:ascii="Times New Roman" w:hAnsi="Times New Roman" w:cs="Times New Roman"/>
-          <w:lang w:val="en-GB"/>
-        </w:rPr>
-        <w:t xml:space="preserve"> </w:t>
-      </w:r>
-      <w:r>
-        <w:t>contains the reference genome indexing procedure using the Bowtie2 alignment engine.</w:t>
-      </w:r>
-    </w:p>
-    <w:p>
-      <w:pPr>
-        <w:ind w:left="1440"/>
-        <w:jc w:val="both"/>
-        <w:rPr>
-          <w:rFonts w:ascii="Times New Roman" w:hAnsi="Times New Roman" w:cs="Times New Roman"/>
-          <w:lang w:val="en-GB"/>
-        </w:rPr>
-      </w:pPr>
-      <w:r>
-        <w:rPr>
-          <w:rFonts w:ascii="Times New Roman" w:hAnsi="Times New Roman" w:cs="Times New Roman"/>
-          <w:b/>
-          <w:lang w:val="en-GB"/>
-        </w:rPr>
-        <w:t>CHIP_3_align.sh:</w:t>
-      </w:r>
-      <w:r>
-        <w:rPr>
-          <w:rFonts w:ascii="Times New Roman" w:hAnsi="Times New Roman" w:cs="Times New Roman"/>
-          <w:lang w:val="en-GB"/>
-        </w:rPr>
-        <w:t xml:space="preserve"> </w:t>
-      </w:r>
-      <w:r>
-        <w:t>describes the sequence alignment of processed reads to the reference genome using Bowtie2.</w:t>
-      </w:r>
-    </w:p>
-    <w:p>
-      <w:pPr>
-        <w:ind w:left="1440"/>
-        <w:jc w:val="both"/>
-        <w:rPr>
-          <w:rFonts w:ascii="Times New Roman" w:hAnsi="Times New Roman" w:cs="Times New Roman"/>
-          <w:lang w:val="en-GB"/>
-        </w:rPr>
-      </w:pPr>
-      <w:r>
-        <w:rPr>
-          <w:rFonts w:ascii="Times New Roman" w:hAnsi="Times New Roman" w:cs="Times New Roman"/>
-          <w:b/>
-          <w:lang w:val="en-GB"/>
-        </w:rPr>
-        <w:t>CHIP_4_stats_dup.sh:</w:t>
-      </w:r>
-      <w:r>
-        <w:rPr>
-          <w:rFonts w:ascii="Times New Roman" w:hAnsi="Times New Roman" w:cs="Times New Roman"/>
-          <w:lang w:val="en-GB"/>
-        </w:rPr>
-        <w:t xml:space="preserve"> </w:t>
-      </w:r>
-      <w:r>
-        <w:t>contains the duplicate removal process using Picard to improve library complexity and reduce PCR bias.</w:t>
-      </w:r>
-    </w:p>
-    <w:p>
-      <w:pPr>
-        <w:ind w:left="1440"/>
-        <w:jc w:val="both"/>
-        <w:rPr>
-          <w:rFonts w:ascii="Times New Roman" w:hAnsi="Times New Roman" w:cs="Times New Roman"/>
-          <w:lang w:val="en-GB"/>
-        </w:rPr>
-      </w:pPr>
-      <w:r>
-        <w:rPr>
-          <w:rFonts w:ascii="Times New Roman" w:hAnsi="Times New Roman" w:cs="Times New Roman"/>
-          <w:b/>
-          <w:lang w:val="en-GB"/>
-        </w:rPr>
-        <w:t>CHIP_5_filter_bam.sh:</w:t>
-      </w:r>
-      <w:r>
-        <w:rPr>
-          <w:rFonts w:ascii="Times New Roman" w:hAnsi="Times New Roman" w:cs="Times New Roman"/>
-          <w:lang w:val="en-GB"/>
-        </w:rPr>
-        <w:t xml:space="preserve"> </w:t>
-      </w:r>
-      <w:r>
-        <w:t>describes the rigorous filtering of BAM files to retain high-confidence, unique alignments.</w:t>
-      </w:r>
-    </w:p>
-    <w:p>
-      <w:pPr>
-        <w:ind w:left="1440"/>
-        <w:jc w:val="both"/>
-      </w:pPr>
-      <w:r>
-        <w:rPr>
-          <w:rFonts w:ascii="Times New Roman" w:hAnsi="Times New Roman" w:cs="Times New Roman"/>
-          <w:b/>
-          <w:lang w:val="en-GB"/>
-        </w:rPr>
-        <w:t>CHIP_6_peakcalling.sh:</w:t>
-      </w:r>
-      <w:r>
-        <w:rPr>
-          <w:rFonts w:ascii="Times New Roman" w:hAnsi="Times New Roman" w:cs="Times New Roman"/>
-          <w:lang w:val="en-GB"/>
-        </w:rPr>
-        <w:t xml:space="preserve"> </w:t>
-      </w:r>
-      <w:r>
-        <w:t>contains the final extraction of protein-binding enriched regions (peak calling) for both single-end and paired-end datasets using the epic2 pipeline.</w:t>
-      </w:r>
-    </w:p>
-    <w:p>
-      <w:pPr>
-        <w:jc w:val="both"/>
-        <w:rPr>
-          <w:rFonts w:ascii="Times New Roman" w:hAnsi="Times New Roman" w:cs="Times New Roman"/>
-          <w:lang w:val="en-GB"/>
-        </w:rPr>
-      </w:pPr>
-    </w:p>
-    <w:p>
-      <w:pPr>
-        <w:jc w:val="both"/>
-        <w:rPr>
-          <w:rFonts w:ascii="Times New Roman" w:hAnsi="Times New Roman" w:cs="Times New Roman"/>
-          <w:lang w:val="en-GB"/>
-        </w:rPr>
-      </w:pPr>
-      <w:r>
-        <w:rPr>
-          <w:rFonts w:ascii="Times New Roman" w:hAnsi="Times New Roman" w:cs="Times New Roman"/>
-          <w:b/>
-          <w:lang w:val="en-GB"/>
-        </w:rPr>
-        <w:t>03_Figures/</w:t>
-      </w:r>
-      <w:r>
-        <w:rPr>
-          <w:rFonts w:ascii="Times New Roman" w:hAnsi="Times New Roman" w:cs="Times New Roman"/>
-          <w:lang w:val="en-GB"/>
-        </w:rPr>
-        <w:t xml:space="preserve"> </w:t>
-      </w:r>
-      <w:r>
-        <w:t>contains the complete set of R scripts required to perform the core statistical analyses of this study and describes the procedures used to generate all high-resolution figures presented in the manuscript</w:t>
-      </w:r>
-      <w:r>
-        <w:rPr>
-          <w:rFonts w:ascii="Times New Roman" w:hAnsi="Times New Roman" w:cs="Times New Roman"/>
-          <w:lang w:val="en-GB"/>
-        </w:rPr>
-        <w:t xml:space="preserve">. </w:t>
-      </w:r>
-    </w:p>
-    <w:p>
-      <w:pPr>
-        <w:jc w:val="both"/>
-        <w:rPr>
-          <w:rFonts w:ascii="Times New Roman" w:hAnsi="Times New Roman" w:cs="Times New Roman"/>
-          <w:lang w:val="en-GB"/>
-        </w:rPr>
-      </w:pPr>
-      <w:r>
-        <w:rPr>
-          <w:rFonts w:ascii="Times New Roman" w:hAnsi="Times New Roman" w:cs="Times New Roman"/>
-          <w:lang w:val="en-GB"/>
-        </w:rPr>
-        <w:tab/>
-      </w:r>
-      <w:r>
-        <w:rPr>
-          <w:rFonts w:ascii="Times New Roman" w:hAnsi="Times New Roman" w:cs="Times New Roman"/>
-          <w:lang w:val="en-GB"/>
-        </w:rPr>
-        <w:tab/>
-      </w:r>
-    </w:p>
-    <w:p>
-      <w:pPr>
-        <w:ind w:left="720"/>
-        <w:jc w:val="both"/>
-        <w:rPr>
-          <w:rFonts w:ascii="Times New Roman" w:hAnsi="Times New Roman" w:cs="Times New Roman"/>
-          <w:lang w:val="en-GB"/>
-        </w:rPr>
-      </w:pPr>
-      <w:r>
-        <w:rPr>
-          <w:rFonts w:ascii="Times New Roman" w:hAnsi="Times New Roman" w:cs="Times New Roman"/>
-          <w:b/>
-          <w:lang w:val="en-GB"/>
-        </w:rPr>
-        <w:t>Figure1/</w:t>
-      </w:r>
-      <w:r>
-        <w:rPr>
-          <w:rFonts w:ascii="Times New Roman" w:hAnsi="Times New Roman" w:cs="Times New Roman"/>
-          <w:lang w:val="en-GB"/>
-        </w:rPr>
-        <w:t xml:space="preserve"> </w:t>
-      </w:r>
-      <w:r>
-        <w:t>contains the specialized scripts used to execute the analyses and generate the visualizations corresponding to Figure 1</w:t>
-      </w:r>
-      <w:r>
-        <w:rPr>
-          <w:rFonts w:ascii="Times New Roman" w:hAnsi="Times New Roman" w:cs="Times New Roman"/>
-          <w:lang w:val="en-GB"/>
-        </w:rPr>
-        <w:t>:</w:t>
-      </w:r>
-    </w:p>
-    <w:p>
-      <w:pPr>
-        <w:jc w:val="both"/>
-        <w:rPr>
-          <w:rFonts w:ascii="Times New Roman" w:hAnsi="Times New Roman" w:cs="Times New Roman"/>
-          <w:lang w:val="en-GB"/>
-        </w:rPr>
-      </w:pPr>
-      <w:r>
-        <w:rPr>
-          <w:rFonts w:ascii="Times New Roman" w:hAnsi="Times New Roman" w:cs="Times New Roman"/>
-          <w:lang w:val="en-GB"/>
-        </w:rPr>
-        <w:tab/>
-      </w:r>
-      <w:r>
-        <w:rPr>
-          <w:rFonts w:ascii="Times New Roman" w:hAnsi="Times New Roman" w:cs="Times New Roman"/>
-          <w:lang w:val="en-GB"/>
-        </w:rPr>
-        <w:tab/>
-      </w:r>
-    </w:p>
-    <w:p>
-      <w:pPr>
-        <w:ind w:left="1440"/>
-        <w:jc w:val="both"/>
-      </w:pPr>
-      <w:r>
-        <w:rPr>
-          <w:rFonts w:ascii="Times New Roman" w:hAnsi="Times New Roman" w:cs="Times New Roman"/>
-          <w:b/>
-          <w:lang w:val="en-GB"/>
-        </w:rPr>
-        <w:t>Figure1a/</w:t>
-      </w:r>
-      <w:r>
-        <w:rPr>
-          <w:rFonts w:ascii="Times New Roman" w:hAnsi="Times New Roman" w:cs="Times New Roman"/>
-          <w:b/>
-          <w:lang w:val="en-GB"/>
-        </w:rPr>
-        <w:t>:</w:t>
-      </w:r>
-      <w:r>
-        <w:rPr>
-          <w:rFonts w:ascii="Times New Roman" w:hAnsi="Times New Roman" w:cs="Times New Roman"/>
-          <w:lang w:val="en-GB"/>
-        </w:rPr>
-        <w:t xml:space="preserve"> </w:t>
-      </w:r>
-      <w:r>
-        <w:t xml:space="preserve">describes the initial identification of the </w:t>
-      </w:r>
-      <w:proofErr w:type="spellStart"/>
-      <w:r>
-        <w:t>CoM</w:t>
-      </w:r>
-      <w:proofErr w:type="spellEnd"/>
-      <w:r>
-        <w:t xml:space="preserve"> landscape, including:</w:t>
-      </w:r>
-    </w:p>
-    <w:p>
-      <w:pPr>
-        <w:ind w:left="2160"/>
-        <w:jc w:val="both"/>
-      </w:pPr>
-      <w:r>
-        <w:rPr>
-          <w:rFonts w:ascii="Times New Roman" w:hAnsi="Times New Roman" w:cs="Times New Roman"/>
-          <w:b/>
-          <w:lang w:val="en-GB"/>
-        </w:rPr>
-        <w:t>01_distanceCoM.R</w:t>
-      </w:r>
-      <w:r>
-        <w:rPr>
-          <w:rFonts w:ascii="Times New Roman" w:hAnsi="Times New Roman" w:cs="Times New Roman"/>
-          <w:lang w:val="en-GB"/>
-        </w:rPr>
-        <w:t>:</w:t>
-      </w:r>
-      <w:r>
-        <w:rPr>
-          <w:rFonts w:ascii="Times New Roman" w:hAnsi="Times New Roman" w:cs="Times New Roman"/>
-          <w:lang w:val="en-GB"/>
-        </w:rPr>
-        <w:t xml:space="preserve"> </w:t>
-      </w:r>
-      <w:r>
-        <w:t xml:space="preserve">estimates the optimal genomic distance for coupling between </w:t>
-      </w:r>
-      <w:proofErr w:type="spellStart"/>
-      <w:r>
-        <w:t>mCA</w:t>
-      </w:r>
-      <w:proofErr w:type="spellEnd"/>
-      <w:r>
-        <w:t xml:space="preserve"> and </w:t>
-      </w:r>
-      <w:proofErr w:type="spellStart"/>
-      <w:r>
-        <w:t>mCG</w:t>
-      </w:r>
-      <w:proofErr w:type="spellEnd"/>
-      <w:r>
-        <w:t xml:space="preserve"> sites.</w:t>
-      </w:r>
-    </w:p>
-    <w:p>
-      <w:pPr>
-        <w:ind w:left="2160"/>
-        <w:jc w:val="both"/>
-        <w:rPr>
-          <w:rFonts w:ascii="Times New Roman" w:hAnsi="Times New Roman" w:cs="Times New Roman"/>
-          <w:lang w:val="en-GB"/>
-        </w:rPr>
-      </w:pPr>
-      <w:r>
-        <w:rPr>
-          <w:rFonts w:ascii="Times New Roman" w:hAnsi="Times New Roman" w:cs="Times New Roman"/>
-          <w:b/>
-          <w:lang w:val="en-GB"/>
-        </w:rPr>
-        <w:t>02_common_</w:t>
-      </w:r>
-      <w:proofErr w:type="gramStart"/>
-      <w:r>
-        <w:rPr>
-          <w:rFonts w:ascii="Times New Roman" w:hAnsi="Times New Roman" w:cs="Times New Roman"/>
-          <w:b/>
-          <w:lang w:val="en-GB"/>
-        </w:rPr>
-        <w:t>windows.R</w:t>
-      </w:r>
-      <w:proofErr w:type="gramEnd"/>
-      <w:r>
-        <w:rPr>
-          <w:rFonts w:ascii="Times New Roman" w:hAnsi="Times New Roman" w:cs="Times New Roman"/>
-          <w:b/>
-          <w:lang w:val="en-GB"/>
-        </w:rPr>
-        <w:t>:</w:t>
-      </w:r>
-      <w:r>
-        <w:rPr>
-          <w:rFonts w:ascii="Times New Roman" w:hAnsi="Times New Roman" w:cs="Times New Roman"/>
-          <w:lang w:val="en-GB"/>
-        </w:rPr>
-        <w:t xml:space="preserve"> </w:t>
-      </w:r>
-      <w:r>
-        <w:t>contains the logic to identify consensus genomic windows across the entire study dataset.</w:t>
-      </w:r>
-    </w:p>
-    <w:p>
-      <w:pPr>
-        <w:ind w:left="2160"/>
-        <w:jc w:val="both"/>
-        <w:rPr>
-          <w:rFonts w:ascii="Times New Roman" w:hAnsi="Times New Roman" w:cs="Times New Roman"/>
-          <w:lang w:val="en-GB"/>
-        </w:rPr>
-      </w:pPr>
-      <w:r>
-        <w:rPr>
-          <w:rFonts w:ascii="Times New Roman" w:hAnsi="Times New Roman" w:cs="Times New Roman"/>
-          <w:b/>
-          <w:lang w:val="en-GB"/>
-        </w:rPr>
-        <w:t>03_Correlation.R:</w:t>
-      </w:r>
-      <w:r>
-        <w:rPr>
-          <w:rFonts w:ascii="Times New Roman" w:hAnsi="Times New Roman" w:cs="Times New Roman"/>
-          <w:lang w:val="en-GB"/>
-        </w:rPr>
-        <w:t xml:space="preserve"> </w:t>
-      </w:r>
-      <w:r>
-        <w:t>describes the calculation of CA-CG correlations, statistical metrics, and absolute methylation levels.</w:t>
-      </w:r>
-    </w:p>
-    <w:p>
-      <w:pPr>
-        <w:ind w:left="2160"/>
-        <w:jc w:val="both"/>
-      </w:pPr>
-      <w:r>
-        <w:rPr>
-          <w:rFonts w:ascii="Times New Roman" w:hAnsi="Times New Roman" w:cs="Times New Roman"/>
-          <w:b/>
-          <w:lang w:val="en-GB"/>
-        </w:rPr>
-        <w:t>04_Correlation_</w:t>
-      </w:r>
-      <w:proofErr w:type="gramStart"/>
-      <w:r>
-        <w:rPr>
-          <w:rFonts w:ascii="Times New Roman" w:hAnsi="Times New Roman" w:cs="Times New Roman"/>
-          <w:b/>
-          <w:lang w:val="en-GB"/>
-        </w:rPr>
-        <w:t>plots.R</w:t>
-      </w:r>
-      <w:proofErr w:type="gramEnd"/>
-      <w:r>
-        <w:rPr>
-          <w:rFonts w:ascii="Times New Roman" w:hAnsi="Times New Roman" w:cs="Times New Roman"/>
-          <w:b/>
-          <w:lang w:val="en-GB"/>
-        </w:rPr>
-        <w:t>:</w:t>
-      </w:r>
-      <w:r>
-        <w:rPr>
-          <w:rFonts w:ascii="Times New Roman" w:hAnsi="Times New Roman" w:cs="Times New Roman"/>
-          <w:lang w:val="en-GB"/>
-        </w:rPr>
-        <w:t xml:space="preserve"> </w:t>
-      </w:r>
-      <w:r>
-        <w:t>contains the scripts for generating CA-CG correlation visualizations.</w:t>
-      </w:r>
-    </w:p>
-    <w:p>
-      <w:pPr>
-        <w:ind w:left="2160"/>
-        <w:jc w:val="both"/>
-        <w:rPr>
-          <w:rFonts w:ascii="Times New Roman" w:hAnsi="Times New Roman" w:cs="Times New Roman"/>
-        </w:rPr>
-      </w:pPr>
-    </w:p>
-    <w:p>
-      <w:pPr>
-        <w:jc w:val="both"/>
-        <w:rPr>
-          <w:rFonts w:ascii="Times New Roman" w:hAnsi="Times New Roman" w:cs="Times New Roman"/>
-          <w:b/>
-          <w:lang w:val="en-GB"/>
-        </w:rPr>
-      </w:pPr>
-      <w:r>
-        <w:rPr>
-          <w:rFonts w:ascii="Times New Roman" w:hAnsi="Times New Roman" w:cs="Times New Roman"/>
-          <w:lang w:val="en-GB"/>
-        </w:rPr>
-        <w:lastRenderedPageBreak/>
-        <w:tab/>
-      </w:r>
-      <w:r>
-        <w:rPr>
-          <w:rFonts w:ascii="Times New Roman" w:hAnsi="Times New Roman" w:cs="Times New Roman"/>
-          <w:b/>
-          <w:lang w:val="en-GB"/>
-        </w:rPr>
-        <w:tab/>
+      <w:r>
+        <w:rPr>
+          <w:rFonts w:ascii="Times New Roman" w:hAnsi="Times New Roman" w:cs="Times New Roman"/>
+          <w:b/>
+          <w:lang w:val="en-GB"/>
+        </w:rPr>
         <w:t>Figure1b/</w:t>
       </w:r>
     </w:p>
@@ -2068,10 +1975,7 @@
         <w:t xml:space="preserve"> </w:t>
       </w:r>
       <w:r>
-        <w:t>describes the generation of age-associated methylation slope plots derived from individual biological samples</w:t>
-      </w:r>
-      <w:r>
-        <w:t>.</w:t>
+        <w:t>describes the generation of age-associated methylation slope plots derived from individual biological samples.</w:t>
       </w:r>
     </w:p>
     <w:p>
@@ -2568,10 +2472,7 @@
         <w:t xml:space="preserve"> </w:t>
       </w:r>
       <w:r>
-        <w:t xml:space="preserve">contains the specialized scripts used to execute the analyses and generate the visualizations corresponding to Figure </w:t>
-      </w:r>
-      <w:r>
-        <w:t>2</w:t>
+        <w:t>contains the specialized scripts used to execute the analyses and generate the visualizations corresponding to Figure 2</w:t>
       </w:r>
       <w:r>
         <w:rPr>
@@ -2988,6 +2889,7 @@
           <w:b/>
           <w:lang w:val="en-GB"/>
         </w:rPr>
+        <w:lastRenderedPageBreak/>
         <w:t>01_Enrich_</w:t>
       </w:r>
       <w:proofErr w:type="gramStart"/>
@@ -3046,7 +2948,6 @@
           <w:b/>
           <w:lang w:val="en-GB"/>
         </w:rPr>
-        <w:lastRenderedPageBreak/>
         <w:t>02_Aging_Map_Permutations.R</w:t>
       </w:r>
       <w:r>
@@ -3225,10 +3126,7 @@
         <w:t xml:space="preserve"> </w:t>
       </w:r>
       <w:r>
-        <w:t xml:space="preserve">contains the specialized scripts used to execute the analyses and generate the visualizations corresponding to Figure </w:t>
-      </w:r>
-      <w:r>
-        <w:t>3</w:t>
+        <w:t>contains the specialized scripts used to execute the analyses and generate the visualizations corresponding to Figure 3</w:t>
       </w:r>
       <w:r>
         <w:rPr>
@@ -3417,10 +3315,7 @@
       </w:r>
       <w:proofErr w:type="spellEnd"/>
       <w:r>
-        <w:t>-</w:t>
-      </w:r>
-      <w:r>
-        <w:t xml:space="preserve"> genes using array-based transcriptomic data.</w:t>
+        <w:t>- genes using array-based transcriptomic data.</w:t>
       </w:r>
     </w:p>
     <w:p>
@@ -3600,10 +3495,7 @@
       </w:r>
       <w:proofErr w:type="spellEnd"/>
       <w:r>
-        <w:t>-</w:t>
-      </w:r>
-      <w:r>
-        <w:t xml:space="preserve"> gene sets.</w:t>
+        <w:t>- gene sets.</w:t>
       </w:r>
     </w:p>
     <w:p>
@@ -3646,10 +3538,7 @@
         <w:t xml:space="preserve"> </w:t>
       </w:r>
       <w:r>
-        <w:t xml:space="preserve">contains the specialized scripts used to execute the analyses and generate the visualizations corresponding to Figure </w:t>
-      </w:r>
-      <w:r>
-        <w:t>4</w:t>
+        <w:t>contains the specialized scripts used to execute the analyses and generate the visualizations corresponding to Figure 4</w:t>
       </w:r>
       <w:r>
         <w:rPr>
@@ -3997,6 +3886,7 @@
           <w:b/>
           <w:lang w:val="en-GB"/>
         </w:rPr>
+        <w:lastRenderedPageBreak/>
         <w:t>03_Correlation.R:</w:t>
       </w:r>
       <w:r>
@@ -4021,7 +3911,6 @@
           <w:b/>
           <w:lang w:val="en-GB"/>
         </w:rPr>
-        <w:lastRenderedPageBreak/>
         <w:t>04_Correlation_</w:t>
       </w:r>
       <w:proofErr w:type="gramStart"/>
@@ -4421,15 +4310,7 @@
           <w:b/>
           <w:lang w:val="en-GB"/>
         </w:rPr>
-        <w:t xml:space="preserve"> </w:t>
-      </w:r>
-      <w:r>
-        <w:rPr>
-          <w:rFonts w:ascii="Times New Roman" w:hAnsi="Times New Roman" w:cs="Times New Roman"/>
-          <w:b/>
-          <w:lang w:val="en-GB"/>
-        </w:rPr>
-        <w:t>09_CAC_motif_zebrafish.R</w:t>
+        <w:t xml:space="preserve"> 09_CAC_motif_zebrafish.R</w:t>
       </w:r>
       <w:r>
         <w:rPr>
@@ -4452,10 +4333,7 @@
         <w:t>contain</w:t>
       </w:r>
       <w:r>
-        <w:t xml:space="preserve"> the optimized pipeline for CAC motif discovery across the evolutionary spectrum (Human, Chicken, Chimp, Frog, Mouse, Platypus, Shark, and Zebrafish). </w:t>
-      </w:r>
-      <w:r>
-        <w:t>I</w:t>
+        <w:t xml:space="preserve"> the optimized pipeline for CAC motif discovery across the evolutionary spectrum (Human, Chicken, Chimp, Frog, Mouse, Platypus, Shark, and Zebrafish). I</w:t>
       </w:r>
       <w:r>
         <w:rPr>
@@ -4634,10 +4512,7 @@
       </w:r>
       <w:proofErr w:type="spellStart"/>
       <w:r>
-        <w:t>Figure</w:t>
-      </w:r>
-      <w:r>
-        <w:t>Supplementary</w:t>
+        <w:t>FigureSupplementary</w:t>
       </w:r>
       <w:proofErr w:type="spellEnd"/>
       <w:r>
@@ -4663,7 +4538,7 @@
         <w:rPr>
           <w:rFonts w:ascii="Times New Roman" w:hAnsi="Times New Roman" w:cs="Times New Roman"/>
           <w:b/>
-          <w:lang w:val="es-ES"/>
+          <w:lang w:val="en-GB"/>
         </w:rPr>
       </w:pPr>
       <w:r>
@@ -4684,7 +4559,7 @@
         <w:rPr>
           <w:rFonts w:ascii="Times New Roman" w:hAnsi="Times New Roman" w:cs="Times New Roman"/>
           <w:b/>
-          <w:lang w:val="es-ES"/>
+          <w:lang w:val="en-GB"/>
         </w:rPr>
         <w:t>Figure1/</w:t>
       </w:r>
@@ -4896,6 +4771,7 @@
           <w:b/>
           <w:lang w:val="en-GB"/>
         </w:rPr>
+        <w:lastRenderedPageBreak/>
         <w:t>01_distanceCoM.R</w:t>
       </w:r>
       <w:r>
@@ -4940,7 +4816,6 @@
           <w:b/>
           <w:lang w:val="en-GB"/>
         </w:rPr>
-        <w:lastRenderedPageBreak/>
         <w:t>02_common_</w:t>
       </w:r>
       <w:proofErr w:type="gramStart"/>
@@ -5093,8 +4968,6 @@
         <w:ind w:left="2160"/>
         <w:jc w:val="both"/>
       </w:pPr>
-      <w:bookmarkStart w:id="0" w:name="_GoBack"/>
-      <w:bookmarkEnd w:id="0"/>
       <w:r>
         <w:rPr>
           <w:rFonts w:ascii="Times New Roman" w:hAnsi="Times New Roman" w:cs="Times New Roman"/>
@@ -5656,7 +5529,7 @@
         <w:rPr>
           <w:rFonts w:ascii="Times New Roman" w:hAnsi="Times New Roman" w:cs="Times New Roman"/>
           <w:b/>
-          <w:lang w:val="es-ES"/>
+          <w:lang w:val="en-GB"/>
         </w:rPr>
       </w:pPr>
       <w:r>
@@ -5678,7 +5551,7 @@
         <w:rPr>
           <w:rFonts w:ascii="Times New Roman" w:hAnsi="Times New Roman" w:cs="Times New Roman"/>
           <w:b/>
-          <w:lang w:val="es-ES"/>
+          <w:lang w:val="en-GB"/>
         </w:rPr>
         <w:t>Figure6/</w:t>
       </w:r>

</xml_diff>

<commit_message>
Update license and project files
</commit_message>
<xml_diff>
--- a/Readme.docx
+++ b/Readme.docx
@@ -1,6 +1,6 @@
 
 <file path=word/document.xml><?xml version="1.0" encoding="utf-8"?>
-<w:document xmlns:o="urn:schemas-microsoft-com:office:office" xmlns:r="http://schemas.openxmlformats.org/officeDocument/2006/relationships" xmlns:v="urn:schemas-microsoft-com:vml" xmlns:w="http://schemas.openxmlformats.org/wordprocessingml/2006/main" xmlns:w10="urn:schemas-microsoft-com:office:word" xmlns:wp="http://schemas.openxmlformats.org/drawingml/2006/wordprocessingDrawing" xmlns:pic="http://schemas.openxmlformats.org/drawingml/2006/picture" xmlns:wps="http://schemas.microsoft.com/office/word/2010/wordprocessingShape" xmlns:wpg="http://schemas.microsoft.com/office/word/2010/wordprocessingGroup" xmlns:mc="http://schemas.openxmlformats.org/markup-compatibility/2006" xmlns:wp14="http://schemas.microsoft.com/office/word/2010/wordprocessingDrawing" xmlns:w14="http://schemas.microsoft.com/office/word/2010/wordml" xmlns:w15="http://schemas.microsoft.com/office/word/2012/wordml" mc:Ignorable="w14 wp14 w15">
+<w:document xmlns:o="urn:schemas-microsoft-com:office:office" xmlns:r="http://schemas.openxmlformats.org/officeDocument/2006/relationships" xmlns:v="urn:schemas-microsoft-com:vml" xmlns:w="http://schemas.openxmlformats.org/wordprocessingml/2006/main" xmlns:w10="urn:schemas-microsoft-com:office:word" xmlns:wp="http://schemas.openxmlformats.org/drawingml/2006/wordprocessingDrawing" xmlns:wps="http://schemas.microsoft.com/office/word/2010/wordprocessingShape" xmlns:wpg="http://schemas.microsoft.com/office/word/2010/wordprocessingGroup" xmlns:mc="http://schemas.openxmlformats.org/markup-compatibility/2006" xmlns:wp14="http://schemas.microsoft.com/office/word/2010/wordprocessingDrawing" xmlns:w14="http://schemas.microsoft.com/office/word/2010/wordml" xmlns:w15="http://schemas.microsoft.com/office/word/2012/wordml" mc:Ignorable="w14 wp14 w15">
   <w:body>
     <w:p>
       <w:pPr>
@@ -811,7 +811,7 @@
     <w:p>
       <w:pPr>
         <w:pStyle w:val="Normal"/>
-        <w:ind w:start="709"/>
+        <w:ind w:left="709"/>
         <w:jc w:val="both"/>
         <w:rPr>
           <w:rFonts w:ascii="Times New Roman" w:hAnsi="Times New Roman" w:cs="Times New Roman"/>
@@ -834,7 +834,7 @@
     <w:p>
       <w:pPr>
         <w:pStyle w:val="Normal"/>
-        <w:ind w:start="709"/>
+        <w:ind w:left="709"/>
         <w:jc w:val="both"/>
         <w:rPr>
           <w:rFonts w:ascii="Times New Roman" w:hAnsi="Times New Roman" w:cs="Times New Roman"/>
@@ -857,7 +857,7 @@
     <w:p>
       <w:pPr>
         <w:pStyle w:val="Normal"/>
-        <w:ind w:start="709"/>
+        <w:ind w:left="709"/>
         <w:jc w:val="both"/>
         <w:rPr>
           <w:rFonts w:ascii="Times New Roman" w:hAnsi="Times New Roman" w:cs="Times New Roman"/>
@@ -895,7 +895,7 @@
     <w:p>
       <w:pPr>
         <w:pStyle w:val="Normal"/>
-        <w:ind w:start="709"/>
+        <w:ind w:left="709"/>
         <w:jc w:val="both"/>
         <w:rPr>
           <w:rFonts w:ascii="Times New Roman" w:hAnsi="Times New Roman" w:cs="Times New Roman"/>
@@ -1005,7 +1005,7 @@
     <w:p>
       <w:pPr>
         <w:pStyle w:val="Normal"/>
-        <w:ind w:start="1440"/>
+        <w:ind w:left="1440"/>
         <w:jc w:val="both"/>
         <w:rPr>
           <w:rFonts w:ascii="Times New Roman" w:hAnsi="Times New Roman" w:cs="Times New Roman"/>
@@ -1031,7 +1031,7 @@
     <w:p>
       <w:pPr>
         <w:pStyle w:val="Normal"/>
-        <w:ind w:start="1440"/>
+        <w:ind w:left="1440"/>
         <w:jc w:val="both"/>
         <w:rPr>
           <w:rFonts w:ascii="Times New Roman" w:hAnsi="Times New Roman" w:cs="Times New Roman"/>
@@ -1057,7 +1057,7 @@
     <w:p>
       <w:pPr>
         <w:pStyle w:val="Normal"/>
-        <w:ind w:start="1440"/>
+        <w:ind w:left="1440"/>
         <w:jc w:val="both"/>
         <w:rPr>
           <w:rFonts w:ascii="Times New Roman" w:hAnsi="Times New Roman" w:cs="Times New Roman"/>
@@ -1095,7 +1095,7 @@
     <w:p>
       <w:pPr>
         <w:pStyle w:val="Normal"/>
-        <w:ind w:start="1440"/>
+        <w:ind w:left="1440"/>
         <w:jc w:val="both"/>
         <w:rPr>
           <w:rFonts w:ascii="Times New Roman" w:hAnsi="Times New Roman" w:cs="Times New Roman"/>
@@ -1167,7 +1167,7 @@
     <w:p>
       <w:pPr>
         <w:pStyle w:val="Normal"/>
-        <w:ind w:start="1440"/>
+        <w:ind w:left="1440"/>
         <w:jc w:val="both"/>
         <w:rPr>
           <w:rFonts w:ascii="Times New Roman" w:hAnsi="Times New Roman" w:cs="Times New Roman"/>
@@ -1193,7 +1193,7 @@
     <w:p>
       <w:pPr>
         <w:pStyle w:val="Normal"/>
-        <w:ind w:start="1440"/>
+        <w:ind w:left="1440"/>
         <w:jc w:val="both"/>
         <w:rPr>
           <w:rFonts w:ascii="Times New Roman" w:hAnsi="Times New Roman" w:cs="Times New Roman"/>
@@ -1219,7 +1219,7 @@
     <w:p>
       <w:pPr>
         <w:pStyle w:val="Normal"/>
-        <w:ind w:start="1440"/>
+        <w:ind w:left="1440"/>
         <w:jc w:val="both"/>
         <w:rPr>
           <w:rFonts w:ascii="Times New Roman" w:hAnsi="Times New Roman" w:cs="Times New Roman"/>
@@ -1257,7 +1257,7 @@
     <w:p>
       <w:pPr>
         <w:pStyle w:val="Normal"/>
-        <w:ind w:start="1440"/>
+        <w:ind w:left="1440"/>
         <w:jc w:val="both"/>
         <w:rPr/>
       </w:pPr>
@@ -1345,7 +1345,7 @@
     <w:p>
       <w:pPr>
         <w:pStyle w:val="Normal"/>
-        <w:ind w:start="1440"/>
+        <w:ind w:left="1440"/>
         <w:jc w:val="both"/>
         <w:rPr>
           <w:rFonts w:ascii="Times New Roman" w:hAnsi="Times New Roman" w:cs="Times New Roman"/>
@@ -1382,7 +1382,7 @@
     <w:p>
       <w:pPr>
         <w:pStyle w:val="Normal"/>
-        <w:ind w:start="1440"/>
+        <w:ind w:left="1440"/>
         <w:jc w:val="both"/>
         <w:rPr>
           <w:rFonts w:ascii="Times New Roman" w:hAnsi="Times New Roman" w:cs="Times New Roman"/>
@@ -1412,7 +1412,7 @@
     <w:p>
       <w:pPr>
         <w:pStyle w:val="Normal"/>
-        <w:ind w:start="1440"/>
+        <w:ind w:left="1440"/>
         <w:jc w:val="both"/>
         <w:rPr>
           <w:rFonts w:ascii="Times New Roman" w:hAnsi="Times New Roman" w:cs="Times New Roman"/>
@@ -1442,7 +1442,7 @@
     <w:p>
       <w:pPr>
         <w:pStyle w:val="Normal"/>
-        <w:ind w:start="1440"/>
+        <w:ind w:left="1440"/>
         <w:jc w:val="both"/>
         <w:rPr>
           <w:rFonts w:ascii="Times New Roman" w:hAnsi="Times New Roman" w:cs="Times New Roman"/>
@@ -1472,7 +1472,7 @@
     <w:p>
       <w:pPr>
         <w:pStyle w:val="Normal"/>
-        <w:ind w:start="1440"/>
+        <w:ind w:left="1440"/>
         <w:jc w:val="both"/>
         <w:rPr>
           <w:rFonts w:ascii="Times New Roman" w:hAnsi="Times New Roman" w:cs="Times New Roman"/>
@@ -1502,7 +1502,7 @@
     <w:p>
       <w:pPr>
         <w:pStyle w:val="Normal"/>
-        <w:ind w:start="1440"/>
+        <w:ind w:left="1440"/>
         <w:jc w:val="both"/>
         <w:rPr>
           <w:rFonts w:ascii="Times New Roman" w:hAnsi="Times New Roman" w:cs="Times New Roman"/>
@@ -1532,7 +1532,7 @@
     <w:p>
       <w:pPr>
         <w:pStyle w:val="Normal"/>
-        <w:ind w:start="1440"/>
+        <w:ind w:left="1440"/>
         <w:jc w:val="both"/>
         <w:rPr>
           <w:rFonts w:ascii="Times New Roman" w:hAnsi="Times New Roman" w:cs="Times New Roman"/>
@@ -1575,7 +1575,7 @@
     <w:p>
       <w:pPr>
         <w:pStyle w:val="Normal"/>
-        <w:ind w:start="1440"/>
+        <w:ind w:left="1440"/>
         <w:jc w:val="both"/>
         <w:rPr>
           <w:rFonts w:ascii="Times New Roman" w:hAnsi="Times New Roman" w:cs="Times New Roman"/>
@@ -1612,7 +1612,7 @@
     <w:p>
       <w:pPr>
         <w:pStyle w:val="Normal"/>
-        <w:ind w:start="1440"/>
+        <w:ind w:left="1440"/>
         <w:jc w:val="both"/>
         <w:rPr>
           <w:rFonts w:ascii="Times New Roman" w:hAnsi="Times New Roman" w:cs="Times New Roman"/>
@@ -1642,7 +1642,7 @@
     <w:p>
       <w:pPr>
         <w:pStyle w:val="Normal"/>
-        <w:ind w:start="1440"/>
+        <w:ind w:left="1440"/>
         <w:jc w:val="both"/>
         <w:rPr>
           <w:rFonts w:ascii="Times New Roman" w:hAnsi="Times New Roman" w:cs="Times New Roman"/>
@@ -1672,7 +1672,7 @@
     <w:p>
       <w:pPr>
         <w:pStyle w:val="Normal"/>
-        <w:ind w:start="1440"/>
+        <w:ind w:left="1440"/>
         <w:jc w:val="both"/>
         <w:rPr>
           <w:rFonts w:ascii="Times New Roman" w:hAnsi="Times New Roman" w:cs="Times New Roman"/>
@@ -1702,7 +1702,7 @@
     <w:p>
       <w:pPr>
         <w:pStyle w:val="Normal"/>
-        <w:ind w:start="1440"/>
+        <w:ind w:left="1440"/>
         <w:jc w:val="both"/>
         <w:rPr>
           <w:rFonts w:ascii="Times New Roman" w:hAnsi="Times New Roman" w:cs="Times New Roman"/>
@@ -1732,7 +1732,7 @@
     <w:p>
       <w:pPr>
         <w:pStyle w:val="Normal"/>
-        <w:ind w:start="1440"/>
+        <w:ind w:left="1440"/>
         <w:jc w:val="both"/>
         <w:rPr/>
       </w:pPr>
@@ -1829,7 +1829,7 @@
     <w:p>
       <w:pPr>
         <w:pStyle w:val="Normal"/>
-        <w:ind w:start="720"/>
+        <w:ind w:left="720"/>
         <w:jc w:val="both"/>
         <w:rPr>
           <w:rFonts w:ascii="Times New Roman" w:hAnsi="Times New Roman" w:cs="Times New Roman"/>
@@ -1884,7 +1884,7 @@
     <w:p>
       <w:pPr>
         <w:pStyle w:val="Normal"/>
-        <w:ind w:start="1440"/>
+        <w:ind w:left="1440"/>
         <w:jc w:val="both"/>
         <w:rPr/>
       </w:pPr>
@@ -1911,7 +1911,7 @@
     <w:p>
       <w:pPr>
         <w:pStyle w:val="Normal"/>
-        <w:ind w:start="2160"/>
+        <w:ind w:left="2160"/>
         <w:jc w:val="both"/>
         <w:rPr/>
       </w:pPr>
@@ -1938,7 +1938,7 @@
     <w:p>
       <w:pPr>
         <w:pStyle w:val="Normal"/>
-        <w:ind w:start="2160"/>
+        <w:ind w:left="2160"/>
         <w:jc w:val="both"/>
         <w:rPr>
           <w:rFonts w:ascii="Times New Roman" w:hAnsi="Times New Roman" w:cs="Times New Roman"/>
@@ -1968,7 +1968,7 @@
     <w:p>
       <w:pPr>
         <w:pStyle w:val="Normal"/>
-        <w:ind w:start="2160"/>
+        <w:ind w:left="2160"/>
         <w:jc w:val="both"/>
         <w:rPr>
           <w:rFonts w:ascii="Times New Roman" w:hAnsi="Times New Roman" w:cs="Times New Roman"/>
@@ -1998,7 +1998,7 @@
     <w:p>
       <w:pPr>
         <w:pStyle w:val="Normal"/>
-        <w:ind w:start="2160"/>
+        <w:ind w:left="2160"/>
         <w:jc w:val="both"/>
         <w:rPr/>
       </w:pPr>
@@ -2025,7 +2025,7 @@
     <w:p>
       <w:pPr>
         <w:pStyle w:val="Normal"/>
-        <w:ind w:start="2160"/>
+        <w:ind w:left="2160"/>
         <w:jc w:val="both"/>
         <w:rPr>
           <w:b/>
@@ -2047,7 +2047,7 @@
     <w:p>
       <w:pPr>
         <w:pStyle w:val="Normal"/>
-        <w:ind w:start="2160"/>
+        <w:ind w:left="2160"/>
         <w:jc w:val="both"/>
         <w:rPr/>
       </w:pPr>
@@ -2077,18 +2077,18 @@
     <w:p>
       <w:pPr>
         <w:pStyle w:val="Normal"/>
-        <w:ind w:start="2160"/>
-        <w:jc w:val="both"/>
-        <w:rPr/>
-      </w:pPr>
-      <w:r>
-        <w:rPr/>
-      </w:r>
-    </w:p>
-    <w:p>
-      <w:pPr>
-        <w:pStyle w:val="Normal"/>
-        <w:ind w:start="2160"/>
+        <w:ind w:left="2160"/>
+        <w:jc w:val="both"/>
+        <w:rPr/>
+      </w:pPr>
+      <w:r>
+        <w:rPr/>
+      </w:r>
+    </w:p>
+    <w:p>
+      <w:pPr>
+        <w:pStyle w:val="Normal"/>
+        <w:ind w:left="2160"/>
         <w:jc w:val="both"/>
         <w:rPr>
           <w:rFonts w:ascii="Times New Roman" w:hAnsi="Times New Roman" w:cs="Times New Roman"/>
@@ -2130,7 +2130,7 @@
     <w:p>
       <w:pPr>
         <w:pStyle w:val="Normal"/>
-        <w:ind w:start="2160"/>
+        <w:ind w:left="2160"/>
         <w:jc w:val="both"/>
         <w:rPr/>
       </w:pPr>
@@ -2157,7 +2157,7 @@
     <w:p>
       <w:pPr>
         <w:pStyle w:val="Normal"/>
-        <w:ind w:start="2160"/>
+        <w:ind w:left="2160"/>
         <w:jc w:val="both"/>
         <w:rPr>
           <w:rFonts w:ascii="Times New Roman" w:hAnsi="Times New Roman" w:cs="Times New Roman"/>
@@ -2206,7 +2206,7 @@
     <w:p>
       <w:pPr>
         <w:pStyle w:val="Normal"/>
-        <w:ind w:start="2160"/>
+        <w:ind w:left="2160"/>
         <w:jc w:val="both"/>
         <w:rPr>
           <w:rFonts w:ascii="Times New Roman" w:hAnsi="Times New Roman" w:cs="Times New Roman"/>
@@ -2236,7 +2236,7 @@
     <w:p>
       <w:pPr>
         <w:pStyle w:val="Normal"/>
-        <w:ind w:start="2160"/>
+        <w:ind w:left="2160"/>
         <w:jc w:val="both"/>
         <w:rPr/>
       </w:pPr>
@@ -2263,22 +2263,22 @@
     <w:p>
       <w:pPr>
         <w:pStyle w:val="Normal"/>
-        <w:ind w:start="2160"/>
-        <w:jc w:val="both"/>
-        <w:rPr>
-          <w:rFonts w:ascii="Times New Roman" w:hAnsi="Times New Roman" w:cs="Times New Roman"/>
-        </w:rPr>
-      </w:pPr>
-      <w:r>
-        <w:rPr>
-          <w:rFonts w:cs="Times New Roman" w:ascii="Times New Roman" w:hAnsi="Times New Roman"/>
-        </w:rPr>
-      </w:r>
-    </w:p>
-    <w:p>
-      <w:pPr>
-        <w:pStyle w:val="Normal"/>
-        <w:ind w:start="1440"/>
+        <w:ind w:left="2160"/>
+        <w:jc w:val="both"/>
+        <w:rPr>
+          <w:rFonts w:ascii="Times New Roman" w:hAnsi="Times New Roman" w:cs="Times New Roman"/>
+        </w:rPr>
+      </w:pPr>
+      <w:r>
+        <w:rPr>
+          <w:rFonts w:cs="Times New Roman" w:ascii="Times New Roman" w:hAnsi="Times New Roman"/>
+        </w:rPr>
+      </w:r>
+    </w:p>
+    <w:p>
+      <w:pPr>
+        <w:pStyle w:val="Normal"/>
+        <w:ind w:left="1440"/>
         <w:jc w:val="both"/>
         <w:rPr>
           <w:rFonts w:ascii="Times New Roman" w:hAnsi="Times New Roman" w:cs="Times New Roman"/>
@@ -2302,7 +2302,7 @@
     <w:p>
       <w:pPr>
         <w:pStyle w:val="Normal"/>
-        <w:ind w:start="2160"/>
+        <w:ind w:left="2160"/>
         <w:jc w:val="both"/>
         <w:rPr>
           <w:rFonts w:ascii="Times New Roman" w:hAnsi="Times New Roman" w:cs="Times New Roman"/>
@@ -2332,7 +2332,7 @@
     <w:p>
       <w:pPr>
         <w:pStyle w:val="Normal"/>
-        <w:ind w:start="2160"/>
+        <w:ind w:left="2160"/>
         <w:jc w:val="both"/>
         <w:rPr>
           <w:rFonts w:ascii="Times New Roman" w:hAnsi="Times New Roman" w:cs="Times New Roman"/>
@@ -2358,7 +2358,7 @@
     <w:p>
       <w:pPr>
         <w:pStyle w:val="Normal"/>
-        <w:ind w:start="2160"/>
+        <w:ind w:left="2160"/>
         <w:jc w:val="both"/>
         <w:rPr/>
       </w:pPr>
@@ -2385,7 +2385,7 @@
     <w:p>
       <w:pPr>
         <w:pStyle w:val="Normal"/>
-        <w:ind w:start="2160"/>
+        <w:ind w:left="2160"/>
         <w:jc w:val="both"/>
         <w:rPr>
           <w:rFonts w:ascii="Times New Roman" w:hAnsi="Times New Roman" w:cs="Times New Roman"/>
@@ -2429,7 +2429,7 @@
     <w:p>
       <w:pPr>
         <w:pStyle w:val="Normal"/>
-        <w:ind w:start="2160"/>
+        <w:ind w:left="2160"/>
         <w:jc w:val="both"/>
         <w:rPr>
           <w:rFonts w:ascii="Times New Roman" w:hAnsi="Times New Roman" w:cs="Times New Roman"/>
@@ -2562,7 +2562,7 @@
     <w:p>
       <w:pPr>
         <w:pStyle w:val="Normal"/>
-        <w:ind w:start="2160"/>
+        <w:ind w:left="2160"/>
         <w:jc w:val="both"/>
         <w:rPr>
           <w:rFonts w:ascii="Times New Roman" w:hAnsi="Times New Roman" w:cs="Times New Roman"/>
@@ -2608,7 +2608,7 @@
     <w:p>
       <w:pPr>
         <w:pStyle w:val="Normal"/>
-        <w:ind w:start="1440"/>
+        <w:ind w:left="1440"/>
         <w:jc w:val="both"/>
         <w:rPr>
           <w:rFonts w:ascii="Times New Roman" w:hAnsi="Times New Roman" w:cs="Times New Roman"/>
@@ -2632,7 +2632,7 @@
     <w:p>
       <w:pPr>
         <w:pStyle w:val="Normal"/>
-        <w:ind w:start="2160"/>
+        <w:ind w:left="2160"/>
         <w:jc w:val="both"/>
         <w:rPr>
           <w:rFonts w:ascii="Times New Roman" w:hAnsi="Times New Roman" w:cs="Times New Roman"/>
@@ -2658,7 +2658,7 @@
     <w:p>
       <w:pPr>
         <w:pStyle w:val="Normal"/>
-        <w:ind w:start="2160"/>
+        <w:ind w:left="2160"/>
         <w:jc w:val="both"/>
         <w:rPr>
           <w:rFonts w:ascii="Times New Roman" w:hAnsi="Times New Roman" w:cs="Times New Roman"/>
@@ -2684,7 +2684,7 @@
     <w:p>
       <w:pPr>
         <w:pStyle w:val="Normal"/>
-        <w:ind w:start="2160"/>
+        <w:ind w:left="2160"/>
         <w:jc w:val="both"/>
         <w:rPr>
           <w:rFonts w:ascii="Times New Roman" w:hAnsi="Times New Roman" w:cs="Times New Roman"/>
@@ -2710,7 +2710,7 @@
     <w:p>
       <w:pPr>
         <w:pStyle w:val="Normal"/>
-        <w:ind w:start="2160"/>
+        <w:ind w:left="2160"/>
         <w:jc w:val="both"/>
         <w:rPr>
           <w:rFonts w:ascii="Times New Roman" w:hAnsi="Times New Roman" w:cs="Times New Roman"/>
@@ -2770,7 +2770,7 @@
           <w:tab w:val="left" w:pos="2160" w:leader="none"/>
           <w:tab w:val="left" w:pos="2772" w:leader="none"/>
         </w:tabs>
-        <w:ind w:start="2160"/>
+        <w:ind w:left="2160"/>
         <w:jc w:val="both"/>
         <w:rPr>
           <w:rFonts w:ascii="Times New Roman" w:hAnsi="Times New Roman" w:cs="Times New Roman"/>
@@ -2817,7 +2817,7 @@
           <w:tab w:val="left" w:pos="2160" w:leader="none"/>
           <w:tab w:val="left" w:pos="2772" w:leader="none"/>
         </w:tabs>
-        <w:ind w:start="2160"/>
+        <w:ind w:left="2160"/>
         <w:jc w:val="both"/>
         <w:rPr/>
       </w:pPr>
@@ -2850,7 +2850,7 @@
           <w:tab w:val="left" w:pos="2160" w:leader="none"/>
           <w:tab w:val="left" w:pos="2772" w:leader="none"/>
         </w:tabs>
-        <w:ind w:start="2160"/>
+        <w:ind w:left="2160"/>
         <w:jc w:val="both"/>
         <w:rPr>
           <w:rFonts w:ascii="Times New Roman" w:hAnsi="Times New Roman" w:cs="Times New Roman"/>
@@ -2892,7 +2892,7 @@
     <w:p>
       <w:pPr>
         <w:pStyle w:val="Normal"/>
-        <w:ind w:start="2160"/>
+        <w:ind w:left="2160"/>
         <w:jc w:val="both"/>
         <w:rPr>
           <w:rFonts w:ascii="Times New Roman" w:hAnsi="Times New Roman" w:cs="Times New Roman"/>
@@ -3024,7 +3024,7 @@
     <w:p>
       <w:pPr>
         <w:pStyle w:val="Normal"/>
-        <w:ind w:start="2160"/>
+        <w:ind w:left="2160"/>
         <w:jc w:val="both"/>
         <w:rPr/>
       </w:pPr>
@@ -3051,7 +3051,7 @@
     <w:p>
       <w:pPr>
         <w:pStyle w:val="Normal"/>
-        <w:ind w:start="2160"/>
+        <w:ind w:left="2160"/>
         <w:jc w:val="both"/>
         <w:rPr>
           <w:rFonts w:ascii="Times New Roman" w:hAnsi="Times New Roman" w:cs="Times New Roman"/>
@@ -3093,7 +3093,7 @@
     <w:p>
       <w:pPr>
         <w:pStyle w:val="Normal"/>
-        <w:ind w:start="2160"/>
+        <w:ind w:left="2160"/>
         <w:jc w:val="both"/>
         <w:rPr/>
       </w:pPr>
@@ -3120,7 +3120,7 @@
     <w:p>
       <w:pPr>
         <w:pStyle w:val="Normal"/>
-        <w:ind w:start="2160"/>
+        <w:ind w:left="2160"/>
         <w:jc w:val="both"/>
         <w:rPr>
           <w:rFonts w:ascii="Times New Roman" w:hAnsi="Times New Roman" w:cs="Times New Roman"/>
@@ -3164,7 +3164,7 @@
     <w:p>
       <w:pPr>
         <w:pStyle w:val="Normal"/>
-        <w:ind w:start="2160"/>
+        <w:ind w:left="2160"/>
         <w:jc w:val="both"/>
         <w:rPr/>
       </w:pPr>
@@ -3191,7 +3191,7 @@
     <w:p>
       <w:pPr>
         <w:pStyle w:val="Normal"/>
-        <w:ind w:start="2160"/>
+        <w:ind w:left="2160"/>
         <w:jc w:val="both"/>
         <w:rPr>
           <w:rFonts w:ascii="Times New Roman" w:hAnsi="Times New Roman" w:cs="Times New Roman"/>
@@ -3235,7 +3235,7 @@
     <w:p>
       <w:pPr>
         <w:pStyle w:val="Normal"/>
-        <w:ind w:start="2160"/>
+        <w:ind w:left="2160"/>
         <w:jc w:val="both"/>
         <w:rPr>
           <w:rFonts w:ascii="Times New Roman" w:hAnsi="Times New Roman" w:cs="Times New Roman"/>
@@ -3367,7 +3367,7 @@
     <w:p>
       <w:pPr>
         <w:pStyle w:val="Normal"/>
-        <w:ind w:start="2160"/>
+        <w:ind w:left="2160"/>
         <w:jc w:val="both"/>
         <w:rPr/>
       </w:pPr>
@@ -3394,7 +3394,7 @@
     <w:p>
       <w:pPr>
         <w:pStyle w:val="Normal"/>
-        <w:ind w:start="2160"/>
+        <w:ind w:left="2160"/>
         <w:jc w:val="both"/>
         <w:rPr>
           <w:rFonts w:ascii="Times New Roman" w:hAnsi="Times New Roman" w:cs="Times New Roman"/>
@@ -3424,7 +3424,7 @@
     <w:p>
       <w:pPr>
         <w:pStyle w:val="Normal"/>
-        <w:ind w:start="2160"/>
+        <w:ind w:left="2160"/>
         <w:jc w:val="both"/>
         <w:rPr>
           <w:rFonts w:ascii="Times New Roman" w:hAnsi="Times New Roman" w:cs="Times New Roman"/>
@@ -3454,7 +3454,7 @@
     <w:p>
       <w:pPr>
         <w:pStyle w:val="Normal"/>
-        <w:ind w:start="2160"/>
+        <w:ind w:left="2160"/>
         <w:jc w:val="both"/>
         <w:rPr/>
       </w:pPr>
@@ -3522,7 +3522,7 @@
     <w:p>
       <w:pPr>
         <w:pStyle w:val="Normal"/>
-        <w:ind w:start="2160"/>
+        <w:ind w:left="2160"/>
         <w:jc w:val="both"/>
         <w:rPr/>
       </w:pPr>
@@ -3549,7 +3549,7 @@
     <w:p>
       <w:pPr>
         <w:pStyle w:val="Normal"/>
-        <w:ind w:start="2160"/>
+        <w:ind w:left="2160"/>
         <w:jc w:val="both"/>
         <w:rPr>
           <w:rFonts w:ascii="Times New Roman" w:hAnsi="Times New Roman" w:cs="Times New Roman"/>
@@ -3579,7 +3579,7 @@
     <w:p>
       <w:pPr>
         <w:pStyle w:val="Normal"/>
-        <w:ind w:start="2160"/>
+        <w:ind w:left="2160"/>
         <w:jc w:val="both"/>
         <w:rPr>
           <w:rFonts w:ascii="Times New Roman" w:hAnsi="Times New Roman" w:cs="Times New Roman"/>
@@ -3609,7 +3609,7 @@
     <w:p>
       <w:pPr>
         <w:pStyle w:val="Normal"/>
-        <w:ind w:start="2160"/>
+        <w:ind w:left="2160"/>
         <w:jc w:val="both"/>
         <w:rPr/>
       </w:pPr>
@@ -3677,7 +3677,7 @@
     <w:p>
       <w:pPr>
         <w:pStyle w:val="Normal"/>
-        <w:ind w:start="2160"/>
+        <w:ind w:left="2160"/>
         <w:jc w:val="both"/>
         <w:rPr/>
       </w:pPr>
@@ -3704,7 +3704,7 @@
     <w:p>
       <w:pPr>
         <w:pStyle w:val="Normal"/>
-        <w:ind w:start="2160"/>
+        <w:ind w:left="2160"/>
         <w:jc w:val="both"/>
         <w:rPr>
           <w:rFonts w:ascii="Times New Roman" w:hAnsi="Times New Roman" w:cs="Times New Roman"/>
@@ -3746,7 +3746,7 @@
     <w:p>
       <w:pPr>
         <w:pStyle w:val="Normal"/>
-        <w:ind w:start="2160"/>
+        <w:ind w:left="2160"/>
         <w:jc w:val="both"/>
         <w:rPr/>
       </w:pPr>
@@ -3816,7 +3816,7 @@
     <w:p>
       <w:pPr>
         <w:pStyle w:val="Normal"/>
-        <w:ind w:start="2160"/>
+        <w:ind w:left="2160"/>
         <w:jc w:val="both"/>
         <w:rPr/>
       </w:pPr>
@@ -3843,24 +3843,24 @@
     <w:p>
       <w:pPr>
         <w:pStyle w:val="Normal"/>
-        <w:ind w:start="2160"/>
-        <w:jc w:val="both"/>
-        <w:rPr>
-          <w:rFonts w:ascii="Times New Roman" w:hAnsi="Times New Roman" w:cs="Times New Roman"/>
-          <w:lang w:val="en-GB"/>
-        </w:rPr>
-      </w:pPr>
-      <w:r>
-        <w:rPr>
-          <w:rFonts w:cs="Times New Roman" w:ascii="Times New Roman" w:hAnsi="Times New Roman"/>
-          <w:lang w:val="en-GB"/>
-        </w:rPr>
-      </w:r>
-    </w:p>
-    <w:p>
-      <w:pPr>
-        <w:pStyle w:val="Normal"/>
-        <w:ind w:start="1440"/>
+        <w:ind w:left="2160"/>
+        <w:jc w:val="both"/>
+        <w:rPr>
+          <w:rFonts w:ascii="Times New Roman" w:hAnsi="Times New Roman" w:cs="Times New Roman"/>
+          <w:lang w:val="en-GB"/>
+        </w:rPr>
+      </w:pPr>
+      <w:r>
+        <w:rPr>
+          <w:rFonts w:cs="Times New Roman" w:ascii="Times New Roman" w:hAnsi="Times New Roman"/>
+          <w:lang w:val="en-GB"/>
+        </w:rPr>
+      </w:r>
+    </w:p>
+    <w:p>
+      <w:pPr>
+        <w:pStyle w:val="Normal"/>
+        <w:ind w:left="1440"/>
         <w:jc w:val="both"/>
         <w:rPr>
           <w:rFonts w:ascii="Times New Roman" w:hAnsi="Times New Roman" w:cs="Times New Roman"/>
@@ -3884,7 +3884,7 @@
     <w:p>
       <w:pPr>
         <w:pStyle w:val="Normal"/>
-        <w:ind w:start="2160"/>
+        <w:ind w:left="2160"/>
         <w:jc w:val="both"/>
         <w:rPr>
           <w:rFonts w:ascii="Times New Roman" w:hAnsi="Times New Roman" w:cs="Times New Roman"/>
@@ -3914,7 +3914,7 @@
     <w:p>
       <w:pPr>
         <w:pStyle w:val="Normal"/>
-        <w:ind w:start="2160"/>
+        <w:ind w:left="2160"/>
         <w:jc w:val="both"/>
         <w:rPr>
           <w:rFonts w:ascii="Times New Roman" w:hAnsi="Times New Roman" w:cs="Times New Roman"/>
@@ -3969,7 +3969,7 @@
     <w:p>
       <w:pPr>
         <w:pStyle w:val="Normal"/>
-        <w:ind w:start="2160"/>
+        <w:ind w:left="2160"/>
         <w:jc w:val="both"/>
         <w:rPr>
           <w:rFonts w:ascii="Times New Roman" w:hAnsi="Times New Roman" w:cs="Times New Roman"/>
@@ -4039,24 +4039,24 @@
     <w:p>
       <w:pPr>
         <w:pStyle w:val="Normal"/>
-        <w:ind w:start="2160"/>
-        <w:jc w:val="both"/>
-        <w:rPr>
-          <w:rFonts w:ascii="Times New Roman" w:hAnsi="Times New Roman" w:cs="Times New Roman"/>
-          <w:lang w:val="en-GB"/>
-        </w:rPr>
-      </w:pPr>
-      <w:r>
-        <w:rPr>
-          <w:rFonts w:cs="Times New Roman" w:ascii="Times New Roman" w:hAnsi="Times New Roman"/>
-          <w:lang w:val="en-GB"/>
-        </w:rPr>
-      </w:r>
-    </w:p>
-    <w:p>
-      <w:pPr>
-        <w:pStyle w:val="Normal"/>
-        <w:ind w:start="720"/>
+        <w:ind w:left="2160"/>
+        <w:jc w:val="both"/>
+        <w:rPr>
+          <w:rFonts w:ascii="Times New Roman" w:hAnsi="Times New Roman" w:cs="Times New Roman"/>
+          <w:lang w:val="en-GB"/>
+        </w:rPr>
+      </w:pPr>
+      <w:r>
+        <w:rPr>
+          <w:rFonts w:cs="Times New Roman" w:ascii="Times New Roman" w:hAnsi="Times New Roman"/>
+          <w:lang w:val="en-GB"/>
+        </w:rPr>
+      </w:r>
+    </w:p>
+    <w:p>
+      <w:pPr>
+        <w:pStyle w:val="Normal"/>
+        <w:ind w:left="720"/>
         <w:jc w:val="both"/>
         <w:rPr>
           <w:rFonts w:ascii="Times New Roman" w:hAnsi="Times New Roman" w:cs="Times New Roman"/>
@@ -4136,7 +4136,7 @@
     <w:p>
       <w:pPr>
         <w:pStyle w:val="Normal"/>
-        <w:ind w:start="2160"/>
+        <w:ind w:left="2160"/>
         <w:jc w:val="both"/>
         <w:rPr/>
       </w:pPr>
@@ -4163,7 +4163,7 @@
     <w:p>
       <w:pPr>
         <w:pStyle w:val="Normal"/>
-        <w:ind w:start="2160"/>
+        <w:ind w:left="2160"/>
         <w:jc w:val="both"/>
         <w:rPr>
           <w:rFonts w:ascii="Times New Roman" w:hAnsi="Times New Roman" w:cs="Times New Roman"/>
@@ -4193,7 +4193,7 @@
     <w:p>
       <w:pPr>
         <w:pStyle w:val="Normal"/>
-        <w:ind w:start="2160"/>
+        <w:ind w:left="2160"/>
         <w:jc w:val="both"/>
         <w:rPr>
           <w:rFonts w:ascii="Times New Roman" w:hAnsi="Times New Roman" w:cs="Times New Roman"/>
@@ -4223,7 +4223,7 @@
     <w:p>
       <w:pPr>
         <w:pStyle w:val="Normal"/>
-        <w:ind w:start="2160"/>
+        <w:ind w:left="2160"/>
         <w:jc w:val="both"/>
         <w:rPr/>
       </w:pPr>
@@ -4242,7 +4242,7 @@
     <w:p>
       <w:pPr>
         <w:pStyle w:val="Normal"/>
-        <w:ind w:start="2160"/>
+        <w:ind w:left="2160"/>
         <w:jc w:val="both"/>
         <w:rPr/>
       </w:pPr>
@@ -4261,7 +4261,7 @@
     <w:p>
       <w:pPr>
         <w:pStyle w:val="Normal"/>
-        <w:ind w:start="2160"/>
+        <w:ind w:left="2160"/>
         <w:jc w:val="both"/>
         <w:rPr/>
       </w:pPr>
@@ -4280,7 +4280,7 @@
     <w:p>
       <w:pPr>
         <w:pStyle w:val="Normal"/>
-        <w:ind w:start="2160"/>
+        <w:ind w:left="2160"/>
         <w:jc w:val="both"/>
         <w:rPr>
           <w:rFonts w:ascii="Times New Roman" w:hAnsi="Times New Roman" w:cs="Times New Roman"/>
@@ -4302,48 +4302,116 @@
     <w:p>
       <w:pPr>
         <w:pStyle w:val="Normal"/>
-        <w:jc w:val="both"/>
-        <w:rPr>
-          <w:rFonts w:ascii="Times New Roman" w:hAnsi="Times New Roman" w:cs="Times New Roman"/>
-        </w:rPr>
-      </w:pPr>
-      <w:r>
-        <w:rPr>
-          <w:rFonts w:cs="Times New Roman" w:ascii="Times New Roman" w:hAnsi="Times New Roman"/>
-        </w:rPr>
-      </w:r>
-    </w:p>
-    <w:p>
-      <w:pPr>
-        <w:pStyle w:val="Normal"/>
-        <w:jc w:val="both"/>
-        <w:rPr>
-          <w:rFonts w:ascii="Times New Roman" w:hAnsi="Times New Roman" w:cs="Times New Roman"/>
-          <w:b/>
-          <w:lang w:val="en-GB"/>
-        </w:rPr>
-      </w:pPr>
-      <w:r>
-        <w:rPr>
-          <w:rFonts w:cs="Times New Roman" w:ascii="Times New Roman" w:hAnsi="Times New Roman"/>
-          <w:lang w:val="en-GB"/>
-        </w:rPr>
-        <w:tab/>
-        <w:tab/>
-      </w:r>
-      <w:r>
-        <w:rPr>
-          <w:rFonts w:cs="Times New Roman" w:ascii="Times New Roman" w:hAnsi="Times New Roman"/>
-          <w:b/>
-          <w:lang w:val="en-GB"/>
-        </w:rPr>
-        <w:t>Figure2/</w:t>
-      </w:r>
-    </w:p>
-    <w:p>
-      <w:pPr>
-        <w:pStyle w:val="Normal"/>
-        <w:ind w:start="2160"/>
+        <w:ind w:left="2160"/>
+        <w:jc w:val="both"/>
+        <w:rPr>
+          <w:rFonts w:ascii="Times New Roman" w:hAnsi="Times New Roman" w:cs="Times New Roman"/>
+          <w:lang w:val="en-GB"/>
+        </w:rPr>
+      </w:pPr>
+      <w:r>
+        <w:rPr/>
+      </w:r>
+    </w:p>
+    <w:p>
+      <w:pPr>
+        <w:pStyle w:val="Normal"/>
+        <w:jc w:val="both"/>
+        <w:rPr>
+          <w:rFonts w:ascii="Times New Roman" w:hAnsi="Times New Roman" w:cs="Times New Roman"/>
+          <w:b/>
+          <w:lang w:val="en-GB"/>
+        </w:rPr>
+      </w:pPr>
+      <w:r>
+        <w:rPr>
+          <w:rFonts w:cs="Times New Roman" w:ascii="Times New Roman" w:hAnsi="Times New Roman"/>
+          <w:b/>
+          <w:lang w:val="en-GB"/>
+        </w:rPr>
+        <w:tab/>
+        <w:tab/>
+        <w:t>Figure</w:t>
+      </w:r>
+      <w:r>
+        <w:rPr>
+          <w:rFonts w:cs="Times New Roman" w:ascii="Times New Roman" w:hAnsi="Times New Roman"/>
+          <w:b/>
+          <w:lang w:val="en-GB"/>
+        </w:rPr>
+        <w:t>2</w:t>
+      </w:r>
+      <w:r>
+        <w:rPr>
+          <w:rFonts w:cs="Times New Roman" w:ascii="Times New Roman" w:hAnsi="Times New Roman"/>
+          <w:b/>
+          <w:lang w:val="en-GB"/>
+        </w:rPr>
+        <w:t>/</w:t>
+        <w:tab/>
+      </w:r>
+    </w:p>
+    <w:p>
+      <w:pPr>
+        <w:pStyle w:val="Normal"/>
+        <w:jc w:val="both"/>
+        <w:rPr>
+          <w:rFonts w:ascii="Times New Roman" w:hAnsi="Times New Roman" w:cs="Times New Roman"/>
+        </w:rPr>
+      </w:pPr>
+      <w:r>
+        <w:rPr>
+          <w:rFonts w:cs="Times New Roman" w:ascii="Times New Roman" w:hAnsi="Times New Roman"/>
+        </w:rPr>
+      </w:r>
+    </w:p>
+    <w:p>
+      <w:pPr>
+        <w:pStyle w:val="Normal"/>
+        <w:jc w:val="both"/>
+        <w:rPr>
+          <w:rFonts w:ascii="Times New Roman" w:hAnsi="Times New Roman" w:cs="Times New Roman"/>
+          <w:b/>
+          <w:lang w:val="en-GB"/>
+        </w:rPr>
+      </w:pPr>
+      <w:r>
+        <w:rPr>
+          <w:rFonts w:cs="Times New Roman" w:ascii="Times New Roman" w:hAnsi="Times New Roman"/>
+          <w:lang w:val="en-GB"/>
+        </w:rPr>
+        <w:tab/>
+        <w:tab/>
+      </w:r>
+      <w:r>
+        <w:rPr>
+          <w:rFonts w:cs="Times New Roman" w:ascii="Times New Roman" w:hAnsi="Times New Roman"/>
+          <w:b/>
+          <w:lang w:val="en-GB"/>
+        </w:rPr>
+        <w:t>Figure</w:t>
+      </w:r>
+      <w:r>
+        <w:rPr>
+          <w:rFonts w:cs="Times New Roman" w:ascii="Times New Roman" w:hAnsi="Times New Roman"/>
+          <w:b/>
+          <w:lang w:val="en-GB"/>
+        </w:rPr>
+        <w:t>3</w:t>
+      </w:r>
+      <w:r>
+        <w:rPr>
+          <w:rFonts w:cs="Times New Roman" w:ascii="Times New Roman" w:hAnsi="Times New Roman"/>
+          <w:b/>
+          <w:lang w:val="en-GB"/>
+        </w:rPr>
+        <w:t>/</w:t>
+      </w:r>
+    </w:p>
+    <w:p>
+      <w:pPr>
+        <w:pStyle w:val="Normal"/>
+        <w:ind w:left="2160"/>
         <w:jc w:val="both"/>
         <w:rPr/>
       </w:pPr>
@@ -4370,7 +4438,7 @@
     <w:p>
       <w:pPr>
         <w:pStyle w:val="Normal"/>
-        <w:ind w:start="2160"/>
+        <w:ind w:left="2160"/>
         <w:jc w:val="both"/>
         <w:rPr>
           <w:rFonts w:ascii="Times New Roman" w:hAnsi="Times New Roman" w:cs="Times New Roman"/>
@@ -4400,7 +4468,7 @@
     <w:p>
       <w:pPr>
         <w:pStyle w:val="Normal"/>
-        <w:ind w:start="2160"/>
+        <w:ind w:left="2160"/>
         <w:jc w:val="both"/>
         <w:rPr>
           <w:rFonts w:ascii="Times New Roman" w:hAnsi="Times New Roman" w:cs="Times New Roman"/>
@@ -4430,7 +4498,7 @@
     <w:p>
       <w:pPr>
         <w:pStyle w:val="Normal"/>
-        <w:ind w:start="2160"/>
+        <w:ind w:left="2160"/>
         <w:jc w:val="both"/>
         <w:rPr/>
       </w:pPr>
@@ -4457,38 +4525,98 @@
     <w:p>
       <w:pPr>
         <w:pStyle w:val="Normal"/>
-        <w:ind w:start="2160"/>
-        <w:jc w:val="both"/>
-        <w:rPr/>
-      </w:pPr>
-      <w:r>
-        <w:rPr/>
-      </w:r>
-    </w:p>
-    <w:p>
-      <w:pPr>
-        <w:pStyle w:val="Normal"/>
-        <w:jc w:val="both"/>
-        <w:rPr>
-          <w:b/>
-        </w:rPr>
-      </w:pPr>
-      <w:r>
-        <w:rPr/>
-        <w:tab/>
-        <w:tab/>
-      </w:r>
-      <w:r>
-        <w:rPr>
-          <w:b/>
-        </w:rPr>
-        <w:t>Figure3/</w:t>
-      </w:r>
-    </w:p>
-    <w:p>
-      <w:pPr>
-        <w:pStyle w:val="Normal"/>
-        <w:ind w:start="2160"/>
+        <w:ind w:left="2160"/>
+        <w:jc w:val="both"/>
+        <w:rPr/>
+      </w:pPr>
+      <w:r>
+        <w:rPr/>
+      </w:r>
+    </w:p>
+    <w:p>
+      <w:pPr>
+        <w:pStyle w:val="Normal"/>
+        <w:jc w:val="both"/>
+        <w:rPr>
+          <w:rFonts w:ascii="Times New Roman" w:hAnsi="Times New Roman" w:cs="Times New Roman"/>
+          <w:b/>
+          <w:lang w:val="en-GB"/>
+        </w:rPr>
+      </w:pPr>
+      <w:r>
+        <w:rPr>
+          <w:rFonts w:cs="Times New Roman" w:ascii="Times New Roman" w:hAnsi="Times New Roman"/>
+          <w:b/>
+          <w:lang w:val="en-GB"/>
+        </w:rPr>
+        <w:tab/>
+        <w:tab/>
+        <w:t>Figure</w:t>
+      </w:r>
+      <w:r>
+        <w:rPr>
+          <w:rFonts w:cs="Times New Roman" w:ascii="Times New Roman" w:hAnsi="Times New Roman"/>
+          <w:b/>
+          <w:lang w:val="en-GB"/>
+        </w:rPr>
+        <w:t>4</w:t>
+      </w:r>
+      <w:r>
+        <w:rPr>
+          <w:rFonts w:cs="Times New Roman" w:ascii="Times New Roman" w:hAnsi="Times New Roman"/>
+          <w:b/>
+          <w:lang w:val="en-GB"/>
+        </w:rPr>
+        <w:t>/</w:t>
+      </w:r>
+    </w:p>
+    <w:p>
+      <w:pPr>
+        <w:pStyle w:val="Normal"/>
+        <w:ind w:left="2160"/>
+        <w:jc w:val="both"/>
+        <w:rPr/>
+      </w:pPr>
+      <w:r>
+        <w:rPr/>
+      </w:r>
+    </w:p>
+    <w:p>
+      <w:pPr>
+        <w:pStyle w:val="Normal"/>
+        <w:jc w:val="both"/>
+        <w:rPr>
+          <w:b/>
+        </w:rPr>
+      </w:pPr>
+      <w:r>
+        <w:rPr/>
+        <w:tab/>
+        <w:tab/>
+      </w:r>
+      <w:r>
+        <w:rPr>
+          <w:b/>
+        </w:rPr>
+        <w:t>Figur</w:t>
+      </w:r>
+      <w:r>
+        <w:rPr>
+          <w:b/>
+        </w:rPr>
+        <w:t>e5</w:t>
+      </w:r>
+      <w:r>
+        <w:rPr>
+          <w:b/>
+        </w:rPr>
+        <w:t>/</w:t>
+      </w:r>
+    </w:p>
+    <w:p>
+      <w:pPr>
+        <w:pStyle w:val="Normal"/>
+        <w:ind w:left="2160"/>
         <w:jc w:val="both"/>
         <w:rPr>
           <w:b/>
@@ -4508,41 +4636,53 @@
     <w:p>
       <w:pPr>
         <w:pStyle w:val="Normal"/>
-        <w:ind w:start="2160"/>
-        <w:jc w:val="both"/>
-        <w:rPr>
-          <w:b/>
-        </w:rPr>
-      </w:pPr>
-      <w:r>
-        <w:rPr>
-          <w:b/>
-        </w:rPr>
-      </w:r>
-    </w:p>
-    <w:p>
-      <w:pPr>
-        <w:pStyle w:val="Normal"/>
-        <w:ind w:hanging="0" w:start="0"/>
-        <w:jc w:val="both"/>
-        <w:rPr>
-          <w:b/>
-        </w:rPr>
-      </w:pPr>
-      <w:r>
-        <w:rPr>
-          <w:b/>
-        </w:rPr>
-        <w:tab/>
-        <w:tab/>
-        <w:t>Figure4/</w:t>
+        <w:ind w:left="2160"/>
+        <w:jc w:val="both"/>
+        <w:rPr>
+          <w:b/>
+        </w:rPr>
+      </w:pPr>
+      <w:r>
+        <w:rPr>
+          <w:b/>
+        </w:rPr>
+      </w:r>
+    </w:p>
+    <w:p>
+      <w:pPr>
+        <w:pStyle w:val="Normal"/>
+        <w:ind w:hanging="0" w:left="0"/>
+        <w:jc w:val="both"/>
+        <w:rPr>
+          <w:b/>
+        </w:rPr>
+      </w:pPr>
+      <w:r>
+        <w:rPr>
+          <w:b/>
+        </w:rPr>
+        <w:tab/>
+        <w:tab/>
+        <w:t>Figure</w:t>
+      </w:r>
+      <w:r>
+        <w:rPr>
+          <w:b/>
+        </w:rPr>
+        <w:t>6</w:t>
+      </w:r>
+      <w:r>
+        <w:rPr>
+          <w:b/>
+        </w:rPr>
+        <w:t>/</w:t>
       </w:r>
     </w:p>
     <w:p>
       <w:pPr>
         <w:pStyle w:val="Normal"/>
         <w:spacing w:before="0" w:after="283"/>
-        <w:ind w:hanging="0" w:start="0"/>
+        <w:ind w:hanging="0" w:left="0"/>
         <w:jc w:val="both"/>
         <w:rPr>
           <w:b/>
@@ -4668,7 +4808,21 @@
         </w:rPr>
         <w:tab/>
         <w:tab/>
-        <w:t>Figure 5/</w:t>
+        <w:t xml:space="preserve">Figure </w:t>
+      </w:r>
+      <w:r>
+        <w:rPr>
+          <w:b/>
+          <w:bCs/>
+        </w:rPr>
+        <w:t>7</w:t>
+      </w:r>
+      <w:r>
+        <w:rPr>
+          <w:b/>
+          <w:bCs/>
+        </w:rPr>
+        <w:t>/</w:t>
       </w:r>
     </w:p>
     <w:p>
@@ -4756,7 +4910,23 @@
           <w:b/>
           <w:lang w:val="en-GB"/>
         </w:rPr>
-        <w:t xml:space="preserve">Figure6/ </w:t>
+        <w:t>Figure</w:t>
+      </w:r>
+      <w:r>
+        <w:rPr>
+          <w:rFonts w:cs="Times New Roman" w:ascii="Times New Roman" w:hAnsi="Times New Roman"/>
+          <w:b/>
+          <w:lang w:val="en-GB"/>
+        </w:rPr>
+        <w:t>8</w:t>
+      </w:r>
+      <w:r>
+        <w:rPr>
+          <w:rFonts w:cs="Times New Roman" w:ascii="Times New Roman" w:hAnsi="Times New Roman"/>
+          <w:b/>
+          <w:lang w:val="en-GB"/>
+        </w:rPr>
+        <w:t xml:space="preserve">/ </w:t>
       </w:r>
       <w:r>
         <w:rPr/>
@@ -4766,7 +4936,7 @@
     <w:p>
       <w:pPr>
         <w:pStyle w:val="Normal"/>
-        <w:ind w:start="2160"/>
+        <w:ind w:left="2160"/>
         <w:jc w:val="both"/>
         <w:rPr/>
       </w:pPr>
@@ -4793,7 +4963,7 @@
     <w:p>
       <w:pPr>
         <w:pStyle w:val="Normal"/>
-        <w:ind w:start="2160"/>
+        <w:ind w:left="2160"/>
         <w:jc w:val="both"/>
         <w:rPr>
           <w:rFonts w:ascii="Times New Roman" w:hAnsi="Times New Roman" w:cs="Times New Roman"/>
@@ -4823,7 +4993,7 @@
     <w:p>
       <w:pPr>
         <w:pStyle w:val="Normal"/>
-        <w:ind w:start="2160"/>
+        <w:ind w:left="2160"/>
         <w:jc w:val="both"/>
         <w:rPr>
           <w:rFonts w:ascii="Times New Roman" w:hAnsi="Times New Roman" w:cs="Times New Roman"/>
@@ -4853,7 +5023,7 @@
     <w:p>
       <w:pPr>
         <w:pStyle w:val="Normal"/>
-        <w:ind w:start="2160"/>
+        <w:ind w:left="2160"/>
         <w:jc w:val="both"/>
         <w:rPr/>
       </w:pPr>
@@ -4880,51 +5050,67 @@
     <w:p>
       <w:pPr>
         <w:pStyle w:val="Normal"/>
-        <w:ind w:start="2160"/>
-        <w:jc w:val="both"/>
-        <w:rPr>
-          <w:rFonts w:ascii="Times New Roman" w:hAnsi="Times New Roman" w:cs="Times New Roman"/>
-          <w:lang w:val="en-GB"/>
-        </w:rPr>
-      </w:pPr>
-      <w:r>
-        <w:rPr>
-          <w:rFonts w:cs="Times New Roman" w:ascii="Times New Roman" w:hAnsi="Times New Roman"/>
-          <w:lang w:val="en-GB"/>
-        </w:rPr>
-      </w:r>
-    </w:p>
-    <w:p>
-      <w:pPr>
-        <w:pStyle w:val="Normal"/>
-        <w:jc w:val="both"/>
-        <w:rPr>
-          <w:rFonts w:ascii="Times New Roman" w:hAnsi="Times New Roman" w:cs="Times New Roman"/>
-          <w:b/>
-          <w:lang w:val="en-GB"/>
-        </w:rPr>
-      </w:pPr>
-      <w:r>
-        <w:rPr>
-          <w:rFonts w:cs="Times New Roman" w:ascii="Times New Roman" w:hAnsi="Times New Roman"/>
-          <w:lang w:val="en-GB"/>
-        </w:rPr>
-        <w:tab/>
-        <w:tab/>
-      </w:r>
-      <w:r>
-        <w:rPr>
-          <w:rFonts w:cs="Times New Roman" w:ascii="Times New Roman" w:hAnsi="Times New Roman"/>
-          <w:b/>
-          <w:lang w:val="en-GB"/>
-        </w:rPr>
-        <w:t>Figure7/</w:t>
-      </w:r>
-    </w:p>
-    <w:p>
-      <w:pPr>
-        <w:pStyle w:val="Normal"/>
-        <w:ind w:start="2160"/>
+        <w:ind w:left="2160"/>
+        <w:jc w:val="both"/>
+        <w:rPr>
+          <w:rFonts w:ascii="Times New Roman" w:hAnsi="Times New Roman" w:cs="Times New Roman"/>
+          <w:lang w:val="en-GB"/>
+        </w:rPr>
+      </w:pPr>
+      <w:r>
+        <w:rPr>
+          <w:rFonts w:cs="Times New Roman" w:ascii="Times New Roman" w:hAnsi="Times New Roman"/>
+          <w:lang w:val="en-GB"/>
+        </w:rPr>
+      </w:r>
+    </w:p>
+    <w:p>
+      <w:pPr>
+        <w:pStyle w:val="Normal"/>
+        <w:jc w:val="both"/>
+        <w:rPr>
+          <w:rFonts w:ascii="Times New Roman" w:hAnsi="Times New Roman" w:cs="Times New Roman"/>
+          <w:b/>
+          <w:lang w:val="en-GB"/>
+        </w:rPr>
+      </w:pPr>
+      <w:r>
+        <w:rPr>
+          <w:rFonts w:cs="Times New Roman" w:ascii="Times New Roman" w:hAnsi="Times New Roman"/>
+          <w:lang w:val="en-GB"/>
+        </w:rPr>
+        <w:tab/>
+        <w:tab/>
+      </w:r>
+      <w:r>
+        <w:rPr>
+          <w:rFonts w:cs="Times New Roman" w:ascii="Times New Roman" w:hAnsi="Times New Roman"/>
+          <w:b/>
+          <w:lang w:val="en-GB"/>
+        </w:rPr>
+        <w:t>Figure</w:t>
+      </w:r>
+      <w:r>
+        <w:rPr>
+          <w:rFonts w:cs="Times New Roman" w:ascii="Times New Roman" w:hAnsi="Times New Roman"/>
+          <w:b/>
+          <w:lang w:val="en-GB"/>
+        </w:rPr>
+        <w:t>9</w:t>
+      </w:r>
+      <w:r>
+        <w:rPr>
+          <w:rFonts w:cs="Times New Roman" w:ascii="Times New Roman" w:hAnsi="Times New Roman"/>
+          <w:b/>
+          <w:lang w:val="en-GB"/>
+        </w:rPr>
+        <w:t>/</w:t>
+      </w:r>
+    </w:p>
+    <w:p>
+      <w:pPr>
+        <w:pStyle w:val="Normal"/>
+        <w:ind w:left="2160"/>
         <w:jc w:val="both"/>
         <w:rPr>
           <w:rFonts w:ascii="Times New Roman" w:hAnsi="Times New Roman" w:cs="Times New Roman"/>
@@ -4954,7 +5140,7 @@
     <w:p>
       <w:pPr>
         <w:pStyle w:val="Normal"/>
-        <w:ind w:start="2160"/>
+        <w:ind w:left="2160"/>
         <w:jc w:val="both"/>
         <w:rPr/>
       </w:pPr>
@@ -4981,107 +5167,361 @@
     <w:p>
       <w:pPr>
         <w:pStyle w:val="Normal"/>
-        <w:ind w:firstLine="720" w:start="720"/>
-        <w:jc w:val="both"/>
-        <w:rPr>
-          <w:rFonts w:ascii="Times New Roman" w:hAnsi="Times New Roman" w:cs="Times New Roman"/>
-          <w:b/>
-          <w:lang w:val="en-GB"/>
-        </w:rPr>
-      </w:pPr>
-      <w:r>
-        <w:rPr>
-          <w:rFonts w:cs="Times New Roman" w:ascii="Times New Roman" w:hAnsi="Times New Roman"/>
-          <w:b/>
-          <w:lang w:val="en-GB"/>
-        </w:rPr>
-      </w:r>
-    </w:p>
-    <w:p>
-      <w:pPr>
-        <w:pStyle w:val="Normal"/>
-        <w:ind w:firstLine="720" w:start="720"/>
-        <w:jc w:val="both"/>
-        <w:rPr>
-          <w:rFonts w:ascii="Times New Roman" w:hAnsi="Times New Roman" w:cs="Times New Roman"/>
-          <w:b/>
-          <w:lang w:val="en-GB"/>
-        </w:rPr>
-      </w:pPr>
-      <w:r>
-        <w:rPr>
-          <w:rFonts w:cs="Times New Roman" w:ascii="Times New Roman" w:hAnsi="Times New Roman"/>
-          <w:b/>
-          <w:lang w:val="en-GB"/>
-        </w:rPr>
-        <w:t>Figure 8/</w:t>
-      </w:r>
-    </w:p>
-    <w:p>
-      <w:pPr>
-        <w:pStyle w:val="Normal"/>
-        <w:ind w:start="2160"/>
-        <w:jc w:val="both"/>
-        <w:rPr/>
-      </w:pPr>
-      <w:r>
-        <w:rPr>
-          <w:b/>
+        <w:ind w:firstLine="720" w:left="720"/>
+        <w:jc w:val="both"/>
+        <w:rPr>
+          <w:rFonts w:ascii="Times New Roman" w:hAnsi="Times New Roman" w:cs="Times New Roman"/>
+          <w:b/>
+          <w:lang w:val="en-GB"/>
+        </w:rPr>
+      </w:pPr>
+      <w:r>
+        <w:rPr>
+          <w:rFonts w:cs="Times New Roman" w:ascii="Times New Roman" w:hAnsi="Times New Roman"/>
+          <w:b/>
+          <w:lang w:val="en-GB"/>
+        </w:rPr>
+      </w:r>
+    </w:p>
+    <w:p>
+      <w:pPr>
+        <w:pStyle w:val="Normal"/>
+        <w:ind w:firstLine="720" w:left="720"/>
+        <w:jc w:val="both"/>
+        <w:rPr>
+          <w:rFonts w:ascii="Times New Roman" w:hAnsi="Times New Roman" w:cs="Times New Roman"/>
+          <w:b/>
+          <w:lang w:val="en-GB"/>
+        </w:rPr>
+      </w:pPr>
+      <w:r>
+        <w:rPr>
+          <w:rFonts w:cs="Times New Roman" w:ascii="Times New Roman" w:hAnsi="Times New Roman"/>
+          <w:b/>
+          <w:lang w:val="en-GB"/>
+        </w:rPr>
+        <w:t xml:space="preserve">Figure </w:t>
+      </w:r>
+      <w:r>
+        <w:rPr>
+          <w:rFonts w:cs="Times New Roman" w:ascii="Times New Roman" w:hAnsi="Times New Roman"/>
+          <w:b/>
+          <w:lang w:val="en-GB"/>
+        </w:rPr>
+        <w:t>10</w:t>
+      </w:r>
+      <w:r>
+        <w:rPr>
+          <w:rFonts w:cs="Times New Roman" w:ascii="Times New Roman" w:hAnsi="Times New Roman"/>
+          <w:b/>
+          <w:lang w:val="en-GB"/>
+        </w:rPr>
+        <w:t>/</w:t>
+      </w:r>
+    </w:p>
+    <w:p>
+      <w:pPr>
+        <w:pStyle w:val="Normal"/>
+        <w:ind w:left="2160"/>
+        <w:jc w:val="both"/>
+        <w:rPr>
+          <w:b/>
+          <w:bCs/>
+        </w:rPr>
+      </w:pPr>
+      <w:r>
+        <w:rPr>
+          <w:b/>
+          <w:bCs/>
+        </w:rPr>
+        <w:t xml:space="preserve">01_CA_CG_by_genomic_region.R: </w:t>
+      </w:r>
+      <w:r>
+        <w:rPr>
+          <w:b w:val="false"/>
+          <w:bCs w:val="false"/>
+        </w:rPr>
+        <w:t>Analyzes CG and CA methylation across genomic regions and exports sample-level results to CSV</w:t>
+      </w:r>
+    </w:p>
+    <w:p>
+      <w:pPr>
+        <w:pStyle w:val="Normal"/>
+        <w:ind w:left="2160"/>
+        <w:jc w:val="both"/>
+        <w:rPr>
+          <w:b/>
+          <w:bCs/>
+        </w:rPr>
+      </w:pPr>
+      <w:r>
+        <w:rPr>
+          <w:b/>
+          <w:bCs/>
+        </w:rPr>
+        <w:t xml:space="preserve">02_Genomicregion_age.R: </w:t>
+      </w:r>
+      <w:r>
+        <w:rPr>
+          <w:b w:val="false"/>
+          <w:bCs w:val="false"/>
+        </w:rPr>
+        <w:t>Correlates CA and CG across genomic regions with age</w:t>
+      </w:r>
+    </w:p>
+    <w:p>
+      <w:pPr>
+        <w:pStyle w:val="Normal"/>
+        <w:ind w:left="2160"/>
+        <w:jc w:val="both"/>
+        <w:rPr>
+          <w:b/>
+          <w:bCs/>
+        </w:rPr>
+      </w:pPr>
+      <w:r>
+        <w:rPr>
+          <w:b/>
+          <w:bCs/>
+        </w:rPr>
+        <w:t xml:space="preserve">03_CA_CG_correlation_age.R: </w:t>
+      </w:r>
+      <w:r>
+        <w:rPr>
+          <w:b w:val="false"/>
+          <w:bCs w:val="false"/>
+        </w:rPr>
+        <w:t xml:space="preserve">contains the pipeline to identify windows significantly correlated with age </w:t>
+      </w:r>
+      <w:r>
+        <w:rPr>
+          <w:b w:val="false"/>
+          <w:bCs w:val="false"/>
+        </w:rPr>
+        <w:t>CA</w:t>
+      </w:r>
+      <w:r>
+        <w:rPr>
+          <w:b w:val="false"/>
+          <w:bCs w:val="false"/>
+        </w:rPr>
+        <w:t xml:space="preserve"> and CG contexts.</w:t>
+      </w:r>
+    </w:p>
+    <w:p>
+      <w:pPr>
+        <w:pStyle w:val="Normal"/>
+        <w:ind w:left="2160"/>
+        <w:jc w:val="both"/>
+        <w:rPr/>
+      </w:pPr>
+      <w:r>
+        <w:rPr>
+          <w:b/>
+          <w:bCs/>
+        </w:rPr>
+        <w:t>04_Clusters_Anlysis_ChromatinState.R</w:t>
+      </w:r>
+      <w:r>
+        <w:rPr>
+          <w:b/>
+          <w:bCs/>
+          <w:lang w:val="en-GB"/>
+        </w:rPr>
+        <w:t xml:space="preserve">: </w:t>
+      </w:r>
+      <w:r>
+        <w:rPr/>
+        <w:t xml:space="preserve">describes the enrichment analysis (Odds Ratio) of </w:t>
+      </w:r>
+      <w:r>
+        <w:rPr/>
+        <w:t>CA and CG</w:t>
+      </w:r>
+      <w:r>
+        <w:rPr/>
+        <w:t xml:space="preserve"> clusters across HMM-defined chromatin states</w:t>
+      </w:r>
+    </w:p>
+    <w:p>
+      <w:pPr>
+        <w:pStyle w:val="Normal"/>
+        <w:ind w:left="2160"/>
+        <w:jc w:val="both"/>
+        <w:rPr/>
+      </w:pPr>
+      <w:r>
+        <w:rPr/>
+      </w:r>
+    </w:p>
+    <w:p>
+      <w:pPr>
+        <w:pStyle w:val="Normal"/>
+        <w:jc w:val="both"/>
+        <w:rPr>
+          <w:rFonts w:ascii="Times New Roman" w:hAnsi="Times New Roman" w:cs="Times New Roman"/>
+          <w:b/>
+          <w:lang w:val="en-GB"/>
+        </w:rPr>
+      </w:pPr>
+      <w:r>
+        <w:rPr>
+          <w:rFonts w:cs="Times New Roman" w:ascii="Times New Roman" w:hAnsi="Times New Roman"/>
+          <w:lang w:val="en-GB"/>
+        </w:rPr>
+        <w:tab/>
+        <w:tab/>
+      </w:r>
+      <w:r>
+        <w:rPr>
+          <w:rFonts w:cs="Times New Roman" w:ascii="Times New Roman" w:hAnsi="Times New Roman"/>
+          <w:b/>
+          <w:lang w:val="en-GB"/>
+        </w:rPr>
+        <w:t>Figure</w:t>
+      </w:r>
+      <w:r>
+        <w:rPr>
+          <w:rFonts w:cs="Times New Roman" w:ascii="Times New Roman" w:hAnsi="Times New Roman"/>
+          <w:b/>
+          <w:lang w:val="en-GB"/>
+        </w:rPr>
+        <w:t>11</w:t>
+      </w:r>
+      <w:r>
+        <w:rPr>
+          <w:rFonts w:cs="Times New Roman" w:ascii="Times New Roman" w:hAnsi="Times New Roman"/>
+          <w:b/>
+          <w:lang w:val="en-GB"/>
+        </w:rPr>
+        <w:t>/</w:t>
+        <w:tab/>
+      </w:r>
+    </w:p>
+    <w:p>
+      <w:pPr>
+        <w:pStyle w:val="Normal"/>
+        <w:ind w:left="2160"/>
+        <w:jc w:val="both"/>
+        <w:rPr/>
+      </w:pPr>
+      <w:r>
+        <w:rPr>
+          <w:rFonts w:cs="Times New Roman" w:ascii="Times New Roman" w:hAnsi="Times New Roman"/>
+          <w:b/>
+          <w:lang w:val="en-GB"/>
         </w:rPr>
         <w:t xml:space="preserve">01_RNA_Tendency.R: </w:t>
       </w:r>
       <w:r>
-        <w:rPr/>
+        <w:rPr>
+          <w:rFonts w:cs="Times New Roman" w:ascii="Times New Roman" w:hAnsi="Times New Roman"/>
+          <w:b w:val="false"/>
+          <w:bCs w:val="false"/>
+          <w:lang w:val="en-GB"/>
+        </w:rPr>
         <w:t>Compares age-related expression trajectories of CoM+, CoM−, and random gene sets across three postmortem brain RNA-seq datasets</w:t>
       </w:r>
     </w:p>
     <w:p>
       <w:pPr>
         <w:pStyle w:val="Normal"/>
-        <w:ind w:start="2160"/>
-        <w:jc w:val="both"/>
-        <w:rPr>
-          <w:rFonts w:ascii="Times New Roman" w:hAnsi="Times New Roman" w:cs="Times New Roman"/>
-        </w:rPr>
-      </w:pPr>
-      <w:r>
-        <w:rPr>
-          <w:rFonts w:cs="Times New Roman" w:ascii="Times New Roman" w:hAnsi="Times New Roman"/>
-        </w:rPr>
-      </w:r>
-    </w:p>
-    <w:p>
-      <w:pPr>
-        <w:pStyle w:val="Normal"/>
-        <w:jc w:val="both"/>
-        <w:rPr>
-          <w:rFonts w:ascii="Times New Roman" w:hAnsi="Times New Roman" w:cs="Times New Roman"/>
-          <w:b/>
-          <w:lang w:val="en-GB"/>
-        </w:rPr>
-      </w:pPr>
-      <w:r>
-        <w:rPr>
-          <w:rFonts w:cs="Times New Roman" w:ascii="Times New Roman" w:hAnsi="Times New Roman"/>
-          <w:lang w:val="en-GB"/>
-        </w:rPr>
-        <w:tab/>
-        <w:tab/>
-      </w:r>
-      <w:r>
-        <w:rPr>
-          <w:rFonts w:cs="Times New Roman" w:ascii="Times New Roman" w:hAnsi="Times New Roman"/>
-          <w:b/>
-          <w:lang w:val="en-GB"/>
-        </w:rPr>
-        <w:t>Figure9/</w:t>
-        <w:tab/>
-      </w:r>
-    </w:p>
-    <w:p>
-      <w:pPr>
-        <w:pStyle w:val="Normal"/>
-        <w:ind w:start="2160"/>
+        <w:ind w:left="2160"/>
+        <w:jc w:val="both"/>
+        <w:rPr/>
+      </w:pPr>
+      <w:r>
+        <w:rPr>
+          <w:rFonts w:cs="Times New Roman" w:ascii="Times New Roman" w:hAnsi="Times New Roman"/>
+          <w:b/>
+          <w:bCs/>
+          <w:lang w:val="en-GB"/>
+        </w:rPr>
+        <w:t>02_Gene_direction.R:</w:t>
+      </w:r>
+      <w:r>
+        <w:rPr>
+          <w:rFonts w:cs="Times New Roman" w:ascii="Times New Roman" w:hAnsi="Times New Roman"/>
+          <w:b w:val="false"/>
+          <w:bCs w:val="false"/>
+          <w:lang w:val="en-GB"/>
+        </w:rPr>
+        <w:t xml:space="preserve"> </w:t>
+      </w:r>
+      <w:r>
+        <w:rPr>
+          <w:rFonts w:cs="Times New Roman" w:ascii="Times New Roman" w:hAnsi="Times New Roman"/>
+          <w:b w:val="false"/>
+          <w:bCs w:val="false"/>
+          <w:lang w:val="en-GB"/>
+        </w:rPr>
+        <w:t>Analyzes age-related gene expression changes using gain-loss bias assessment.</w:t>
+      </w:r>
+    </w:p>
+    <w:p>
+      <w:pPr>
+        <w:pStyle w:val="Normal"/>
+        <w:ind w:left="2160"/>
+        <w:jc w:val="both"/>
+        <w:rPr/>
+      </w:pPr>
+      <w:r>
+        <w:rPr/>
+      </w:r>
+    </w:p>
+    <w:p>
+      <w:pPr>
+        <w:pStyle w:val="Normal"/>
+        <w:ind w:left="2160"/>
+        <w:jc w:val="both"/>
+        <w:rPr/>
+      </w:pPr>
+      <w:r>
+        <w:rPr/>
+      </w:r>
+    </w:p>
+    <w:p>
+      <w:pPr>
+        <w:pStyle w:val="Normal"/>
+        <w:jc w:val="both"/>
+        <w:rPr>
+          <w:rFonts w:ascii="Times New Roman" w:hAnsi="Times New Roman" w:cs="Times New Roman"/>
+          <w:b/>
+          <w:lang w:val="en-GB"/>
+        </w:rPr>
+      </w:pPr>
+      <w:r>
+        <w:rPr>
+          <w:rFonts w:cs="Times New Roman" w:ascii="Times New Roman" w:hAnsi="Times New Roman"/>
+          <w:b/>
+          <w:lang w:val="en-GB"/>
+        </w:rPr>
+        <w:tab/>
+        <w:tab/>
+        <w:t>Figure</w:t>
+      </w:r>
+      <w:r>
+        <w:rPr>
+          <w:rFonts w:cs="Times New Roman" w:ascii="Times New Roman" w:hAnsi="Times New Roman"/>
+          <w:b/>
+          <w:lang w:val="en-GB"/>
+        </w:rPr>
+        <w:t>12</w:t>
+      </w:r>
+      <w:r>
+        <w:rPr>
+          <w:rFonts w:cs="Times New Roman" w:ascii="Times New Roman" w:hAnsi="Times New Roman"/>
+          <w:b/>
+          <w:lang w:val="en-GB"/>
+        </w:rPr>
+        <w:t>/</w:t>
+        <w:tab/>
+      </w:r>
+    </w:p>
+    <w:p>
+      <w:pPr>
+        <w:pStyle w:val="Normal"/>
+        <w:ind w:left="2160"/>
         <w:jc w:val="both"/>
         <w:rPr/>
       </w:pPr>
@@ -5108,7 +5548,7 @@
     <w:p>
       <w:pPr>
         <w:pStyle w:val="Normal"/>
-        <w:ind w:start="2160"/>
+        <w:ind w:left="2160"/>
         <w:jc w:val="both"/>
         <w:rPr>
           <w:rFonts w:ascii="Times New Roman" w:hAnsi="Times New Roman" w:cs="Times New Roman"/>
@@ -5138,7 +5578,7 @@
     <w:p>
       <w:pPr>
         <w:pStyle w:val="Normal"/>
-        <w:ind w:start="2160"/>
+        <w:ind w:left="2160"/>
         <w:jc w:val="both"/>
         <w:rPr>
           <w:rFonts w:ascii="Times New Roman" w:hAnsi="Times New Roman" w:cs="Times New Roman"/>
@@ -5168,7 +5608,7 @@
     <w:p>
       <w:pPr>
         <w:pStyle w:val="Normal"/>
-        <w:ind w:start="2160"/>
+        <w:ind w:left="2160"/>
         <w:jc w:val="both"/>
         <w:rPr/>
       </w:pPr>
@@ -5195,7 +5635,7 @@
     <w:p>
       <w:pPr>
         <w:pStyle w:val="Normal"/>
-        <w:ind w:start="2160"/>
+        <w:ind w:left="2160"/>
         <w:jc w:val="both"/>
         <w:rPr/>
       </w:pPr>
@@ -5261,13 +5701,71 @@
           <w:b/>
           <w:lang w:val="en-GB"/>
         </w:rPr>
-        <w:t>Figure10/</w:t>
-      </w:r>
-    </w:p>
-    <w:p>
-      <w:pPr>
-        <w:pStyle w:val="Normal"/>
-        <w:ind w:start="2160"/>
+        <w:t>Figure1</w:t>
+      </w:r>
+      <w:r>
+        <w:rPr>
+          <w:rFonts w:cs="Times New Roman" w:ascii="Times New Roman" w:hAnsi="Times New Roman"/>
+          <w:b/>
+          <w:lang w:val="en-GB"/>
+        </w:rPr>
+        <w:t>3</w:t>
+      </w:r>
+      <w:r>
+        <w:rPr>
+          <w:rFonts w:cs="Times New Roman" w:ascii="Times New Roman" w:hAnsi="Times New Roman"/>
+          <w:b/>
+          <w:lang w:val="en-GB"/>
+        </w:rPr>
+        <w:t>/</w:t>
+      </w:r>
+    </w:p>
+    <w:p>
+      <w:pPr>
+        <w:pStyle w:val="Normal"/>
+        <w:jc w:val="both"/>
+        <w:rPr>
+          <w:rFonts w:ascii="Times New Roman" w:hAnsi="Times New Roman" w:cs="Times New Roman"/>
+          <w:b/>
+          <w:lang w:val="en-GB"/>
+        </w:rPr>
+      </w:pPr>
+      <w:r>
+        <w:rPr/>
+      </w:r>
+    </w:p>
+    <w:p>
+      <w:pPr>
+        <w:pStyle w:val="Normal"/>
+        <w:jc w:val="both"/>
+        <w:rPr>
+          <w:rFonts w:ascii="Times New Roman" w:hAnsi="Times New Roman" w:cs="Times New Roman"/>
+          <w:b/>
+          <w:lang w:val="en-GB"/>
+        </w:rPr>
+      </w:pPr>
+      <w:r>
+        <w:rPr>
+          <w:rFonts w:cs="Times New Roman" w:ascii="Times New Roman" w:hAnsi="Times New Roman"/>
+          <w:b/>
+          <w:lang w:val="en-GB"/>
+        </w:rPr>
+        <w:tab/>
+        <w:tab/>
+      </w:r>
+      <w:r>
+        <w:rPr>
+          <w:rFonts w:cs="Times New Roman" w:ascii="Times New Roman" w:hAnsi="Times New Roman"/>
+          <w:b/>
+          <w:lang w:val="en-GB"/>
+        </w:rPr>
+        <w:t>Figure14/</w:t>
+      </w:r>
+    </w:p>
+    <w:p>
+      <w:pPr>
+        <w:pStyle w:val="Normal"/>
+        <w:ind w:left="2160"/>
         <w:jc w:val="both"/>
         <w:rPr>
           <w:rFonts w:ascii="Times New Roman" w:hAnsi="Times New Roman" w:cs="Times New Roman"/>
@@ -5291,7 +5789,7 @@
     <w:p>
       <w:pPr>
         <w:pStyle w:val="Normal"/>
-        <w:ind w:start="2160"/>
+        <w:ind w:left="2160"/>
         <w:jc w:val="both"/>
         <w:rPr>
           <w:rFonts w:ascii="Times New Roman" w:hAnsi="Times New Roman" w:cs="Times New Roman"/>
@@ -5318,7 +5816,7 @@
     <w:p>
       <w:pPr>
         <w:pStyle w:val="Normal"/>
-        <w:ind w:start="2160"/>
+        <w:ind w:left="2160"/>
         <w:jc w:val="both"/>
         <w:rPr>
           <w:rFonts w:ascii="Times New Roman" w:hAnsi="Times New Roman" w:cs="Times New Roman"/>
@@ -5382,7 +5880,23 @@
           <w:lang w:val="en-GB"/>
         </w:rPr>
         <w:tab/>
-        <w:t>Figure11/</w:t>
+        <w:t>Figure1</w:t>
+      </w:r>
+      <w:r>
+        <w:rPr>
+          <w:rFonts w:cs="Times New Roman" w:ascii="Times New Roman" w:hAnsi="Times New Roman"/>
+          <w:b/>
+          <w:lang w:val="en-GB"/>
+        </w:rPr>
+        <w:t>5</w:t>
+      </w:r>
+      <w:r>
+        <w:rPr>
+          <w:rFonts w:cs="Times New Roman" w:ascii="Times New Roman" w:hAnsi="Times New Roman"/>
+          <w:b/>
+          <w:lang w:val="en-GB"/>
+        </w:rPr>
+        <w:t>/</w:t>
       </w:r>
       <w:bookmarkStart w:id="0" w:name="_GoBack"/>
       <w:bookmarkEnd w:id="0"/>
@@ -5390,7 +5904,7 @@
     <w:p>
       <w:pPr>
         <w:pStyle w:val="Normal"/>
-        <w:ind w:start="2160"/>
+        <w:ind w:left="2160"/>
         <w:jc w:val="both"/>
         <w:rPr>
           <w:rFonts w:ascii="Times New Roman" w:hAnsi="Times New Roman" w:cs="Times New Roman"/>
@@ -5420,7 +5934,7 @@
     <w:p>
       <w:pPr>
         <w:pStyle w:val="Normal"/>
-        <w:ind w:start="2160"/>
+        <w:ind w:left="2160"/>
         <w:jc w:val="both"/>
         <w:rPr>
           <w:rFonts w:ascii="Times New Roman" w:hAnsi="Times New Roman" w:cs="Times New Roman"/>
@@ -5968,7 +6482,7 @@
       <w:suppressAutoHyphens w:val="true"/>
       <w:bidi w:val="0"/>
       <w:spacing w:before="0" w:after="0"/>
-      <w:jc w:val="start"/>
+      <w:jc w:val="left"/>
     </w:pPr>
     <w:rPr>
       <w:rFonts w:ascii="Liberation Serif" w:hAnsi="Liberation Serif" w:eastAsia="Noto Serif CJK SC" w:cs="Lohit Devanagari"/>
@@ -6001,8 +6515,8 @@
       <w:szCs w:val="20"/>
     </w:rPr>
   </w:style>
-  <w:style w:type="paragraph" w:styleId="Ttulo">
-    <w:name w:val="Título"/>
+  <w:style w:type="paragraph" w:styleId="Heading">
+    <w:name w:val="Heading"/>
     <w:basedOn w:val="Normal"/>
     <w:next w:val="BodyText"/>
     <w:qFormat/>
@@ -6033,7 +6547,7 @@
     </w:rPr>
   </w:style>
   <w:style w:type="paragraph" w:styleId="Caption">
-    <w:name w:val="caption"/>
+    <w:name w:val="Caption"/>
     <w:basedOn w:val="Normal"/>
     <w:qFormat/>
     <w:pPr>
@@ -6046,7 +6560,33 @@
       <w:iCs/>
     </w:rPr>
   </w:style>
-  <w:style w:type="paragraph" w:styleId="ndice">
+  <w:style w:type="paragraph" w:styleId="Index">
+    <w:name w:val="Index"/>
+    <w:basedOn w:val="Normal"/>
+    <w:qFormat/>
+    <w:pPr>
+      <w:suppressLineNumbers/>
+    </w:pPr>
+    <w:rPr>
+      <w:rFonts w:cs="Noto Sans Devanagari"/>
+    </w:rPr>
+  </w:style>
+  <w:style w:type="paragraph" w:styleId="Ttulo">
+    <w:name w:val="Título"/>
+    <w:basedOn w:val="Normal"/>
+    <w:next w:val="BodyText"/>
+    <w:qFormat/>
+    <w:pPr>
+      <w:keepNext w:val="true"/>
+      <w:spacing w:before="240" w:after="120"/>
+    </w:pPr>
+    <w:rPr>
+      <w:rFonts w:ascii="Liberation Sans" w:hAnsi="Liberation Sans" w:eastAsia="Noto Sans CJK SC" w:cs="Noto Sans Devanagari"/>
+      <w:sz w:val="28"/>
+      <w:szCs w:val="28"/>
+    </w:rPr>
+  </w:style>
+  <w:style w:type="paragraph" w:styleId="ndice" w:customStyle="1">
     <w:name w:val="Índice"/>
     <w:basedOn w:val="Normal"/>
     <w:qFormat/>
@@ -6072,26 +6612,8 @@
       <w:szCs w:val="28"/>
     </w:rPr>
   </w:style>
-  <w:style w:type="paragraph" w:styleId="ndiceuser" w:customStyle="1">
-    <w:name w:val="Índice (user)"/>
-    <w:basedOn w:val="Normal"/>
-    <w:qFormat/>
-    <w:pPr>
-      <w:suppressLineNumbers/>
-    </w:pPr>
-    <w:rPr>
-      <w:rFonts w:cs="Noto Sans Devanagari"/>
-    </w:rPr>
-  </w:style>
-  <w:style w:type="numbering" w:styleId="Ningunalista" w:default="1">
+  <w:style w:type="numbering" w:styleId="Ningunalista" w:customStyle="1">
     <w:name w:val="Ninguna lista"/>
-    <w:uiPriority w:val="99"/>
-    <w:semiHidden/>
-    <w:unhideWhenUsed/>
-    <w:qFormat/>
-  </w:style>
-  <w:style w:type="numbering" w:styleId="Ningunalistauser" w:customStyle="1">
-    <w:name w:val="Ninguna lista (user)"/>
     <w:uiPriority w:val="99"/>
     <w:semiHidden/>
     <w:unhideWhenUsed/>
@@ -6122,37 +6644,37 @@
         <a:srgbClr val="000000"/>
       </a:dk1>
       <a:lt1>
-        <a:srgbClr val="FFFFFF"/>
+        <a:srgbClr val="ffffff"/>
       </a:lt1>
       <a:dk2>
-        <a:srgbClr val="44546A"/>
+        <a:srgbClr val="44546a"/>
       </a:dk2>
       <a:lt2>
-        <a:srgbClr val="E7E6E6"/>
+        <a:srgbClr val="e7e6e6"/>
       </a:lt2>
       <a:accent1>
-        <a:srgbClr val="4472C4"/>
+        <a:srgbClr val="4472c4"/>
       </a:accent1>
       <a:accent2>
-        <a:srgbClr val="ED7D31"/>
+        <a:srgbClr val="ed7d31"/>
       </a:accent2>
       <a:accent3>
-        <a:srgbClr val="A5A5A5"/>
+        <a:srgbClr val="a5a5a5"/>
       </a:accent3>
       <a:accent4>
-        <a:srgbClr val="FFC000"/>
+        <a:srgbClr val="ffc000"/>
       </a:accent4>
       <a:accent5>
-        <a:srgbClr val="5B9BD5"/>
+        <a:srgbClr val="5b9bd5"/>
       </a:accent5>
       <a:accent6>
-        <a:srgbClr val="70AD47"/>
+        <a:srgbClr val="70ad47"/>
       </a:accent6>
       <a:hlink>
-        <a:srgbClr val="0563C1"/>
+        <a:srgbClr val="0563c1"/>
       </a:hlink>
       <a:folHlink>
-        <a:srgbClr val="954F72"/>
+        <a:srgbClr val="954f72"/>
       </a:folHlink>
     </a:clrScheme>
     <a:fontScheme name="Office">

</xml_diff>